<commit_message>
Add proposal draft 1
</commit_message>
<xml_diff>
--- a/docs/aeroflux_stage2_proposal.docx
+++ b/docs/aeroflux_stage2_proposal.docx
@@ -24,6 +24,14 @@
       </w:pPr>
       <w:r>
         <w:t xml:space="preserve">Jonathan Wilson</w:t>
+      </w:r>
+    </w:p>
+    <w:p>
+      <w:pPr>
+        <w:pStyle w:val="Author"/>
+      </w:pPr>
+      <w:r>
+        <w:t xml:space="preserve">Ryan Sollom</w:t>
       </w:r>
     </w:p>
     <w:p>
@@ -150,7 +158,7 @@
         </w:tc>
       </w:tr>
     </w:tbl>
-    <w:bookmarkStart w:id="21" w:name="introduction"/>
+    <w:bookmarkStart w:id="9" w:name="introduction"/>
     <w:p>
       <w:pPr>
         <w:pStyle w:val="Heading1"/>
@@ -188,19 +196,33 @@
         <w:t xml:space="preserve"> </w:t>
       </w:r>
       <w:r>
-        <w:t xml:space="preserve">becomes a network-wide disruption. Existing airline and airport tools remain</w:t>
-      </w:r>
-      <w:r>
-        <w:t xml:space="preserve"> </w:t>
-      </w:r>
-      <w:r>
-        <w:t xml:space="preserve">largely retrospective or single-source, reporting delays after they occur rather</w:t>
-      </w:r>
-      <w:r>
-        <w:t xml:space="preserve"> </w:t>
-      </w:r>
-      <w:r>
-        <w:t xml:space="preserve">than anticipating them from the live state of the airspace.</w:t>
+        <w:t xml:space="preserve">becomes a network-wide disruption.</w:t>
+      </w:r>
+    </w:p>
+    <w:p>
+      <w:pPr>
+        <w:pStyle w:val="BodyText"/>
+      </w:pPr>
+      <w:r>
+        <w:t xml:space="preserve">Although airlines, airports, and air traffic authorities increasingly use real-time and predictive decision-support systems, these capabilities are often specialized around particular organizations, operational domains, or stages of flight. For example, the FAA’s Traffic Flow Management System supports demand-and-capacity management across the National Airspace System, while Terminal Flight Data Manager integrates surface and national traffic-management data to improve airport operations</w:t>
+      </w:r>
+      <w:r>
+        <w:t xml:space="preserve"> </w:t>
+      </w:r>
+      <w:r>
+        <w:t xml:space="preserve">(Federal Aviation Administration, 2020, 2024b)</w:t>
+      </w:r>
+      <w:r>
+        <w:t xml:space="preserve">. Commercial platforms such as Sabre Mosaic support airline disruption recovery, and Assaia ApronAI uses computer vision and machine learning to monitor aircraft turnarounds and predict departure readiness</w:t>
+      </w:r>
+      <w:r>
+        <w:t xml:space="preserve"> </w:t>
+      </w:r>
+      <w:r>
+        <w:t xml:space="preserve">(Assaia International AG, n.d.; Sabre Corporation, n.d.)</w:t>
+      </w:r>
+      <w:r>
+        <w:t xml:space="preserve">. Opportunities therefore remain for integrated research platforms that fuse multiple live aviation data streams, model delay propagation across the broader flight network, and support forecasting, simulation, data science, and AI-assisted analysis.</w:t>
       </w:r>
     </w:p>
     <w:p>
@@ -212,84 +234,18 @@
           <w:b/>
           <w:bCs/>
         </w:rPr>
-        <w:t xml:space="preserve">Scope.</w:t>
-      </w:r>
-      <w:r>
-        <w:t xml:space="preserve"> </w:t>
-      </w:r>
-      <w:r>
-        <w:t xml:space="preserve">AeroFlux Stage 2 builds a</w:t>
-      </w:r>
-      <w:r>
-        <w:t xml:space="preserve"> </w:t>
-      </w:r>
-      <w:r>
-        <w:rPr>
-          <w:i/>
-          <w:iCs/>
-        </w:rPr>
-        <w:t xml:space="preserve">scalable, modular, configurable, portable,</w:t>
-      </w:r>
-      <w:r>
-        <w:rPr>
-          <w:i/>
-          <w:iCs/>
-        </w:rPr>
-        <w:t xml:space="preserve"> </w:t>
-      </w:r>
-      <w:r>
-        <w:rPr>
-          <w:i/>
-          <w:iCs/>
-        </w:rPr>
-        <w:t xml:space="preserve">and decoupled</w:t>
-      </w:r>
-      <w:r>
-        <w:t xml:space="preserve"> </w:t>
-      </w:r>
-      <w:r>
-        <w:t xml:space="preserve">big-data platform that ingests, fuses, processes, and analyzes</w:t>
-      </w:r>
-      <w:r>
-        <w:t xml:space="preserve"> </w:t>
-      </w:r>
-      <w:r>
-        <w:t xml:space="preserve">aviation and weather data in real time. The primary use case is flight-delay</w:t>
-      </w:r>
-      <w:r>
-        <w:t xml:space="preserve"> </w:t>
-      </w:r>
-      <w:r>
-        <w:t xml:space="preserve">prediction; the same architecture is designed to support congestion analysis,</w:t>
-      </w:r>
-      <w:r>
-        <w:t xml:space="preserve"> </w:t>
-      </w:r>
-      <w:r>
-        <w:t xml:space="preserve">delay-propagation modeling, operational monitoring, decision support, and</w:t>
-      </w:r>
-      <w:r>
-        <w:t xml:space="preserve"> </w:t>
-      </w:r>
-      <w:r>
-        <w:t xml:space="preserve">agentic AI.</w:t>
-      </w:r>
-      <w:r>
-        <w:t xml:space="preserve"> </w:t>
-      </w:r>
-      <w:hyperlink r:id="rId20">
-        <w:r>
-          <w:rPr>
-            <w:rStyle w:val="Hyperlink"/>
-          </w:rPr>
-          <w:t xml:space="preserve">Stage 1</w:t>
-        </w:r>
-      </w:hyperlink>
-      <w:r>
-        <w:t xml:space="preserve"> </w:t>
-      </w:r>
-      <w:r>
-        <w:t xml:space="preserve">established a historical machine-learning pipeline and an interactive prototype</w:t>
+        <w:t xml:space="preserve">Scope</w:t>
+      </w:r>
+      <w:r>
+        <w:t xml:space="preserve">. The long-term vision for AeroFlux is ambitious and continues to evolve. Stage 2 therefore focuses on building a scalable, modular, configurable, portable, and decoupled big-data platform that can ingest, fuse, process, and analyze aviation and weather data in real time. This platform is intended to establish the technical foundation for future AeroFlux capabilities.</w:t>
+      </w:r>
+    </w:p>
+    <w:p>
+      <w:pPr>
+        <w:pStyle w:val="BodyText"/>
+      </w:pPr>
+      <w:r>
+        <w:t xml:space="preserve">Flight-delay prediction serves as the primary use case, but the architecture is designed to support additional applications, including congestion analysis, delay-propagation modeling, operational monitoring, decision support, and agentic AI. Stage 1 established a historical machine-learning pipeline and interactive prototype</w:t>
       </w:r>
       <w:r>
         <w:t xml:space="preserve"> </w:t>
@@ -298,13 +254,7 @@
         <w:t xml:space="preserve">(Wilson et al., 2026)</w:t>
       </w:r>
       <w:r>
-        <w:t xml:space="preserve">; Stage 2 adds the live data platform, a</w:t>
-      </w:r>
-      <w:r>
-        <w:t xml:space="preserve"> </w:t>
-      </w:r>
-      <w:r>
-        <w:t xml:space="preserve">baseline-versus-advanced model comparison, and an explainable analyst agent.</w:t>
+        <w:t xml:space="preserve">. Stage 2 extends that work by introducing a live data platform, comparing baseline and advanced predictive models, and developing an explainable analyst agent as an initial prototype.</w:t>
       </w:r>
     </w:p>
     <w:p>
@@ -460,8 +410,8 @@
         <w:t xml:space="preserve">Several of these challenges have already been partially addressed through a working end-to-end prototype pipeline. However, the proposed implementation is intended to reduce and manage these limitations rather than eliminate every possible source of missing data, ambiguity, or operational uncertainty.</w:t>
       </w:r>
     </w:p>
-    <w:bookmarkEnd w:id="21"/>
-    <w:bookmarkStart w:id="22" w:name="related-work"/>
+    <w:bookmarkEnd w:id="9"/>
+    <w:bookmarkStart w:id="10" w:name="related-work"/>
     <w:p>
       <w:pPr>
         <w:pStyle w:val="Heading1"/>
@@ -485,7 +435,7 @@
         <w:t xml:space="preserve"> </w:t>
       </w:r>
       <w:r>
-        <w:t xml:space="preserve">Most prior work frames delay prediction</w:t>
+        <w:t xml:space="preserve">Prior work frames delay prediction</w:t>
       </w:r>
       <w:r>
         <w:t xml:space="preserve"> </w:t>
@@ -530,31 +480,7 @@
         <w:t xml:space="preserve">(AlBassam &amp; AlShahrani, 2025)</w:t>
       </w:r>
       <w:r>
-        <w:t xml:space="preserve">. These approaches</w:t>
-      </w:r>
-      <w:r>
-        <w:t xml:space="preserve"> </w:t>
-      </w:r>
-      <w:r>
-        <w:t xml:space="preserve">can achieve strong accuracy on curated historical data, but they are often</w:t>
-      </w:r>
-      <w:r>
-        <w:t xml:space="preserve"> </w:t>
-      </w:r>
-      <w:r>
-        <w:t xml:space="preserve">retrospective, single-source, and treat flights as independent observations,</w:t>
-      </w:r>
-      <w:r>
-        <w:t xml:space="preserve"> </w:t>
-      </w:r>
-      <w:r>
-        <w:t xml:space="preserve">which limits their ability to represent the network coupling that drives</w:t>
-      </w:r>
-      <w:r>
-        <w:t xml:space="preserve"> </w:t>
-      </w:r>
-      <w:r>
-        <w:t xml:space="preserve">real-world disruptions.</w:t>
+        <w:t xml:space="preserve">. These approaches can achieve strong predictive performance on curated historical datasets. However, when used in isolation, they may remain largely retrospective, rely on a limited set of data sources, and model flights as independent observations. These assumptions can restrict their ability to capture the temporal, spatial, and operational dependencies through which delays propagate across the aviation network.</w:t>
       </w:r>
     </w:p>
     <w:p>
@@ -726,7 +652,13 @@
         <w:t xml:space="preserve"> </w:t>
       </w:r>
       <w:r>
-        <w:t xml:space="preserve">open, extensible ML/AI experimentation platform.</w:t>
+        <w:t xml:space="preserve">open, extensible ML/AI experimentation platform. This project actually leverages some of the high level</w:t>
+      </w:r>
+      <w:r>
+        <w:t xml:space="preserve"> </w:t>
+      </w:r>
+      <w:r>
+        <w:t xml:space="preserve">concepts used in ATD-2 to create our own fuser.</w:t>
       </w:r>
     </w:p>
     <w:p>
@@ -738,6 +670,69 @@
           <w:b/>
           <w:bCs/>
         </w:rPr>
+        <w:t xml:space="preserve">Emerging aviation intelligence systems.</w:t>
+      </w:r>
+      <w:r>
+        <w:t xml:space="preserve"> </w:t>
+      </w:r>
+      <w:r>
+        <w:t xml:space="preserve">Recent operational systems show that the field is moving beyond static delay prediction toward real-time prediction, simulation, and decision support. FlightAware Foresight represents production ML-driven predictive flight tracking, including arrival-time, taxi-out, and runway predictions</w:t>
+      </w:r>
+      <w:r>
+        <w:t xml:space="preserve"> </w:t>
+      </w:r>
+      <w:r>
+        <w:t xml:space="preserve">(FlightAware, {n.d.})</w:t>
+      </w:r>
+      <w:r>
+        <w:t xml:space="preserve">. NASA’s NAS Digital Twin and Project Bluebird extend this direction toward replayable and probabilistic simulation environments for live or historical airspace operations and AI-agent evaluation</w:t>
+      </w:r>
+      <w:r>
+        <w:t xml:space="preserve"> </w:t>
+      </w:r>
+      <w:r>
+        <w:t xml:space="preserve">(Lauderdale et al., 2024; Pepper et al., 2026)</w:t>
+      </w:r>
+      <w:r>
+        <w:t xml:space="preserve">. Commercial platforms such as Airspace Intelligence PRESCIENCE, Lufthansa Systems NetLine/Ops++ aiOCC, and Amadeus Flight Operations Control show the market moving toward 4D operating-domain twins, AI-assisted operations control, disruption recovery, and resource-aware decision support</w:t>
+      </w:r>
+      <w:r>
+        <w:t xml:space="preserve"> </w:t>
+      </w:r>
+      <w:r>
+        <w:t xml:space="preserve">(Airspace Intelligence, {n.d.}; Amadeus, {n.d.}; Lufthansa Systems, 2025)</w:t>
+      </w:r>
+      <w:r>
+        <w:t xml:space="preserve">. Recent prototypes such as FlightSense further combine rotation-chain features, real-time MLOps, and conversational/agentic interfaces for delay prediction</w:t>
+      </w:r>
+      <w:r>
+        <w:t xml:space="preserve"> </w:t>
+      </w:r>
+      <w:r>
+        <w:t xml:space="preserve">(Shelke et al., 2026)</w:t>
+      </w:r>
+      <w:r>
+        <w:t xml:space="preserve">, while the FAA AI safety roadmap highlights the need for assurance, incremental deployment, and aviation-specific safety methods when adding AI to operational contexts</w:t>
+      </w:r>
+      <w:r>
+        <w:t xml:space="preserve"> </w:t>
+      </w:r>
+      <w:r>
+        <w:t xml:space="preserve">(Federal Aviation Administration, 2024a)</w:t>
+      </w:r>
+      <w:r>
+        <w:t xml:space="preserve">. Together, these efforts motivate AeroFlux as a lightweight, SWIM-native experimentation platform that connects real-time data fusion, propagation-aware ML, replay, and explainable/agentic analysis rather than treating delay prediction as a standalone model.</w:t>
+      </w:r>
+    </w:p>
+    <w:p>
+      <w:pPr>
+        <w:pStyle w:val="BodyText"/>
+      </w:pPr>
+      <w:r>
+        <w:rPr>
+          <w:b/>
+          <w:bCs/>
+        </w:rPr>
         <w:t xml:space="preserve">Relevance of this approach.</w:t>
       </w:r>
       <w:r>
@@ -765,8 +760,8 @@
         <w:t xml:space="preserve">agent—integrating capabilities that prior work often treats separately.</w:t>
       </w:r>
     </w:p>
-    <w:bookmarkEnd w:id="22"/>
-    <w:bookmarkStart w:id="23" w:name="objectives"/>
+    <w:bookmarkEnd w:id="10"/>
+    <w:bookmarkStart w:id="11" w:name="objectives"/>
     <w:p>
       <w:pPr>
         <w:pStyle w:val="Heading1"/>
@@ -882,35 +877,7 @@
         </w:numPr>
       </w:pPr>
       <w:r>
-        <w:t xml:space="preserve">Provide a starter</w:t>
-      </w:r>
-      <w:r>
-        <w:t xml:space="preserve"> </w:t>
-      </w:r>
-      <w:r>
-        <w:rPr>
-          <w:i/>
-          <w:iCs/>
-        </w:rPr>
-        <w:t xml:space="preserve">Aviation Operations Analyst Agent</w:t>
-      </w:r>
-      <w:r>
-        <w:t xml:space="preserve"> </w:t>
-      </w:r>
-      <w:r>
-        <w:t xml:space="preserve">that retrieves evidence,</w:t>
-      </w:r>
-      <w:r>
-        <w:t xml:space="preserve"> </w:t>
-      </w:r>
-      <w:r>
-        <w:t xml:space="preserve">explains model predictions, and recommends analytical next steps—without</w:t>
-      </w:r>
-      <w:r>
-        <w:t xml:space="preserve"> </w:t>
-      </w:r>
-      <w:r>
-        <w:t xml:space="preserve">making operational decisions.</w:t>
+        <w:t xml:space="preserve">Develop and evaluate a starter Aviation Operations Analyst that uses retrieval, model invocation, explainability, and structured tool calling to produce evidence-grounded disruption-investigation briefs without making operational decisions.</w:t>
       </w:r>
     </w:p>
     <w:p>
@@ -922,11 +889,11 @@
         </w:numPr>
       </w:pPr>
       <w:r>
-        <w:t xml:space="preserve">Achieve a demonstrable minimum implementation within approximately one month.</w:t>
-      </w:r>
-    </w:p>
-    <w:bookmarkEnd w:id="23"/>
-    <w:bookmarkStart w:id="27" w:name="datasets"/>
+        <w:t xml:space="preserve">Define stable tool interfaces that can later support knowledge graphs, operational-event replay, simulation, MCP integration, and specialized agent workflows without requiring replacement of the underlying data platform.</w:t>
+      </w:r>
+    </w:p>
+    <w:bookmarkEnd w:id="11"/>
+    <w:bookmarkStart w:id="15" w:name="datasets"/>
     <w:p>
       <w:pPr>
         <w:pStyle w:val="Heading1"/>
@@ -1021,7 +988,7 @@
       <w:tr>
         <w:tc>
           <w:tcPr/>
-          <w:bookmarkStart w:id="24" w:name="tbl-datasets"/>
+          <w:bookmarkStart w:id="12" w:name="tbl-datasets"/>
           <w:p>
             <w:pPr>
               <w:jc w:val="center"/>
@@ -1425,7 +1392,7 @@
               </w:tc>
             </w:tr>
           </w:tbl>
-          <w:bookmarkEnd w:id="24"/>
+          <w:bookmarkEnd w:id="12"/>
           <w:p/>
         </w:tc>
       </w:tr>
@@ -1491,7 +1458,7 @@
       <w:tr>
         <w:tc>
           <w:tcPr/>
-          <w:bookmarkStart w:id="25" w:name="lst-swim"/>
+          <w:bookmarkStart w:id="13" w:name="lst-swim"/>
           <w:p>
             <w:pPr>
               <w:jc w:val="center"/>
@@ -1524,9 +1491,15 @@
             </w:r>
             <w:r>
               <w:rPr>
+                <w:rStyle w:val="NormalTok"/>
+              </w:rPr>
+              <w:t xml:space="preserve"> </w:t>
+            </w:r>
+            <w:r>
+              <w:rPr>
                 <w:rStyle w:val="OtherTok"/>
               </w:rPr>
-              <w:t xml:space="preserve"> acid=</w:t>
+              <w:t xml:space="preserve">acid=</w:t>
             </w:r>
             <w:r>
               <w:rPr>
@@ -1536,9 +1509,15 @@
             </w:r>
             <w:r>
               <w:rPr>
+                <w:rStyle w:val="NormalTok"/>
+              </w:rPr>
+              <w:t xml:space="preserve"> </w:t>
+            </w:r>
+            <w:r>
+              <w:rPr>
                 <w:rStyle w:val="OtherTok"/>
               </w:rPr>
-              <w:t xml:space="preserve"> airline=</w:t>
+              <w:t xml:space="preserve">airline=</w:t>
             </w:r>
             <w:r>
               <w:rPr>
@@ -1548,9 +1527,15 @@
             </w:r>
             <w:r>
               <w:rPr>
+                <w:rStyle w:val="NormalTok"/>
+              </w:rPr>
+              <w:t xml:space="preserve"> </w:t>
+            </w:r>
+            <w:r>
+              <w:rPr>
                 <w:rStyle w:val="OtherTok"/>
               </w:rPr>
-              <w:t xml:space="preserve"> arrArpt=</w:t>
+              <w:t xml:space="preserve">arrArpt=</w:t>
             </w:r>
             <w:r>
               <w:rPr>
@@ -1560,9 +1545,15 @@
             </w:r>
             <w:r>
               <w:rPr>
+                <w:rStyle w:val="NormalTok"/>
+              </w:rPr>
+              <w:t xml:space="preserve"> </w:t>
+            </w:r>
+            <w:r>
+              <w:rPr>
                 <w:rStyle w:val="OtherTok"/>
               </w:rPr>
-              <w:t xml:space="preserve"> depArpt=</w:t>
+              <w:t xml:space="preserve">depArpt=</w:t>
             </w:r>
             <w:r>
               <w:rPr>
@@ -1575,9 +1566,15 @@
             </w:r>
             <w:r>
               <w:rPr>
+                <w:rStyle w:val="NormalTok"/>
+              </w:rPr>
+              <w:t xml:space="preserve">   </w:t>
+            </w:r>
+            <w:r>
+              <w:rPr>
                 <w:rStyle w:val="OtherTok"/>
               </w:rPr>
-              <w:t xml:space="preserve">   flightRef=</w:t>
+              <w:t xml:space="preserve">flightRef=</w:t>
             </w:r>
             <w:r>
               <w:rPr>
@@ -1587,9 +1584,15 @@
             </w:r>
             <w:r>
               <w:rPr>
+                <w:rStyle w:val="NormalTok"/>
+              </w:rPr>
+              <w:t xml:space="preserve"> </w:t>
+            </w:r>
+            <w:r>
+              <w:rPr>
                 <w:rStyle w:val="OtherTok"/>
               </w:rPr>
-              <w:t xml:space="preserve"> msgType=</w:t>
+              <w:t xml:space="preserve">msgType=</w:t>
             </w:r>
             <w:r>
               <w:rPr>
@@ -1698,9 +1701,15 @@
             </w:r>
             <w:r>
               <w:rPr>
+                <w:rStyle w:val="NormalTok"/>
+              </w:rPr>
+              <w:t xml:space="preserve"> </w:t>
+            </w:r>
+            <w:r>
+              <w:rPr>
                 <w:rStyle w:val="OtherTok"/>
               </w:rPr>
-              <w:t xml:space="preserve"> airlineOutTime=</w:t>
+              <w:t xml:space="preserve">airlineOutTime=</w:t>
             </w:r>
             <w:r>
               <w:rPr>
@@ -1713,9 +1722,15 @@
             </w:r>
             <w:r>
               <w:rPr>
+                <w:rStyle w:val="NormalTok"/>
+              </w:rPr>
+              <w:t xml:space="preserve">                       </w:t>
+            </w:r>
+            <w:r>
+              <w:rPr>
                 <w:rStyle w:val="OtherTok"/>
               </w:rPr>
-              <w:t xml:space="preserve">                       airlineInTime=</w:t>
+              <w:t xml:space="preserve">airlineInTime=</w:t>
             </w:r>
             <w:r>
               <w:rPr>
@@ -1751,7 +1766,7 @@
               <w:t xml:space="preserve">&gt;</w:t>
             </w:r>
           </w:p>
-          <w:bookmarkEnd w:id="25"/>
+          <w:bookmarkEnd w:id="13"/>
         </w:tc>
       </w:tr>
     </w:tbl>
@@ -1776,7 +1791,7 @@
       <w:tr>
         <w:tc>
           <w:tcPr/>
-          <w:bookmarkStart w:id="26" w:name="lst-record"/>
+          <w:bookmarkStart w:id="14" w:name="lst-record"/>
           <w:p>
             <w:pPr>
               <w:jc w:val="center"/>
@@ -2255,12 +2270,12 @@
               <w:t xml:space="preserve">}</w:t>
             </w:r>
           </w:p>
-          <w:bookmarkEnd w:id="26"/>
+          <w:bookmarkEnd w:id="14"/>
         </w:tc>
       </w:tr>
     </w:tbl>
-    <w:bookmarkEnd w:id="27"/>
-    <w:bookmarkStart w:id="33" w:name="methodology-and-proposed-solution"/>
+    <w:bookmarkEnd w:id="15"/>
+    <w:bookmarkStart w:id="16" w:name="methodology-and-proposed-solution"/>
     <w:p>
       <w:pPr>
         <w:pStyle w:val="Heading1"/>
@@ -2278,25 +2293,104 @@
           <w:b/>
           <w:bCs/>
         </w:rPr>
-        <w:t xml:space="preserve">Pipeline.</w:t>
-      </w:r>
-      <w:r>
-        <w:t xml:space="preserve"> </w:t>
-      </w:r>
-      <w:r>
-        <w:t xml:space="preserve">Ingestion services publish each source to a dedicated Kafka topic</w:t>
-      </w:r>
-      <w:r>
-        <w:t xml:space="preserve"> </w:t>
-      </w:r>
-      <w:r>
-        <w:t xml:space="preserve">(48-hour retention). Apache Spark Structured Streaming consumes these topics and</w:t>
-      </w:r>
-      <w:r>
-        <w:t xml:space="preserve"> </w:t>
-      </w:r>
-      <w:r>
-        <w:t xml:space="preserve">applies the existing</w:t>
+        <w:t xml:space="preserve">Architecture.</w:t>
+      </w:r>
+      <w:r>
+        <w:t xml:space="preserve"> </w:t>
+      </w:r>
+      <w:r>
+        <w:t xml:space="preserve">AeroFlux Stage 2 is a streaming lakehouse: heterogeneous</w:t>
+      </w:r>
+      <w:r>
+        <w:t xml:space="preserve"> </w:t>
+      </w:r>
+      <w:r>
+        <w:t xml:space="preserve">aviation and weather sources are ingested continuously, processed by a</w:t>
+      </w:r>
+      <w:r>
+        <w:t xml:space="preserve"> </w:t>
+      </w:r>
+      <w:r>
+        <w:t xml:space="preserve">distributed compute engine, and persisted across bronze → silver → gold tiers.</w:t>
+      </w:r>
+      <w:r>
+        <w:t xml:space="preserve"> </w:t>
+      </w:r>
+      <w:r>
+        <w:t xml:space="preserve">Every component runs as a container, so the platform deploys unchanged on a</w:t>
+      </w:r>
+      <w:r>
+        <w:t xml:space="preserve"> </w:t>
+      </w:r>
+      <w:r>
+        <w:t xml:space="preserve">laptop, university hardware, or a single cloud VM, with managed AWS services as</w:t>
+      </w:r>
+      <w:r>
+        <w:t xml:space="preserve"> </w:t>
+      </w:r>
+      <w:r>
+        <w:t xml:space="preserve">an optional scale path rather than a requirement. The full architecture is shown</w:t>
+      </w:r>
+      <w:r>
+        <w:t xml:space="preserve"> </w:t>
+      </w:r>
+      <w:r>
+        <w:t xml:space="preserve">in</w:t>
+      </w:r>
+      <w:r>
+        <w:t xml:space="preserve"> </w:t>
+      </w:r>
+      <w:r>
+        <w:rPr>
+          <w:b/>
+          <w:bCs/>
+        </w:rPr>
+        <w:t xml:space="preserve">?@fig-aeroflux2-arch</w:t>
+      </w:r>
+      <w:r>
+        <w:t xml:space="preserve">.</w:t>
+      </w:r>
+    </w:p>
+    <w:p>
+      <w:pPr>
+        <w:pStyle w:val="BodyText"/>
+      </w:pPr>
+      <w:r>
+        <w:rPr>
+          <w:b/>
+          <w:bCs/>
+        </w:rPr>
+        <w:t xml:space="preserve">Ingestion and streaming.</w:t>
+      </w:r>
+      <w:r>
+        <w:t xml:space="preserve"> </w:t>
+      </w:r>
+      <w:r>
+        <w:t xml:space="preserve">Dedicated services publish each source—SWIM flight</w:t>
+      </w:r>
+      <w:r>
+        <w:t xml:space="preserve"> </w:t>
+      </w:r>
+      <w:r>
+        <w:t xml:space="preserve">messages, ADS-B, and weather—to a dedicated Apache Kafka topic with 48-hour</w:t>
+      </w:r>
+      <w:r>
+        <w:t xml:space="preserve"> </w:t>
+      </w:r>
+      <w:r>
+        <w:t xml:space="preserve">retention, decoupling producers from consumers and providing a replayable event</w:t>
+      </w:r>
+      <w:r>
+        <w:t xml:space="preserve"> </w:t>
+      </w:r>
+      <w:r>
+        <w:t xml:space="preserve">history. Apache Spark Structured Streaming consumes these topics as the</w:t>
+      </w:r>
+      <w:r>
+        <w:t xml:space="preserve"> </w:t>
+      </w:r>
+      <w:r>
+        <w:t xml:space="preserve">platform’s primary big-data compute engine, applying the</w:t>
       </w:r>
       <w:r>
         <w:t xml:space="preserve"> </w:t>
@@ -2311,19 +2405,115 @@
         <w:t xml:space="preserve"> </w:t>
       </w:r>
       <w:r>
-        <w:t xml:space="preserve">library to parse, normalize, validate</w:t>
-      </w:r>
-      <w:r>
-        <w:t xml:space="preserve"> </w:t>
-      </w:r>
-      <w:r>
-        <w:t xml:space="preserve">against a strict schema contract, and fuse messages into per-flight records via</w:t>
-      </w:r>
-      <w:r>
-        <w:t xml:space="preserve"> </w:t>
-      </w:r>
-      <w:r>
-        <w:t xml:space="preserve">GUFI-keyed, source-priority mediation, with</w:t>
+        <w:t xml:space="preserve">library to validate each message against a strict schema contract and fuse</w:t>
+      </w:r>
+      <w:r>
+        <w:t xml:space="preserve"> </w:t>
+      </w:r>
+      <w:r>
+        <w:t xml:space="preserve">messages into per-flight canonical records—keyed on the stable GUFI, with ADS-B</w:t>
+      </w:r>
+      <w:r>
+        <w:t xml:space="preserve"> </w:t>
+      </w:r>
+      <w:r>
+        <w:t xml:space="preserve">used to resolve the aircraft tail that SWIM omits.</w:t>
+      </w:r>
+    </w:p>
+    <w:p>
+      <w:pPr>
+        <w:pStyle w:val="BodyText"/>
+      </w:pPr>
+      <w:r>
+        <w:rPr>
+          <w:b/>
+          <w:bCs/>
+        </w:rPr>
+        <w:t xml:space="preserve">Storage tiers and retention.</w:t>
+      </w:r>
+      <w:r>
+        <w:t xml:space="preserve"> </w:t>
+      </w:r>
+      <w:r>
+        <w:t xml:space="preserve">Processing follows a bronze → silver → gold</w:t>
+      </w:r>
+      <w:r>
+        <w:t xml:space="preserve"> </w:t>
+      </w:r>
+      <w:r>
+        <w:t xml:space="preserve">progression. Raw and fused per-flight state are held hot in PostgreSQL on a</w:t>
+      </w:r>
+      <w:r>
+        <w:t xml:space="preserve"> </w:t>
+      </w:r>
+      <w:r>
+        <w:t xml:space="preserve">rolling 48-hour window; current per-flight predictions are served from a NoSQL</w:t>
+      </w:r>
+      <w:r>
+        <w:t xml:space="preserve"> </w:t>
+      </w:r>
+      <w:r>
+        <w:t xml:space="preserve">store (Amazon DynamoDB in the cloud); and canonical and gold feature/label tables</w:t>
+      </w:r>
+      <w:r>
+        <w:t xml:space="preserve"> </w:t>
+      </w:r>
+      <w:r>
+        <w:t xml:space="preserve">are written as partitioned Parquet to a MinIO / Amazon S3 data lake, queryable in</w:t>
+      </w:r>
+      <w:r>
+        <w:t xml:space="preserve"> </w:t>
+      </w:r>
+      <w:r>
+        <w:t xml:space="preserve">place through Amazon Athena over an AWS Glue catalog. Short retention keeps the</w:t>
+      </w:r>
+      <w:r>
+        <w:t xml:space="preserve"> </w:t>
+      </w:r>
+      <w:r>
+        <w:t xml:space="preserve">streaming footprint small and low-cost, while the lake retains durable history</w:t>
+      </w:r>
+      <w:r>
+        <w:t xml:space="preserve"> </w:t>
+      </w:r>
+      <w:r>
+        <w:t xml:space="preserve">for training and replay. Because storage backends sit behind configuration, the</w:t>
+      </w:r>
+      <w:r>
+        <w:t xml:space="preserve"> </w:t>
+      </w:r>
+      <w:r>
+        <w:t xml:space="preserve">local stack (PostgreSQL, MinIO) swaps to managed cloud services (RDS, S3) with no</w:t>
+      </w:r>
+      <w:r>
+        <w:t xml:space="preserve"> </w:t>
+      </w:r>
+      <w:r>
+        <w:t xml:space="preserve">code change.</w:t>
+      </w:r>
+    </w:p>
+    <w:p>
+      <w:pPr>
+        <w:pStyle w:val="BodyText"/>
+      </w:pPr>
+      <w:r>
+        <w:rPr>
+          <w:b/>
+          <w:bCs/>
+        </w:rPr>
+        <w:t xml:space="preserve">Machine learning.</w:t>
+      </w:r>
+      <w:r>
+        <w:t xml:space="preserve"> </w:t>
+      </w:r>
+      <w:r>
+        <w:t xml:space="preserve">The same Spark engine runs feature engineering and XGBoost</w:t>
+      </w:r>
+      <w:r>
+        <w:t xml:space="preserve"> </w:t>
+      </w:r>
+      <w:r>
+        <w:t xml:space="preserve">inference via</w:t>
       </w:r>
       <w:r>
         <w:t xml:space="preserve"> </w:t>
@@ -2332,45 +2522,235 @@
         <w:rPr>
           <w:rStyle w:val="VerbatimChar"/>
         </w:rPr>
-        <w:t xml:space="preserve">flight_ref</w:t>
-      </w:r>
-      <w:r>
-        <w:t xml:space="preserve"> </w:t>
-      </w:r>
-      <w:r>
-        <w:t xml:space="preserve">used only as a</w:t>
-      </w:r>
-      <w:r>
-        <w:t xml:space="preserve"> </w:t>
-      </w:r>
-      <w:r>
-        <w:t xml:space="preserve">reconciliation bridge and ADS-B used to resolve the tail. Fused records land in</w:t>
-      </w:r>
-      <w:r>
-        <w:t xml:space="preserve"> </w:t>
-      </w:r>
-      <w:r>
-        <w:t xml:space="preserve">MongoDB (silver, 48-hour TTL) and, together with BTS backfill, in a MinIO</w:t>
-      </w:r>
-      <w:r>
-        <w:t xml:space="preserve"> </w:t>
-      </w:r>
-      <w:r>
-        <w:t xml:space="preserve">data lake (gold parquet). The full architecture is shown in</w:t>
-      </w:r>
-      <w:r>
-        <w:t xml:space="preserve"> </w:t>
-      </w:r>
-      <w:hyperlink w:anchor="fig-aeroflux2-arch">
+        <w:t xml:space="preserve">foreachBatch</w:t>
+      </w:r>
+      <w:r>
+        <w:t xml:space="preserve">, comparing a logistic-regression baseline against an</w:t>
+      </w:r>
+      <w:r>
+        <w:t xml:space="preserve"> </w:t>
+      </w:r>
+      <w:r>
+        <w:t xml:space="preserve">advanced gradient-boosted model enriched with propagation, weather, and rolling</w:t>
+      </w:r>
+      <w:r>
+        <w:t xml:space="preserve"> </w:t>
+      </w:r>
+      <w:r>
+        <w:t xml:space="preserve">airport-demand features</w:t>
+      </w:r>
+      <w:r>
+        <w:t xml:space="preserve"> </w:t>
+      </w:r>
+      <w:r>
+        <w:t xml:space="preserve">(Beatty et al., 1999; Chen &amp; Guestrin, 2016; Kafle &amp; Zou, 2016)</w:t>
+      </w:r>
+      <w:r>
+        <w:t xml:space="preserve">. Feature engineering is expressed once in a source-agnostic</w:t>
+      </w:r>
+      <w:r>
+        <w:t xml:space="preserve"> </w:t>
+      </w:r>
+      <w:r>
+        <w:t xml:space="preserve">core, so historical (BTS) training and live serving compute identical features by</w:t>
+      </w:r>
+      <w:r>
+        <w:t xml:space="preserve"> </w:t>
+      </w:r>
+      <w:r>
+        <w:t xml:space="preserve">construction; that core runs on Polars locally for development and in Spark at</w:t>
+      </w:r>
+      <w:r>
+        <w:t xml:space="preserve"> </w:t>
+      </w:r>
+      <w:r>
+        <w:t xml:space="preserve">scale. Both models target a 15-minute arrival-delay classification, are tracked</w:t>
+      </w:r>
+      <w:r>
+        <w:t xml:space="preserve"> </w:t>
+      </w:r>
+      <w:r>
+        <w:t xml:space="preserve">in MLflow, and are explained with SHAP</w:t>
+      </w:r>
+      <w:r>
+        <w:t xml:space="preserve"> </w:t>
+      </w:r>
+      <w:r>
+        <w:t xml:space="preserve">(Lundberg &amp; Lee, 2017)</w:t>
+      </w:r>
+      <w:r>
+        <w:t xml:space="preserve">.</w:t>
+      </w:r>
+    </w:p>
+    <w:p>
+      <w:pPr>
+        <w:pStyle w:val="BodyText"/>
+      </w:pPr>
+      <w:r>
+        <w:rPr>
+          <w:b/>
+          <w:bCs/>
+        </w:rPr>
+        <w:t xml:space="preserve">AI orchestration prototype.</w:t>
+      </w:r>
+      <w:r>
+        <w:t xml:space="preserve"> </w:t>
+      </w:r>
+      <w:r>
+        <w:t xml:space="preserve">A lightweight</w:t>
+      </w:r>
+      <w:r>
+        <w:t xml:space="preserve"> </w:t>
+      </w:r>
+      <w:r>
+        <w:rPr>
+          <w:i/>
+          <w:iCs/>
+        </w:rPr>
+        <w:t xml:space="preserve">Aviation Operations Analyst</w:t>
+      </w:r>
+      <w:r>
+        <w:t xml:space="preserve"> </w:t>
+      </w:r>
+      <w:r>
+        <w:t xml:space="preserve">uses</w:t>
+      </w:r>
+      <w:r>
+        <w:t xml:space="preserve"> </w:t>
+      </w:r>
+      <w:r>
+        <w:t xml:space="preserve">retrieval-augmented generation</w:t>
+      </w:r>
+      <w:r>
+        <w:t xml:space="preserve"> </w:t>
+      </w:r>
+      <w:r>
+        <w:t xml:space="preserve">(Lewis et al., 2020)</w:t>
+      </w:r>
+      <w:r>
+        <w:t xml:space="preserve"> </w:t>
+      </w:r>
+      <w:r>
+        <w:t xml:space="preserve">and a constrained LangGraph</w:t>
+      </w:r>
+      <w:r>
+        <w:t xml:space="preserve"> </w:t>
+      </w:r>
+      <w:r>
+        <w:t xml:space="preserve">workflow over a curated aviation-document corpus to produce cited, evidence-</w:t>
+      </w:r>
+      <w:r>
+        <w:t xml:space="preserve"> </w:t>
+      </w:r>
+      <w:r>
+        <w:t xml:space="preserve">grounded briefs; it does not touch live streaming data or make operational</w:t>
+      </w:r>
+      <w:r>
+        <w:t xml:space="preserve"> </w:t>
+      </w:r>
+      <w:r>
+        <w:t xml:space="preserve">decisions, and is evaluated on a small set of reviewed questions for</w:t>
+      </w:r>
+      <w:r>
+        <w:t xml:space="preserve"> </w:t>
+      </w:r>
+      <w:r>
+        <w:t xml:space="preserve">groundedness, citation accuracy, and appropriate tool use. As an optional stretch</w:t>
+      </w:r>
+      <w:r>
+        <w:t xml:space="preserve"> </w:t>
+      </w:r>
+      <w:r>
+        <w:t xml:space="preserve">goal, a read-only Model Context Protocol (MCP) server may expose these tools</w:t>
+      </w:r>
+      <w:r>
+        <w:t xml:space="preserve"> </w:t>
+      </w:r>
+      <w:r>
+        <w:t xml:space="preserve">through a standardized interface.</w:t>
+      </w:r>
+    </w:p>
+    <w:p>
+      <w:pPr>
+        <w:pStyle w:val="BodyText"/>
+      </w:pPr>
+      <w:r>
+        <w:rPr>
+          <w:b/>
+          <w:bCs/>
+        </w:rPr>
+        <w:t xml:space="preserve">Evaluation.</w:t>
+      </w:r>
+      <w:r>
+        <w:t xml:space="preserve"> </w:t>
+      </w:r>
+      <w:r>
+        <w:t xml:space="preserve">Both predictive and system performance are evaluated.</w:t>
+      </w:r>
+    </w:p>
+    <w:bookmarkEnd w:id="16"/>
+    <w:bookmarkStart w:id="18" w:name="development-environment"/>
+    <w:p>
+      <w:pPr>
+        <w:pStyle w:val="Heading1"/>
+      </w:pPr>
+      <w:r>
+        <w:t xml:space="preserve">6. Development Environment</w:t>
+      </w:r>
+    </w:p>
+    <w:p>
+      <w:pPr>
+        <w:pStyle w:val="FirstParagraph"/>
+      </w:pPr>
+      <w:r>
+        <w:t xml:space="preserve">The stack (</w:t>
+      </w:r>
+      <w:hyperlink w:anchor="tbl-stack">
         <w:r>
           <w:rPr>
             <w:rStyle w:val="Hyperlink"/>
           </w:rPr>
-          <w:t xml:space="preserve">Figure 1</w:t>
+          <w:t xml:space="preserve">Table 2</w:t>
         </w:r>
       </w:hyperlink>
       <w:r>
-        <w:t xml:space="preserve">.</w:t>
+        <w:t xml:space="preserve">) is entirely open-source and container-first. Every</w:t>
+      </w:r>
+      <w:r>
+        <w:t xml:space="preserve"> </w:t>
+      </w:r>
+      <w:r>
+        <w:t xml:space="preserve">component runs as a Docker Compose service, so the platform deploys unchanged on</w:t>
+      </w:r>
+      <w:r>
+        <w:t xml:space="preserve"> </w:t>
+      </w:r>
+      <w:r>
+        <w:t xml:space="preserve">a laptop, university hardware, or a single cloud VM; managed AWS services (MSK,</w:t>
+      </w:r>
+      <w:r>
+        <w:t xml:space="preserve"> </w:t>
+      </w:r>
+      <w:r>
+        <w:t xml:space="preserve">EMR, SageMaker) are an optional scale path rather than a requirement. MinIO</w:t>
+      </w:r>
+      <w:r>
+        <w:t xml:space="preserve"> </w:t>
+      </w:r>
+      <w:r>
+        <w:t xml:space="preserve">provides an S3-compatible object store that swaps to real S3 with no code change.</w:t>
+      </w:r>
+      <w:r>
+        <w:t xml:space="preserve"> </w:t>
+      </w:r>
+      <w:r>
+        <w:t xml:space="preserve">Short retention keeps storage and cost minimal (target budget: a modest VM plus a</w:t>
+      </w:r>
+      <w:r>
+        <w:t xml:space="preserve"> </w:t>
+      </w:r>
+      <w:r>
+        <w:t xml:space="preserve">few dollars of LLM API usage).</w:t>
       </w:r>
     </w:p>
     <w:tbl>
@@ -2386,55 +2766,7 @@
       <w:tr>
         <w:tc>
           <w:tcPr/>
-          <w:bookmarkStart w:id="31" w:name="fig-aeroflux2-arch"/>
-          <w:p>
-            <w:pPr>
-              <w:pStyle w:val="Compact"/>
-              <w:jc w:val="center"/>
-            </w:pPr>
-            <w:r>
-              <w:drawing>
-                <wp:inline>
-                  <wp:extent cx="5334000" cy="9406344"/>
-                  <wp:effectExtent b="0" l="0" r="0" t="0"/>
-                  <wp:docPr descr="" title="" id="29" name="Picture"/>
-                  <a:graphic>
-                    <a:graphicData uri="http://schemas.openxmlformats.org/drawingml/2006/picture">
-                      <pic:pic>
-                        <pic:nvPicPr>
-                          <pic:cNvPr descr="./images/design/aeroflux2-arch.png" id="30" name="Picture"/>
-                          <pic:cNvPicPr>
-                            <a:picLocks noChangeArrowheads="1" noChangeAspect="1"/>
-                          </pic:cNvPicPr>
-                        </pic:nvPicPr>
-                        <pic:blipFill>
-                          <a:blip r:embed="rId28"/>
-                          <a:stretch>
-                            <a:fillRect/>
-                          </a:stretch>
-                        </pic:blipFill>
-                        <pic:spPr bwMode="auto">
-                          <a:xfrm>
-                            <a:off x="0" y="0"/>
-                            <a:ext cx="5334000" cy="9406344"/>
-                          </a:xfrm>
-                          <a:prstGeom prst="rect">
-                            <a:avLst/>
-                          </a:prstGeom>
-                          <a:noFill/>
-                          <a:ln w="9525">
-                            <a:noFill/>
-                            <a:headEnd/>
-                            <a:tailEnd/>
-                          </a:ln>
-                        </pic:spPr>
-                      </pic:pic>
-                    </a:graphicData>
-                  </a:graphic>
-                </wp:inline>
-              </w:drawing>
-            </w:r>
-          </w:p>
+          <w:bookmarkStart w:id="17" w:name="tbl-stack"/>
           <w:p>
             <w:pPr>
               <w:jc w:val="center"/>
@@ -2445,633 +2777,7 @@
               <w:pStyle w:val="ImageCaption"/>
             </w:pPr>
             <w:r>
-              <w:t xml:space="preserve">Figure 1: AeroFlux Stage 2 system architecture.</w:t>
-            </w:r>
-          </w:p>
-          <w:bookmarkEnd w:id="31"/>
-        </w:tc>
-      </w:tr>
-    </w:tbl>
-    <w:p>
-      <w:pPr>
-        <w:pStyle w:val="BodyText"/>
-      </w:pPr>
-      <w:r>
-        <w:rPr>
-          <w:b/>
-          <w:bCs/>
-        </w:rPr>
-        <w:t xml:space="preserve">Baseline versus advanced models.</w:t>
-      </w:r>
-      <w:r>
-        <w:t xml:space="preserve"> </w:t>
-      </w:r>
-      <w:r>
-        <w:t xml:space="preserve">The baseline is a logistic-regression</w:t>
-      </w:r>
-      <w:r>
-        <w:t xml:space="preserve"> </w:t>
-      </w:r>
-      <w:r>
-        <w:t xml:space="preserve">classifier on flight-level features (carrier, origin, destination, scheduled</w:t>
-      </w:r>
-      <w:r>
-        <w:t xml:space="preserve"> </w:t>
-      </w:r>
-      <w:r>
-        <w:t xml:space="preserve">times). The advanced model is a gradient-boosted tree using XGBoost</w:t>
-      </w:r>
-      <w:r>
-        <w:t xml:space="preserve"> </w:t>
-      </w:r>
-      <w:r>
-        <w:t xml:space="preserve">(Chen &amp; Guestrin, 2016)</w:t>
-      </w:r>
-      <w:r>
-        <w:t xml:space="preserve"> </w:t>
-      </w:r>
-      <w:r>
-        <w:t xml:space="preserve">and is enriched with</w:t>
-      </w:r>
-      <w:r>
-        <w:t xml:space="preserve"> </w:t>
-      </w:r>
-      <w:r>
-        <w:rPr>
-          <w:i/>
-          <w:iCs/>
-        </w:rPr>
-        <w:t xml:space="preserve">propagation</w:t>
-      </w:r>
-      <w:r>
-        <w:t xml:space="preserve"> </w:t>
-      </w:r>
-      <w:r>
-        <w:t xml:space="preserve">features (previous-leg</w:t>
-      </w:r>
-      <w:r>
-        <w:t xml:space="preserve"> </w:t>
-      </w:r>
-      <w:r>
-        <w:t xml:space="preserve">arrival delay and scheduled turnaround buffer), weather features, and rolling</w:t>
-      </w:r>
-      <w:r>
-        <w:t xml:space="preserve"> </w:t>
-      </w:r>
-      <w:r>
-        <w:t xml:space="preserve">airport demand. This design directly operationalizes findings from the delay-</w:t>
-      </w:r>
-      <w:r>
-        <w:t xml:space="preserve"> </w:t>
-      </w:r>
-      <w:r>
-        <w:t xml:space="preserve">propagation literature</w:t>
-      </w:r>
-      <w:r>
-        <w:t xml:space="preserve"> </w:t>
-      </w:r>
-      <w:r>
-        <w:t xml:space="preserve">(Beatty et al., 1999; Kafle &amp; Zou, 2016)</w:t>
-      </w:r>
-      <w:r>
-        <w:t xml:space="preserve">. Both</w:t>
-      </w:r>
-      <w:r>
-        <w:t xml:space="preserve"> </w:t>
-      </w:r>
-      <w:r>
-        <w:t xml:space="preserve">models target a 15-minute arrival-delay classification, with class imbalance</w:t>
-      </w:r>
-      <w:r>
-        <w:t xml:space="preserve"> </w:t>
-      </w:r>
-      <w:r>
-        <w:t xml:space="preserve">addressed through resampling, a concern emphasized in recent delay-prediction</w:t>
-      </w:r>
-      <w:r>
-        <w:t xml:space="preserve"> </w:t>
-      </w:r>
-      <w:r>
-        <w:t xml:space="preserve">research</w:t>
-      </w:r>
-      <w:r>
-        <w:t xml:space="preserve"> </w:t>
-      </w:r>
-      <w:r>
-        <w:t xml:space="preserve">(AlBassam &amp; AlShahrani, 2025)</w:t>
-      </w:r>
-      <w:r>
-        <w:t xml:space="preserve">. Models are tracked in MLflow and explained with</w:t>
-      </w:r>
-      <w:r>
-        <w:t xml:space="preserve"> </w:t>
-      </w:r>
-      <w:r>
-        <w:t xml:space="preserve">SHAP</w:t>
-      </w:r>
-      <w:r>
-        <w:t xml:space="preserve"> </w:t>
-      </w:r>
-      <w:r>
-        <w:t xml:space="preserve">(Lundberg &amp; Lee, 2017)</w:t>
-      </w:r>
-      <w:r>
-        <w:t xml:space="preserve">, whose outputs feed the agent.</w:t>
-      </w:r>
-    </w:p>
-    <w:p>
-      <w:pPr>
-        <w:pStyle w:val="BodyText"/>
-      </w:pPr>
-      <w:r>
-        <w:rPr>
-          <w:b/>
-          <w:bCs/>
-        </w:rPr>
-        <w:t xml:space="preserve">Evaluation.</w:t>
-      </w:r>
-      <w:r>
-        <w:t xml:space="preserve"> </w:t>
-      </w:r>
-      <w:r>
-        <w:t xml:space="preserve">Both predictive and system performance are evaluated</w:t>
-      </w:r>
-      <w:r>
-        <w:t xml:space="preserve"> </w:t>
-      </w:r>
-      <w:r>
-        <w:t xml:space="preserve">(</w:t>
-      </w:r>
-      <w:hyperlink w:anchor="tbl-models">
-        <w:r>
-          <w:rPr>
-            <w:rStyle w:val="Hyperlink"/>
-          </w:rPr>
-          <w:t xml:space="preserve">Table 2</w:t>
-        </w:r>
-      </w:hyperlink>
-      <w:r>
-        <w:t xml:space="preserve">). Predictive metrics include ROC-AUC, PR-AUC, F1, and Brier score</w:t>
-      </w:r>
-      <w:r>
-        <w:t xml:space="preserve"> </w:t>
-      </w:r>
-      <w:r>
-        <w:t xml:space="preserve">and calibration, using point-in-time features to prevent leakage. System metrics</w:t>
-      </w:r>
-      <w:r>
-        <w:t xml:space="preserve"> </w:t>
-      </w:r>
-      <w:r>
-        <w:t xml:space="preserve">include end-to-end latency, sustained message throughput, fusion completeness</w:t>
-      </w:r>
-      <w:r>
-        <w:t xml:space="preserve"> </w:t>
-      </w:r>
-      <w:r>
-        <w:t xml:space="preserve">(fields populated per flight), and resource footprint.</w:t>
-      </w:r>
-    </w:p>
-    <w:tbl>
-      <w:tblPr>
-        <w:tblStyle w:val="Table"/>
-        <w:tblW w:type="pct" w:w="5000"/>
-        <w:tblLayout w:type="fixed"/>
-        <w:tblLook w:firstRow="0" w:lastRow="0" w:firstColumn="0" w:lastColumn="0" w:noHBand="0" w:noVBand="0" w:val="0000"/>
-      </w:tblPr>
-      <w:tblGrid>
-        <w:gridCol w:w="7920"/>
-      </w:tblGrid>
-      <w:tr>
-        <w:tc>
-          <w:tcPr/>
-          <w:bookmarkStart w:id="32" w:name="tbl-models"/>
-          <w:p>
-            <w:pPr>
-              <w:jc w:val="center"/>
-            </w:pPr>
-            <w:pPr>
-              <w:jc w:val="left"/>
-              <w:spacing w:before="200"/>
-              <w:pStyle w:val="ImageCaption"/>
-            </w:pPr>
-            <w:r>
-              <w:t xml:space="preserve">Table 2: Baseline-versus-advanced comparison and evaluation plan.</w:t>
-            </w:r>
-          </w:p>
-          <w:tbl>
-            <w:tblPr>
-              <w:tblStyle w:val="Table"/>
-              <w:tblW w:type="pct" w:w="5000"/>
-              <w:tblLayout w:type="fixed"/>
-              <w:tblLook w:firstRow="1" w:lastRow="0" w:firstColumn="0" w:lastColumn="0" w:noHBand="0" w:noVBand="0" w:val="0020"/>
-            </w:tblPr>
-            <w:tblGrid>
-              <w:gridCol w:w="1980"/>
-              <w:gridCol w:w="1980"/>
-              <w:gridCol w:w="1980"/>
-              <w:gridCol w:w="1980"/>
-            </w:tblGrid>
-            <w:tr>
-              <w:trPr>
-                <w:tblHeader w:val="on"/>
-              </w:trPr>
-              <w:tc>
-                <w:tcPr/>
-                <w:p>
-                  <w:pPr>
-                    <w:pStyle w:val="Compact"/>
-                    <w:jc w:val="center"/>
-                  </w:pPr>
-                  <w:r>
-                    <w:t xml:space="preserve">Dimension</w:t>
-                  </w:r>
-                </w:p>
-              </w:tc>
-              <w:tc>
-                <w:tcPr/>
-                <w:p>
-                  <w:pPr>
-                    <w:pStyle w:val="Compact"/>
-                    <w:jc w:val="center"/>
-                  </w:pPr>
-                  <w:r>
-                    <w:t xml:space="preserve">Baseline</w:t>
-                  </w:r>
-                </w:p>
-              </w:tc>
-              <w:tc>
-                <w:tcPr/>
-                <w:p>
-                  <w:pPr>
-                    <w:pStyle w:val="Compact"/>
-                    <w:jc w:val="center"/>
-                  </w:pPr>
-                  <w:r>
-                    <w:t xml:space="preserve">Advanced</w:t>
-                  </w:r>
-                </w:p>
-              </w:tc>
-              <w:tc>
-                <w:tcPr/>
-                <w:p>
-                  <w:pPr>
-                    <w:pStyle w:val="Compact"/>
-                    <w:jc w:val="center"/>
-                  </w:pPr>
-                  <w:r>
-                    <w:t xml:space="preserve">Metrics</w:t>
-                  </w:r>
-                </w:p>
-              </w:tc>
-            </w:tr>
-            <w:tr>
-              <w:tc>
-                <w:tcPr/>
-                <w:p>
-                  <w:pPr>
-                    <w:pStyle w:val="Compact"/>
-                    <w:jc w:val="center"/>
-                  </w:pPr>
-                  <w:r>
-                    <w:t xml:space="preserve">Model</w:t>
-                  </w:r>
-                </w:p>
-              </w:tc>
-              <w:tc>
-                <w:tcPr/>
-                <w:p>
-                  <w:pPr>
-                    <w:pStyle w:val="Compact"/>
-                    <w:jc w:val="center"/>
-                  </w:pPr>
-                  <w:r>
-                    <w:t xml:space="preserve">Logistic Regression</w:t>
-                  </w:r>
-                </w:p>
-              </w:tc>
-              <w:tc>
-                <w:tcPr/>
-                <w:p>
-                  <w:pPr>
-                    <w:pStyle w:val="Compact"/>
-                    <w:jc w:val="center"/>
-                  </w:pPr>
-                  <w:r>
-                    <w:t xml:space="preserve">XGBoost + propagation + weather</w:t>
-                  </w:r>
-                </w:p>
-              </w:tc>
-              <w:tc>
-                <w:tcPr/>
-                <w:p>
-                  <w:pPr>
-                    <w:pStyle w:val="Compact"/>
-                    <w:jc w:val="center"/>
-                  </w:pPr>
-                  <w:r>
-                    <w:t xml:space="preserve">ROC-AUC, PR-AUC, F1, Brier</w:t>
-                  </w:r>
-                </w:p>
-              </w:tc>
-            </w:tr>
-            <w:tr>
-              <w:tc>
-                <w:tcPr/>
-                <w:p>
-                  <w:pPr>
-                    <w:pStyle w:val="Compact"/>
-                    <w:jc w:val="center"/>
-                  </w:pPr>
-                  <w:r>
-                    <w:t xml:space="preserve">Features</w:t>
-                  </w:r>
-                </w:p>
-              </w:tc>
-              <w:tc>
-                <w:tcPr/>
-                <w:p>
-                  <w:pPr>
-                    <w:pStyle w:val="Compact"/>
-                    <w:jc w:val="center"/>
-                  </w:pPr>
-                  <w:r>
-                    <w:t xml:space="preserve">Flight-level</w:t>
-                  </w:r>
-                </w:p>
-              </w:tc>
-              <w:tc>
-                <w:tcPr/>
-                <w:p>
-                  <w:pPr>
-                    <w:pStyle w:val="Compact"/>
-                    <w:jc w:val="center"/>
-                  </w:pPr>
-                  <w:r>
-                    <w:t xml:space="preserve">+ propagation, weather, demand</w:t>
-                  </w:r>
-                </w:p>
-              </w:tc>
-              <w:tc>
-                <w:tcPr/>
-                <w:p>
-                  <w:pPr>
-                    <w:pStyle w:val="Compact"/>
-                    <w:jc w:val="center"/>
-                  </w:pPr>
-                  <w:r>
-                    <w:t xml:space="preserve">Feature importance (SHAP)</w:t>
-                  </w:r>
-                </w:p>
-              </w:tc>
-            </w:tr>
-            <w:tr>
-              <w:tc>
-                <w:tcPr/>
-                <w:p>
-                  <w:pPr>
-                    <w:pStyle w:val="Compact"/>
-                    <w:jc w:val="center"/>
-                  </w:pPr>
-                  <w:r>
-                    <w:t xml:space="preserve">System</w:t>
-                  </w:r>
-                </w:p>
-              </w:tc>
-              <w:tc>
-                <w:tcPr/>
-                <w:p>
-                  <w:pPr>
-                    <w:pStyle w:val="Compact"/>
-                    <w:jc w:val="center"/>
-                  </w:pPr>
-                  <w:r>
-                    <w:t xml:space="preserve">—</w:t>
-                  </w:r>
-                </w:p>
-              </w:tc>
-              <w:tc>
-                <w:tcPr/>
-                <w:p>
-                  <w:pPr>
-                    <w:pStyle w:val="Compact"/>
-                    <w:jc w:val="center"/>
-                  </w:pPr>
-                  <w:r>
-                    <w:t xml:space="preserve">Streaming pipeline</w:t>
-                  </w:r>
-                </w:p>
-              </w:tc>
-              <w:tc>
-                <w:tcPr/>
-                <w:p>
-                  <w:pPr>
-                    <w:pStyle w:val="Compact"/>
-                    <w:jc w:val="center"/>
-                  </w:pPr>
-                  <w:r>
-                    <w:t xml:space="preserve">Latency, throughput, completeness</w:t>
-                  </w:r>
-                </w:p>
-              </w:tc>
-            </w:tr>
-          </w:tbl>
-          <w:bookmarkEnd w:id="32"/>
-          <w:p/>
-        </w:tc>
-      </w:tr>
-    </w:tbl>
-    <w:p>
-      <w:pPr>
-        <w:pStyle w:val="BodyText"/>
-      </w:pPr>
-      <w:r>
-        <w:rPr>
-          <w:b/>
-          <w:bCs/>
-        </w:rPr>
-        <w:t xml:space="preserve">Agentic AI and LLM approach.</w:t>
-      </w:r>
-      <w:r>
-        <w:t xml:space="preserve"> </w:t>
-      </w:r>
-      <w:r>
-        <w:t xml:space="preserve">The starter</w:t>
-      </w:r>
-      <w:r>
-        <w:t xml:space="preserve"> </w:t>
-      </w:r>
-      <w:r>
-        <w:rPr>
-          <w:i/>
-          <w:iCs/>
-        </w:rPr>
-        <w:t xml:space="preserve">Aviation Operations Analyst Agent</w:t>
-      </w:r>
-      <w:r>
-        <w:t xml:space="preserve"> </w:t>
-      </w:r>
-      <w:r>
-        <w:t xml:space="preserve">answers natural-language questions (for example,</w:t>
-      </w:r>
-      <w:r>
-        <w:t xml:space="preserve"> </w:t>
-      </w:r>
-      <w:r>
-        <w:t xml:space="preserve">“Why is this flight likely</w:t>
-      </w:r>
-      <w:r>
-        <w:t xml:space="preserve"> </w:t>
-      </w:r>
-      <w:r>
-        <w:t xml:space="preserve">delayed?”</w:t>
-      </w:r>
-      <w:r>
-        <w:t xml:space="preserve">) by combining retrieval-augmented generation</w:t>
-      </w:r>
-      <w:r>
-        <w:t xml:space="preserve"> </w:t>
-      </w:r>
-      <w:r>
-        <w:t xml:space="preserve">(Lewis et al., 2020)</w:t>
-      </w:r>
-      <w:r>
-        <w:t xml:space="preserve"> </w:t>
-      </w:r>
-      <w:r>
-        <w:t xml:space="preserve">over the</w:t>
-      </w:r>
-      <w:r>
-        <w:t xml:space="preserve"> </w:t>
-      </w:r>
-      <w:r>
-        <w:t xml:space="preserve">aviation-documentation corpus (embeddings in pgvector) with tool calls that query</w:t>
-      </w:r>
-      <w:r>
-        <w:t xml:space="preserve"> </w:t>
-      </w:r>
-      <w:r>
-        <w:t xml:space="preserve">the fused databases, invoke the delay model, and return SHAP explanations. The</w:t>
-      </w:r>
-      <w:r>
-        <w:t xml:space="preserve"> </w:t>
-      </w:r>
-      <w:r>
-        <w:t xml:space="preserve">agent retrieves evidence, explains predictions, and recommends next steps; it</w:t>
-      </w:r>
-      <w:r>
-        <w:t xml:space="preserve"> </w:t>
-      </w:r>
-      <w:r>
-        <w:t xml:space="preserve">does</w:t>
-      </w:r>
-      <w:r>
-        <w:t xml:space="preserve"> </w:t>
-      </w:r>
-      <w:r>
-        <w:rPr>
-          <w:b/>
-          <w:bCs/>
-        </w:rPr>
-        <w:t xml:space="preserve">not</w:t>
-      </w:r>
-      <w:r>
-        <w:t xml:space="preserve"> </w:t>
-      </w:r>
-      <w:r>
-        <w:t xml:space="preserve">execute operational aviation decisions.</w:t>
-      </w:r>
-    </w:p>
-    <w:bookmarkEnd w:id="33"/>
-    <w:bookmarkStart w:id="35" w:name="development-environment"/>
-    <w:p>
-      <w:pPr>
-        <w:pStyle w:val="Heading1"/>
-      </w:pPr>
-      <w:r>
-        <w:t xml:space="preserve">6. Development Environment</w:t>
-      </w:r>
-    </w:p>
-    <w:p>
-      <w:pPr>
-        <w:pStyle w:val="FirstParagraph"/>
-      </w:pPr>
-      <w:r>
-        <w:t xml:space="preserve">The stack (</w:t>
-      </w:r>
-      <w:hyperlink w:anchor="tbl-stack">
-        <w:r>
-          <w:rPr>
-            <w:rStyle w:val="Hyperlink"/>
-          </w:rPr>
-          <w:t xml:space="preserve">Table 3</w:t>
-        </w:r>
-      </w:hyperlink>
-      <w:r>
-        <w:t xml:space="preserve">) is entirely open-source and container-first. Every</w:t>
-      </w:r>
-      <w:r>
-        <w:t xml:space="preserve"> </w:t>
-      </w:r>
-      <w:r>
-        <w:t xml:space="preserve">component runs as a Docker Compose service, so the platform deploys unchanged on</w:t>
-      </w:r>
-      <w:r>
-        <w:t xml:space="preserve"> </w:t>
-      </w:r>
-      <w:r>
-        <w:t xml:space="preserve">a laptop, university hardware, or a single cloud VM; managed AWS services (MSK,</w:t>
-      </w:r>
-      <w:r>
-        <w:t xml:space="preserve"> </w:t>
-      </w:r>
-      <w:r>
-        <w:t xml:space="preserve">EMR, SageMaker) are an optional scale path rather than a requirement. MinIO</w:t>
-      </w:r>
-      <w:r>
-        <w:t xml:space="preserve"> </w:t>
-      </w:r>
-      <w:r>
-        <w:t xml:space="preserve">provides an S3-compatible object store that swaps to real S3 with no code change.</w:t>
-      </w:r>
-      <w:r>
-        <w:t xml:space="preserve"> </w:t>
-      </w:r>
-      <w:r>
-        <w:t xml:space="preserve">Short retention keeps storage and cost minimal (target budget: a modest VM plus a</w:t>
-      </w:r>
-      <w:r>
-        <w:t xml:space="preserve"> </w:t>
-      </w:r>
-      <w:r>
-        <w:t xml:space="preserve">few dollars of LLM API usage).</w:t>
-      </w:r>
-    </w:p>
-    <w:tbl>
-      <w:tblPr>
-        <w:tblStyle w:val="Table"/>
-        <w:tblW w:type="pct" w:w="5000"/>
-        <w:tblLayout w:type="fixed"/>
-        <w:tblLook w:firstRow="0" w:lastRow="0" w:firstColumn="0" w:lastColumn="0" w:noHBand="0" w:noVBand="0" w:val="0000"/>
-      </w:tblPr>
-      <w:tblGrid>
-        <w:gridCol w:w="7920"/>
-      </w:tblGrid>
-      <w:tr>
-        <w:tc>
-          <w:tcPr/>
-          <w:bookmarkStart w:id="34" w:name="tbl-stack"/>
-          <w:p>
-            <w:pPr>
-              <w:jc w:val="center"/>
-            </w:pPr>
-            <w:pPr>
-              <w:jc w:val="left"/>
-              <w:spacing w:before="200"/>
-              <w:pStyle w:val="ImageCaption"/>
-            </w:pPr>
-            <w:r>
-              <w:t xml:space="preserve">Table 3: Development environment and technology stack.</w:t>
+              <w:t xml:space="preserve">Table 2: Development environment and technology stack.</w:t>
             </w:r>
           </w:p>
           <w:tbl>
@@ -3187,7 +2893,7 @@
                     <w:jc w:val="center"/>
                   </w:pPr>
                   <w:r>
-                    <w:t xml:space="preserve">MongoDB, PostgreSQL + pgvector, MinIO (S3-compatible)</w:t>
+                    <w:t xml:space="preserve">MongoDB, PostgreSQL + pgvector, MinIO / Amazon S3</w:t>
                   </w:r>
                 </w:p>
               </w:tc>
@@ -3201,34 +2907,19 @@
                     <w:jc w:val="center"/>
                   </w:pPr>
                   <w:r>
-                    <w:t xml:space="preserve">ML</w:t>
-                  </w:r>
-                </w:p>
-              </w:tc>
-              <w:tc>
-                <w:tcPr/>
-                <w:p>
-                  <w:pPr>
-                    <w:pStyle w:val="Compact"/>
-                    <w:jc w:val="center"/>
-                  </w:pPr>
-                  <w:r>
-                    <w:t xml:space="preserve">scikit-learn, XGBoost</w:t>
-                  </w:r>
-                  <w:r>
-                    <w:t xml:space="preserve"> </w:t>
-                  </w:r>
-                  <w:r>
-                    <w:t xml:space="preserve">(Chen &amp; Guestrin, 2016)</w:t>
-                  </w:r>
-                  <w:r>
-                    <w:t xml:space="preserve">, MLflow, SHAP</w:t>
-                  </w:r>
-                  <w:r>
-                    <w:t xml:space="preserve"> </w:t>
-                  </w:r>
-                  <w:r>
-                    <w:t xml:space="preserve">(Lundberg &amp; Lee, 2017)</w:t>
+                    <w:t xml:space="preserve">Historical replay</w:t>
+                  </w:r>
+                </w:p>
+              </w:tc>
+              <w:tc>
+                <w:tcPr/>
+                <w:p>
+                  <w:pPr>
+                    <w:pStyle w:val="Compact"/>
+                    <w:jc w:val="center"/>
+                  </w:pPr>
+                  <w:r>
+                    <w:t xml:space="preserve">Kafka offsets and immutable Parquet event history in MinIO / S3</w:t>
                   </w:r>
                 </w:p>
               </w:tc>
@@ -3242,19 +2933,19 @@
                     <w:jc w:val="center"/>
                   </w:pPr>
                   <w:r>
-                    <w:t xml:space="preserve">LLM / RAG</w:t>
-                  </w:r>
-                </w:p>
-              </w:tc>
-              <w:tc>
-                <w:tcPr/>
-                <w:p>
-                  <w:pPr>
-                    <w:pStyle w:val="Compact"/>
-                    <w:jc w:val="center"/>
-                  </w:pPr>
-                  <w:r>
-                    <w:t xml:space="preserve">Claude API, pgvector, tool-calling agent loop</w:t>
+                    <w:t xml:space="preserve">ML</w:t>
+                  </w:r>
+                </w:p>
+              </w:tc>
+              <w:tc>
+                <w:tcPr/>
+                <w:p>
+                  <w:pPr>
+                    <w:pStyle w:val="Compact"/>
+                    <w:jc w:val="center"/>
+                  </w:pPr>
+                  <w:r>
+                    <w:t xml:space="preserve">scikit-learn, XGBoost, Spark ML, MLflow, SHAP</w:t>
                   </w:r>
                 </w:p>
               </w:tc>
@@ -3268,19 +2959,19 @@
                     <w:jc w:val="center"/>
                   </w:pPr>
                   <w:r>
-                    <w:t xml:space="preserve">Serving / UI</w:t>
-                  </w:r>
-                </w:p>
-              </w:tc>
-              <w:tc>
-                <w:tcPr/>
-                <w:p>
-                  <w:pPr>
-                    <w:pStyle w:val="Compact"/>
-                    <w:jc w:val="center"/>
-                  </w:pPr>
-                  <w:r>
-                    <w:t xml:space="preserve">FastAPI, Dash / Plotly</w:t>
+                    <w:t xml:space="preserve">AI orchestration</w:t>
+                  </w:r>
+                </w:p>
+              </w:tc>
+              <w:tc>
+                <w:tcPr/>
+                <w:p>
+                  <w:pPr>
+                    <w:pStyle w:val="Compact"/>
+                    <w:jc w:val="center"/>
+                  </w:pPr>
+                  <w:r>
+                    <w:t xml:space="preserve">LangGraph constrained workflow with read-only tool calling</w:t>
                   </w:r>
                 </w:p>
               </w:tc>
@@ -3294,19 +2985,19 @@
                     <w:jc w:val="center"/>
                   </w:pPr>
                   <w:r>
-                    <w:t xml:space="preserve">Orchestration</w:t>
-                  </w:r>
-                </w:p>
-              </w:tc>
-              <w:tc>
-                <w:tcPr/>
-                <w:p>
-                  <w:pPr>
-                    <w:pStyle w:val="Compact"/>
-                    <w:jc w:val="center"/>
-                  </w:pPr>
-                  <w:r>
-                    <w:t xml:space="preserve">Prefect</w:t>
+                    <w:t xml:space="preserve">LLM / RAG</w:t>
+                  </w:r>
+                </w:p>
+              </w:tc>
+              <w:tc>
+                <w:tcPr/>
+                <w:p>
+                  <w:pPr>
+                    <w:pStyle w:val="Compact"/>
+                    <w:jc w:val="center"/>
+                  </w:pPr>
+                  <w:r>
+                    <w:t xml:space="preserve">Claude API or Amazon Bedrock; pgvector semantic retrieval</w:t>
                   </w:r>
                 </w:p>
               </w:tc>
@@ -3320,6 +3011,110 @@
                     <w:jc w:val="center"/>
                   </w:pPr>
                   <w:r>
+                    <w:t xml:space="preserve">Agent tools</w:t>
+                  </w:r>
+                </w:p>
+              </w:tc>
+              <w:tc>
+                <w:tcPr/>
+                <w:p>
+                  <w:pPr>
+                    <w:pStyle w:val="Compact"/>
+                    <w:jc w:val="center"/>
+                  </w:pPr>
+                  <w:r>
+                    <w:t xml:space="preserve">Document search, operational-data query, model inference, SHAP explanation, event reconstruction</w:t>
+                  </w:r>
+                </w:p>
+              </w:tc>
+            </w:tr>
+            <w:tr>
+              <w:tc>
+                <w:tcPr/>
+                <w:p>
+                  <w:pPr>
+                    <w:pStyle w:val="Compact"/>
+                    <w:jc w:val="center"/>
+                  </w:pPr>
+                  <w:r>
+                    <w:t xml:space="preserve">Serving / UI</w:t>
+                  </w:r>
+                </w:p>
+              </w:tc>
+              <w:tc>
+                <w:tcPr/>
+                <w:p>
+                  <w:pPr>
+                    <w:pStyle w:val="Compact"/>
+                    <w:jc w:val="center"/>
+                  </w:pPr>
+                  <w:r>
+                    <w:t xml:space="preserve">FastAPI, Dash / Plotly</w:t>
+                  </w:r>
+                </w:p>
+              </w:tc>
+            </w:tr>
+            <w:tr>
+              <w:tc>
+                <w:tcPr/>
+                <w:p>
+                  <w:pPr>
+                    <w:pStyle w:val="Compact"/>
+                    <w:jc w:val="center"/>
+                  </w:pPr>
+                  <w:r>
+                    <w:t xml:space="preserve">Orchestration</w:t>
+                  </w:r>
+                </w:p>
+              </w:tc>
+              <w:tc>
+                <w:tcPr/>
+                <w:p>
+                  <w:pPr>
+                    <w:pStyle w:val="Compact"/>
+                    <w:jc w:val="center"/>
+                  </w:pPr>
+                  <w:r>
+                    <w:t xml:space="preserve">Prefect, Airflow or other</w:t>
+                  </w:r>
+                </w:p>
+              </w:tc>
+            </w:tr>
+            <w:tr>
+              <w:tc>
+                <w:tcPr/>
+                <w:p>
+                  <w:pPr>
+                    <w:pStyle w:val="Compact"/>
+                    <w:jc w:val="center"/>
+                  </w:pPr>
+                  <w:r>
+                    <w:t xml:space="preserve">Interoperability</w:t>
+                  </w:r>
+                </w:p>
+              </w:tc>
+              <w:tc>
+                <w:tcPr/>
+                <w:p>
+                  <w:pPr>
+                    <w:pStyle w:val="Compact"/>
+                    <w:jc w:val="center"/>
+                  </w:pPr>
+                  <w:r>
+                    <w:t xml:space="preserve">Optional read-only AeroFlux MCP server</w:t>
+                  </w:r>
+                </w:p>
+              </w:tc>
+            </w:tr>
+            <w:tr>
+              <w:tc>
+                <w:tcPr/>
+                <w:p>
+                  <w:pPr>
+                    <w:pStyle w:val="Compact"/>
+                    <w:jc w:val="center"/>
+                  </w:pPr>
+                  <w:r>
                     <w:t xml:space="preserve">Packaging / Platform</w:t>
                   </w:r>
                 </w:p>
@@ -3332,19 +3127,19 @@
                     <w:jc w:val="center"/>
                   </w:pPr>
                   <w:r>
-                    <w:t xml:space="preserve">Docker + Docker Compose; optional AWS EC2 + S3</w:t>
+                    <w:t xml:space="preserve">Docker Compose; optional AWS EC2, S3, and EMR Serverless</w:t>
                   </w:r>
                 </w:p>
               </w:tc>
             </w:tr>
           </w:tbl>
-          <w:bookmarkEnd w:id="34"/>
+          <w:bookmarkEnd w:id="17"/>
           <w:p/>
         </w:tc>
       </w:tr>
     </w:tbl>
-    <w:bookmarkEnd w:id="35"/>
-    <w:bookmarkStart w:id="37" w:name="project-tasks-and-timeline"/>
+    <w:bookmarkEnd w:id="18"/>
+    <w:bookmarkStart w:id="20" w:name="project-tasks-and-timeline"/>
     <w:p>
       <w:pPr>
         <w:pStyle w:val="Heading1"/>
@@ -3365,7 +3160,7 @@
           <w:rPr>
             <w:rStyle w:val="Hyperlink"/>
           </w:rPr>
-          <w:t xml:space="preserve">Table 4</w:t>
+          <w:t xml:space="preserve">Table 3</w:t>
         </w:r>
       </w:hyperlink>
       <w:r>
@@ -3409,7 +3204,7 @@
       <w:tr>
         <w:tc>
           <w:tcPr/>
-          <w:bookmarkStart w:id="36" w:name="tbl-timeline"/>
+          <w:bookmarkStart w:id="19" w:name="tbl-timeline"/>
           <w:p>
             <w:pPr>
               <w:jc w:val="center"/>
@@ -3420,7 +3215,7 @@
               <w:pStyle w:val="ImageCaption"/>
             </w:pPr>
             <w:r>
-              <w:t xml:space="preserve">Table 4: One-month project timeline and effort allocation.</w:t>
+              <w:t xml:space="preserve">Table 3: One-month project timeline and effort allocation.</w:t>
             </w:r>
           </w:p>
           <w:tbl>
@@ -3497,7 +3292,7 @@
                     <w:jc w:val="center"/>
                   </w:pPr>
                   <w:r>
-                    <w:t xml:space="preserve">Add weather source; Spark Structured Streaming pipeline; MongoDB silver store + TTL</w:t>
+                    <w:t xml:space="preserve">Complete streaming and weather integration; prepare MongoDB records, documentation corpus, and two or three historical investigation scenarios</w:t>
                   </w:r>
                 </w:p>
               </w:tc>
@@ -3535,7 +3330,7 @@
                     <w:jc w:val="center"/>
                   </w:pPr>
                   <w:r>
-                    <w:t xml:space="preserve">Feature engineering (propagation, demand, weather); gold dataset; baseline vs. advanced training; MLflow; evaluation</w:t>
+                    <w:t xml:space="preserve">Feature engineering; baseline and advanced model evaluation; MLflow tracking; SHAP explanation service</w:t>
                   </w:r>
                 </w:p>
               </w:tc>
@@ -3573,7 +3368,7 @@
                     <w:jc w:val="center"/>
                   </w:pPr>
                   <w:r>
-                    <w:t xml:space="preserve">FastAPI inference API + SHAP; pgvector RAG; analyst agent + tools</w:t>
+                    <w:t xml:space="preserve">Build pgvector retrieval pipeline and LangGraph analyst workflow; implement document-search, flight-query, prediction, explanation, and event-reconstruction tools</w:t>
                   </w:r>
                 </w:p>
               </w:tc>
@@ -3611,7 +3406,7 @@
                     <w:jc w:val="center"/>
                   </w:pPr>
                   <w:r>
-                    <w:t xml:space="preserve">Integration, UI wiring, system + predictive evaluation, demo, write-up; buffer</w:t>
+                    <w:t xml:space="preserve">Integrate the analyst UI; create agent evaluation cases; measure groundedness, tool selection, latency, and predictive/system performance; complete demonstration and write-up</w:t>
                   </w:r>
                 </w:p>
               </w:tc>
@@ -3629,13 +3424,13 @@
               </w:tc>
             </w:tr>
           </w:tbl>
-          <w:bookmarkEnd w:id="36"/>
+          <w:bookmarkEnd w:id="19"/>
           <w:p/>
         </w:tc>
       </w:tr>
     </w:tbl>
-    <w:bookmarkEnd w:id="37"/>
-    <w:bookmarkStart w:id="53" w:name="references"/>
+    <w:bookmarkEnd w:id="20"/>
+    <w:bookmarkStart w:id="61" w:name="references"/>
     <w:p>
       <w:pPr>
         <w:pStyle w:val="Heading1"/>
@@ -3644,14 +3439,14 @@
         <w:t xml:space="preserve">References</w:t>
       </w:r>
     </w:p>
-    <w:bookmarkStart w:id="52" w:name="refs"/>
-    <w:bookmarkStart w:id="38" w:name="ref-albassam2025flight"/>
+    <w:bookmarkStart w:id="60" w:name="refs"/>
+    <w:bookmarkStart w:id="22" w:name="ref-airspaceIntelligencePrescience"/>
     <w:p>
       <w:pPr>
         <w:pStyle w:val="Bibliography"/>
       </w:pPr>
       <w:r>
-        <w:t xml:space="preserve">AlBassam, S. A. A., &amp; AlShahrani, D. N. (2025). Flight delay prediction: Evaluating machine learning algorithms for enhanced accuracy.</w:t>
+        <w:t xml:space="preserve">Airspace Intelligence. ({n.d.}).</w:t>
       </w:r>
       <w:r>
         <w:t xml:space="preserve"> </w:t>
@@ -3661,35 +3456,13 @@
           <w:i/>
           <w:iCs/>
         </w:rPr>
-        <w:t xml:space="preserve">PLOS ONE</w:t>
-      </w:r>
-      <w:r>
-        <w:t xml:space="preserve">,</w:t>
-      </w:r>
-      <w:r>
-        <w:t xml:space="preserve"> </w:t>
+        <w:t xml:space="preserve">PRESCIENCE</w:t>
       </w:r>
       <w:r>
         <w:rPr>
           <w:i/>
           <w:iCs/>
         </w:rPr>
-        <w:t xml:space="preserve">20</w:t>
-      </w:r>
-      <w:r>
-        <w:t xml:space="preserve">(12), e0335141.</w:t>
-      </w:r>
-    </w:p>
-    <w:bookmarkEnd w:id="38"/>
-    <w:bookmarkStart w:id="39" w:name="ref-beatty1999preliminary"/>
-    <w:p>
-      <w:pPr>
-        <w:pStyle w:val="Bibliography"/>
-      </w:pPr>
-      <w:r>
-        <w:t xml:space="preserve">Beatty, R., Hsu, R., Berry, L., &amp; Rome, J. (1999). Preliminary evaluation of flight delay propagation through an airline schedule.</w:t>
-      </w:r>
-      <w:r>
         <w:t xml:space="preserve"> </w:t>
       </w:r>
       <w:r>
@@ -3697,10 +3470,31 @@
           <w:i/>
           <w:iCs/>
         </w:rPr>
-        <w:t xml:space="preserve">Air Traffic Control Quarterly</w:t>
-      </w:r>
-      <w:r>
-        <w:t xml:space="preserve">,</w:t>
+        <w:t xml:space="preserve">platform</w:t>
+      </w:r>
+      <w:r>
+        <w:t xml:space="preserve">.</w:t>
+      </w:r>
+      <w:r>
+        <w:t xml:space="preserve"> </w:t>
+      </w:r>
+      <w:hyperlink r:id="rId21">
+        <w:r>
+          <w:rPr>
+            <w:rStyle w:val="Hyperlink"/>
+          </w:rPr>
+          <w:t xml:space="preserve">https://www.airspace-intelligence.com/platform</w:t>
+        </w:r>
+      </w:hyperlink>
+    </w:p>
+    <w:bookmarkEnd w:id="22"/>
+    <w:bookmarkStart w:id="23" w:name="ref-albassam2025flight"/>
+    <w:p>
+      <w:pPr>
+        <w:pStyle w:val="Bibliography"/>
+      </w:pPr>
+      <w:r>
+        <w:t xml:space="preserve">AlBassam, S. A. A., &amp; AlShahrani, D. N. (2025). Flight delay prediction: Evaluating machine learning algorithms for enhanced accuracy.</w:t>
       </w:r>
       <w:r>
         <w:t xml:space="preserve"> </w:t>
@@ -3710,20 +3504,10 @@
           <w:i/>
           <w:iCs/>
         </w:rPr>
-        <w:t xml:space="preserve">7</w:t>
-      </w:r>
-      <w:r>
-        <w:t xml:space="preserve">(4), 259–270.</w:t>
-      </w:r>
-    </w:p>
-    <w:bookmarkEnd w:id="39"/>
-    <w:bookmarkStart w:id="40" w:name="ref-belcastro2016flight"/>
-    <w:p>
-      <w:pPr>
-        <w:pStyle w:val="Bibliography"/>
-      </w:pPr>
-      <w:r>
-        <w:t xml:space="preserve">Belcastro, L., Marozzo, F., Talia, D., &amp; Trunfio, P. (2016). Using scalable data mining for predicting flight delays.</w:t>
+        <w:t xml:space="preserve">PLOS ONE</w:t>
+      </w:r>
+      <w:r>
+        <w:t xml:space="preserve">,</w:t>
       </w:r>
       <w:r>
         <w:t xml:space="preserve"> </w:t>
@@ -3733,10 +3517,20 @@
           <w:i/>
           <w:iCs/>
         </w:rPr>
-        <w:t xml:space="preserve">ACM Transactions on Intelligent Systems and Technology</w:t>
-      </w:r>
-      <w:r>
-        <w:t xml:space="preserve">,</w:t>
+        <w:t xml:space="preserve">20</w:t>
+      </w:r>
+      <w:r>
+        <w:t xml:space="preserve">(12), e0335141.</w:t>
+      </w:r>
+    </w:p>
+    <w:bookmarkEnd w:id="23"/>
+    <w:bookmarkStart w:id="25" w:name="ref-amadeusFlightOps"/>
+    <w:p>
+      <w:pPr>
+        <w:pStyle w:val="Bibliography"/>
+      </w:pPr>
+      <w:r>
+        <w:t xml:space="preserve">Amadeus. ({n.d.}).</w:t>
       </w:r>
       <w:r>
         <w:t xml:space="preserve"> </w:t>
@@ -3746,29 +3540,31 @@
           <w:i/>
           <w:iCs/>
         </w:rPr>
-        <w:t xml:space="preserve">8</w:t>
-      </w:r>
-      <w:r>
-        <w:t xml:space="preserve">(1), 1–20.</w:t>
-      </w:r>
-    </w:p>
-    <w:bookmarkEnd w:id="40"/>
-    <w:bookmarkStart w:id="41" w:name="ref-chen2016xgboost"/>
+        <w:t xml:space="preserve">Flight operations control</w:t>
+      </w:r>
+      <w:r>
+        <w:t xml:space="preserve">.</w:t>
+      </w:r>
+      <w:r>
+        <w:t xml:space="preserve"> </w:t>
+      </w:r>
+      <w:hyperlink r:id="rId24">
+        <w:r>
+          <w:rPr>
+            <w:rStyle w:val="Hyperlink"/>
+          </w:rPr>
+          <w:t xml:space="preserve">https://amadeus.com/en/airlines/products/flight-operations-control</w:t>
+        </w:r>
+      </w:hyperlink>
+    </w:p>
+    <w:bookmarkEnd w:id="25"/>
+    <w:bookmarkStart w:id="27" w:name="ref-assaia_apronai"/>
     <w:p>
       <w:pPr>
         <w:pStyle w:val="Bibliography"/>
       </w:pPr>
       <w:r>
-        <w:t xml:space="preserve">Chen, T., &amp; Guestrin, C. (2016).</w:t>
-      </w:r>
-      <w:r>
-        <w:t xml:space="preserve"> </w:t>
-      </w:r>
-      <w:r>
-        <w:t xml:space="preserve">XGBoost</w:t>
-      </w:r>
-      <w:r>
-        <w:t xml:space="preserve">: A scalable tree boosting system.</w:t>
+        <w:t xml:space="preserve">Assaia International AG. (n.d.).</w:t>
       </w:r>
       <w:r>
         <w:t xml:space="preserve"> </w:t>
@@ -3778,33 +3574,38 @@
           <w:i/>
           <w:iCs/>
         </w:rPr>
-        <w:t xml:space="preserve">Proceedings of the 22nd ACM SIGKDD International Conference on Knowledge Discovery and Data Mining</w:t>
-      </w:r>
-      <w:r>
-        <w:t xml:space="preserve">, 785–794.</w:t>
-      </w:r>
-    </w:p>
-    <w:bookmarkEnd w:id="41"/>
-    <w:bookmarkStart w:id="42" w:name="ref-kafle2016propagation"/>
-    <w:p>
-      <w:pPr>
-        <w:pStyle w:val="Bibliography"/>
-      </w:pPr>
-      <w:r>
-        <w:t xml:space="preserve">Kafle, N., &amp; Zou, B. (2016). Modeling flight delay propagation: A new analytical-econometric approach.</w:t>
-      </w:r>
-      <w:r>
-        <w:t xml:space="preserve"> </w:t>
+        <w:t xml:space="preserve">ApronAI</w:t>
       </w:r>
       <w:r>
         <w:rPr>
           <w:i/>
           <w:iCs/>
         </w:rPr>
-        <w:t xml:space="preserve">Transportation Research Part B: Methodological</w:t>
-      </w:r>
-      <w:r>
-        <w:t xml:space="preserve">,</w:t>
+        <w:t xml:space="preserve">: Real-time visibility and predictive alerting for turnaround operations</w:t>
+      </w:r>
+      <w:r>
+        <w:t xml:space="preserve">.</w:t>
+      </w:r>
+      <w:r>
+        <w:t xml:space="preserve"> </w:t>
+      </w:r>
+      <w:hyperlink r:id="rId26">
+        <w:r>
+          <w:rPr>
+            <w:rStyle w:val="Hyperlink"/>
+          </w:rPr>
+          <w:t xml:space="preserve">https://www.assaia.com/solutions/apron-ai</w:t>
+        </w:r>
+      </w:hyperlink>
+    </w:p>
+    <w:bookmarkEnd w:id="27"/>
+    <w:bookmarkStart w:id="28" w:name="ref-beatty1999preliminary"/>
+    <w:p>
+      <w:pPr>
+        <w:pStyle w:val="Bibliography"/>
+      </w:pPr>
+      <w:r>
+        <w:t xml:space="preserve">Beatty, R., Hsu, R., Berry, L., &amp; Rome, J. (1999). Preliminary evaluation of flight delay propagation through an airline schedule.</w:t>
       </w:r>
       <w:r>
         <w:t xml:space="preserve"> </w:t>
@@ -3814,32 +3615,10 @@
           <w:i/>
           <w:iCs/>
         </w:rPr>
-        <w:t xml:space="preserve">93</w:t>
-      </w:r>
-      <w:r>
-        <w:t xml:space="preserve">, 520–542.</w:t>
-      </w:r>
-    </w:p>
-    <w:bookmarkEnd w:id="42"/>
-    <w:bookmarkStart w:id="43" w:name="ref-lewis2020rag"/>
-    <w:p>
-      <w:pPr>
-        <w:pStyle w:val="Bibliography"/>
-      </w:pPr>
-      <w:r>
-        <w:t xml:space="preserve">Lewis, P., Perez, E., Piktus, A., Petroni, F., Karpukhin, V., Goyal, N., Küttler, H., Lewis, M., Yih, W., Rocktäschel, T., Riedel, S., &amp; Kiela, D. (2020). Retrieval-augmented generation for knowledge-intensive</w:t>
-      </w:r>
-      <w:r>
-        <w:t xml:space="preserve"> </w:t>
-      </w:r>
-      <w:r>
-        <w:t xml:space="preserve">NLP</w:t>
-      </w:r>
-      <w:r>
-        <w:t xml:space="preserve"> </w:t>
-      </w:r>
-      <w:r>
-        <w:t xml:space="preserve">tasks.</w:t>
+        <w:t xml:space="preserve">Air Traffic Control Quarterly</w:t>
+      </w:r>
+      <w:r>
+        <w:t xml:space="preserve">,</w:t>
       </w:r>
       <w:r>
         <w:t xml:space="preserve"> </w:t>
@@ -3849,20 +3628,20 @@
           <w:i/>
           <w:iCs/>
         </w:rPr>
-        <w:t xml:space="preserve">Advances in Neural Information Processing Systems 33</w:t>
-      </w:r>
-      <w:r>
-        <w:t xml:space="preserve">, 9459–9474.</w:t>
-      </w:r>
-    </w:p>
-    <w:bookmarkEnd w:id="43"/>
-    <w:bookmarkStart w:id="44" w:name="ref-lundberg2017shap"/>
+        <w:t xml:space="preserve">7</w:t>
+      </w:r>
+      <w:r>
+        <w:t xml:space="preserve">(4), 259–270.</w:t>
+      </w:r>
+    </w:p>
+    <w:bookmarkEnd w:id="28"/>
+    <w:bookmarkStart w:id="29" w:name="ref-belcastro2016flight"/>
     <w:p>
       <w:pPr>
         <w:pStyle w:val="Bibliography"/>
       </w:pPr>
       <w:r>
-        <w:t xml:space="preserve">Lundberg, S. M., &amp; Lee, S.-I. (2017). A unified approach to interpreting model predictions.</w:t>
+        <w:t xml:space="preserve">Belcastro, L., Marozzo, F., Talia, D., &amp; Trunfio, P. (2016). Using scalable data mining for predicting flight delays.</w:t>
       </w:r>
       <w:r>
         <w:t xml:space="preserve"> </w:t>
@@ -3872,20 +3651,10 @@
           <w:i/>
           <w:iCs/>
         </w:rPr>
-        <w:t xml:space="preserve">Advances in Neural Information Processing Systems 30</w:t>
-      </w:r>
-      <w:r>
-        <w:t xml:space="preserve">, 4765–4774.</w:t>
-      </w:r>
-    </w:p>
-    <w:bookmarkEnd w:id="44"/>
-    <w:bookmarkStart w:id="46" w:name="ref-nasa2021atd2fuser"/>
-    <w:p>
-      <w:pPr>
-        <w:pStyle w:val="Bibliography"/>
-      </w:pPr>
-      <w:r>
-        <w:t xml:space="preserve">National Aeronautics and Space Administration. (2021).</w:t>
+        <w:t xml:space="preserve">ACM Transactions on Intelligent Systems and Technology</w:t>
+      </w:r>
+      <w:r>
+        <w:t xml:space="preserve">,</w:t>
       </w:r>
       <w:r>
         <w:t xml:space="preserve"> </w:t>
@@ -3895,20 +3664,399 @@
           <w:i/>
           <w:iCs/>
         </w:rPr>
-        <w:t xml:space="preserve">Airspace technology demonstration 2 (</w:t>
+        <w:t xml:space="preserve">8</w:t>
+      </w:r>
+      <w:r>
+        <w:t xml:space="preserve">(1), 1–20.</w:t>
+      </w:r>
+    </w:p>
+    <w:bookmarkEnd w:id="29"/>
+    <w:bookmarkStart w:id="30" w:name="ref-chen2016xgboost"/>
+    <w:p>
+      <w:pPr>
+        <w:pStyle w:val="Bibliography"/>
+      </w:pPr>
+      <w:r>
+        <w:t xml:space="preserve">Chen, T., &amp; Guestrin, C. (2016).</w:t>
+      </w:r>
+      <w:r>
+        <w:t xml:space="preserve"> </w:t>
+      </w:r>
+      <w:r>
+        <w:t xml:space="preserve">XGBoost</w:t>
+      </w:r>
+      <w:r>
+        <w:t xml:space="preserve">: A scalable tree boosting system.</w:t>
+      </w:r>
+      <w:r>
+        <w:t xml:space="preserve"> </w:t>
       </w:r>
       <w:r>
         <w:rPr>
           <w:i/>
           <w:iCs/>
         </w:rPr>
-        <w:t xml:space="preserve">ATD-2</w:t>
+        <w:t xml:space="preserve">Proceedings of the 22nd ACM SIGKDD International Conference on Knowledge Discovery and Data Mining</w:t>
+      </w:r>
+      <w:r>
+        <w:t xml:space="preserve">, 785–794.</w:t>
+      </w:r>
+    </w:p>
+    <w:bookmarkEnd w:id="30"/>
+    <w:bookmarkStart w:id="32" w:name="ref-faa_tfdm_2020"/>
+    <w:p>
+      <w:pPr>
+        <w:pStyle w:val="Bibliography"/>
+      </w:pPr>
+      <w:r>
+        <w:t xml:space="preserve">Federal Aviation Administration. (2020).</w:t>
+      </w:r>
+      <w:r>
+        <w:t xml:space="preserve"> </w:t>
       </w:r>
       <w:r>
         <w:rPr>
           <w:i/>
           <w:iCs/>
         </w:rPr>
+        <w:t xml:space="preserve">TFDM</w:t>
+      </w:r>
+      <w:r>
+        <w:rPr>
+          <w:i/>
+          <w:iCs/>
+        </w:rPr>
+        <w:t xml:space="preserve"> </w:t>
+      </w:r>
+      <w:r>
+        <w:rPr>
+          <w:i/>
+          <w:iCs/>
+        </w:rPr>
+        <w:t xml:space="preserve">capabilities</w:t>
+      </w:r>
+      <w:r>
+        <w:t xml:space="preserve">. U.S. Department of Transportation.</w:t>
+      </w:r>
+      <w:r>
+        <w:t xml:space="preserve"> </w:t>
+      </w:r>
+      <w:hyperlink r:id="rId31">
+        <w:r>
+          <w:rPr>
+            <w:rStyle w:val="Hyperlink"/>
+          </w:rPr>
+          <w:t xml:space="preserve">https://www.faa.gov/air_traffic/technology/tfdm/capabilities</w:t>
+        </w:r>
+      </w:hyperlink>
+    </w:p>
+    <w:bookmarkEnd w:id="32"/>
+    <w:bookmarkStart w:id="34" w:name="ref-faa2024airoadmap"/>
+    <w:p>
+      <w:pPr>
+        <w:pStyle w:val="Bibliography"/>
+      </w:pPr>
+      <w:r>
+        <w:t xml:space="preserve">Federal Aviation Administration. (2024a).</w:t>
+      </w:r>
+      <w:r>
+        <w:t xml:space="preserve"> </w:t>
+      </w:r>
+      <w:r>
+        <w:rPr>
+          <w:i/>
+          <w:iCs/>
+        </w:rPr>
+        <w:t xml:space="preserve">Roadmap for artificial intelligence safety assurance</w:t>
+      </w:r>
+      <w:r>
+        <w:t xml:space="preserve">. Federal Aviation Administration.</w:t>
+      </w:r>
+      <w:r>
+        <w:t xml:space="preserve"> </w:t>
+      </w:r>
+      <w:hyperlink r:id="rId33">
+        <w:r>
+          <w:rPr>
+            <w:rStyle w:val="Hyperlink"/>
+          </w:rPr>
+          <w:t xml:space="preserve">https://www.faa.gov/media/82891</w:t>
+        </w:r>
+      </w:hyperlink>
+    </w:p>
+    <w:bookmarkEnd w:id="34"/>
+    <w:bookmarkStart w:id="36" w:name="ref-faa_nextgen_2024"/>
+    <w:p>
+      <w:pPr>
+        <w:pStyle w:val="Bibliography"/>
+      </w:pPr>
+      <w:r>
+        <w:t xml:space="preserve">Federal Aviation Administration. (2024b).</w:t>
+      </w:r>
+      <w:r>
+        <w:t xml:space="preserve"> </w:t>
+      </w:r>
+      <w:r>
+        <w:rPr>
+          <w:i/>
+          <w:iCs/>
+        </w:rPr>
+        <w:t xml:space="preserve">NextGen</w:t>
+      </w:r>
+      <w:r>
+        <w:t xml:space="preserve">. U.S. Department of Transportation.</w:t>
+      </w:r>
+      <w:r>
+        <w:t xml:space="preserve"> </w:t>
+      </w:r>
+      <w:hyperlink r:id="rId35">
+        <w:r>
+          <w:rPr>
+            <w:rStyle w:val="Hyperlink"/>
+          </w:rPr>
+          <w:t xml:space="preserve">https://www.faa.gov/newsroom/nextgen</w:t>
+        </w:r>
+      </w:hyperlink>
+    </w:p>
+    <w:bookmarkEnd w:id="36"/>
+    <w:bookmarkStart w:id="38" w:name="ref-flightawareForesight"/>
+    <w:p>
+      <w:pPr>
+        <w:pStyle w:val="Bibliography"/>
+      </w:pPr>
+      <w:r>
+        <w:t xml:space="preserve">FlightAware. ({n.d.}).</w:t>
+      </w:r>
+      <w:r>
+        <w:t xml:space="preserve"> </w:t>
+      </w:r>
+      <w:r>
+        <w:rPr>
+          <w:i/>
+          <w:iCs/>
+        </w:rPr>
+        <w:t xml:space="preserve">FlightAware foresight predictive flight tracking</w:t>
+      </w:r>
+      <w:r>
+        <w:t xml:space="preserve">.</w:t>
+      </w:r>
+      <w:r>
+        <w:t xml:space="preserve"> </w:t>
+      </w:r>
+      <w:hyperlink r:id="rId37">
+        <w:r>
+          <w:rPr>
+            <w:rStyle w:val="Hyperlink"/>
+          </w:rPr>
+          <w:t xml:space="preserve">https://uk.flightaware.com/commercial/foresight/</w:t>
+        </w:r>
+      </w:hyperlink>
+    </w:p>
+    <w:bookmarkEnd w:id="38"/>
+    <w:bookmarkStart w:id="39" w:name="ref-kafle2016propagation"/>
+    <w:p>
+      <w:pPr>
+        <w:pStyle w:val="Bibliography"/>
+      </w:pPr>
+      <w:r>
+        <w:t xml:space="preserve">Kafle, N., &amp; Zou, B. (2016). Modeling flight delay propagation: A new analytical-econometric approach.</w:t>
+      </w:r>
+      <w:r>
+        <w:t xml:space="preserve"> </w:t>
+      </w:r>
+      <w:r>
+        <w:rPr>
+          <w:i/>
+          <w:iCs/>
+        </w:rPr>
+        <w:t xml:space="preserve">Transportation Research Part B: Methodological</w:t>
+      </w:r>
+      <w:r>
+        <w:t xml:space="preserve">,</w:t>
+      </w:r>
+      <w:r>
+        <w:t xml:space="preserve"> </w:t>
+      </w:r>
+      <w:r>
+        <w:rPr>
+          <w:i/>
+          <w:iCs/>
+        </w:rPr>
+        <w:t xml:space="preserve">93</w:t>
+      </w:r>
+      <w:r>
+        <w:t xml:space="preserve">, 520–542.</w:t>
+      </w:r>
+    </w:p>
+    <w:bookmarkEnd w:id="39"/>
+    <w:bookmarkStart w:id="41" w:name="ref-lauderdale2024nasDigitalTwin"/>
+    <w:p>
+      <w:pPr>
+        <w:pStyle w:val="Bibliography"/>
+      </w:pPr>
+      <w:r>
+        <w:t xml:space="preserve">Lauderdale, T. A., Windhorst, R. D., Coppenbarger, R. A., Thipphavong, D. P., &amp; Erzberger, H. (2024). Overview of the national airspace system</w:t>
+      </w:r>
+      <w:r>
+        <w:t xml:space="preserve"> </w:t>
+      </w:r>
+      <w:r>
+        <w:t xml:space="preserve">(NAS)</w:t>
+      </w:r>
+      <w:r>
+        <w:t xml:space="preserve"> </w:t>
+      </w:r>
+      <w:r>
+        <w:t xml:space="preserve">digital twin simulation environment.</w:t>
+      </w:r>
+      <w:r>
+        <w:t xml:space="preserve"> </w:t>
+      </w:r>
+      <w:r>
+        <w:rPr>
+          <w:i/>
+          <w:iCs/>
+        </w:rPr>
+        <w:t xml:space="preserve">AIAA AVIATION Forum and ASCEND 2024</w:t>
+      </w:r>
+      <w:r>
+        <w:t xml:space="preserve">.</w:t>
+      </w:r>
+      <w:r>
+        <w:t xml:space="preserve"> </w:t>
+      </w:r>
+      <w:hyperlink r:id="rId40">
+        <w:r>
+          <w:rPr>
+            <w:rStyle w:val="Hyperlink"/>
+          </w:rPr>
+          <w:t xml:space="preserve">https://doi.org/10.2514/6.2024-4011</w:t>
+        </w:r>
+      </w:hyperlink>
+    </w:p>
+    <w:bookmarkEnd w:id="41"/>
+    <w:bookmarkStart w:id="42" w:name="ref-lewis2020rag"/>
+    <w:p>
+      <w:pPr>
+        <w:pStyle w:val="Bibliography"/>
+      </w:pPr>
+      <w:r>
+        <w:t xml:space="preserve">Lewis, P., Perez, E., Piktus, A., Petroni, F., Karpukhin, V., Goyal, N., Küttler, H., Lewis, M., Yih, W., Rocktäschel, T., Riedel, S., &amp; Kiela, D. (2020). Retrieval-augmented generation for knowledge-intensive</w:t>
+      </w:r>
+      <w:r>
+        <w:t xml:space="preserve"> </w:t>
+      </w:r>
+      <w:r>
+        <w:t xml:space="preserve">NLP</w:t>
+      </w:r>
+      <w:r>
+        <w:t xml:space="preserve"> </w:t>
+      </w:r>
+      <w:r>
+        <w:t xml:space="preserve">tasks.</w:t>
+      </w:r>
+      <w:r>
+        <w:t xml:space="preserve"> </w:t>
+      </w:r>
+      <w:r>
+        <w:rPr>
+          <w:i/>
+          <w:iCs/>
+        </w:rPr>
+        <w:t xml:space="preserve">Advances in Neural Information Processing Systems 33</w:t>
+      </w:r>
+      <w:r>
+        <w:t xml:space="preserve">, 9459–9474.</w:t>
+      </w:r>
+    </w:p>
+    <w:bookmarkEnd w:id="42"/>
+    <w:bookmarkStart w:id="44" w:name="ref-lufthansa2025aiocc"/>
+    <w:p>
+      <w:pPr>
+        <w:pStyle w:val="Bibliography"/>
+      </w:pPr>
+      <w:r>
+        <w:t xml:space="preserve">Lufthansa Systems. (2025).</w:t>
+      </w:r>
+      <w:r>
+        <w:t xml:space="preserve"> </w:t>
+      </w:r>
+      <w:r>
+        <w:rPr>
+          <w:i/>
+          <w:iCs/>
+        </w:rPr>
+        <w:t xml:space="preserve">NetLine/Ops++ aiOCC</w:t>
+      </w:r>
+      <w:r>
+        <w:t xml:space="preserve">.</w:t>
+      </w:r>
+      <w:r>
+        <w:t xml:space="preserve"> </w:t>
+      </w:r>
+      <w:hyperlink r:id="rId43">
+        <w:r>
+          <w:rPr>
+            <w:rStyle w:val="Hyperlink"/>
+          </w:rPr>
+          <w:t xml:space="preserve">https://cdn.lhsystems.com/2025-02/2025_02_Product_information_NetLine_Ops_%2B%2B_aiOCC.pdf</w:t>
+        </w:r>
+      </w:hyperlink>
+    </w:p>
+    <w:bookmarkEnd w:id="44"/>
+    <w:bookmarkStart w:id="45" w:name="ref-lundberg2017shap"/>
+    <w:p>
+      <w:pPr>
+        <w:pStyle w:val="Bibliography"/>
+      </w:pPr>
+      <w:r>
+        <w:t xml:space="preserve">Lundberg, S. M., &amp; Lee, S.-I. (2017). A unified approach to interpreting model predictions.</w:t>
+      </w:r>
+      <w:r>
+        <w:t xml:space="preserve"> </w:t>
+      </w:r>
+      <w:r>
+        <w:rPr>
+          <w:i/>
+          <w:iCs/>
+        </w:rPr>
+        <w:t xml:space="preserve">Advances in Neural Information Processing Systems 30</w:t>
+      </w:r>
+      <w:r>
+        <w:t xml:space="preserve">, 4765–4774.</w:t>
+      </w:r>
+    </w:p>
+    <w:bookmarkEnd w:id="45"/>
+    <w:bookmarkStart w:id="47" w:name="ref-nasa2021atd2fuser"/>
+    <w:p>
+      <w:pPr>
+        <w:pStyle w:val="Bibliography"/>
+      </w:pPr>
+      <w:r>
+        <w:t xml:space="preserve">National Aeronautics and Space Administration. (2021).</w:t>
+      </w:r>
+      <w:r>
+        <w:t xml:space="preserve"> </w:t>
+      </w:r>
+      <w:r>
+        <w:rPr>
+          <w:i/>
+          <w:iCs/>
+        </w:rPr>
+        <w:t xml:space="preserve">Airspace technology demonstration 2 (</w:t>
+      </w:r>
+      <w:r>
+        <w:rPr>
+          <w:i/>
+          <w:iCs/>
+        </w:rPr>
+        <w:t xml:space="preserve">ATD-2</w:t>
+      </w:r>
+      <w:r>
+        <w:rPr>
+          <w:i/>
+          <w:iCs/>
+        </w:rPr>
         <w:t xml:space="preserve">) fuser</w:t>
       </w:r>
       <w:r>
@@ -3917,7 +4065,7 @@
       <w:r>
         <w:t xml:space="preserve"> </w:t>
       </w:r>
-      <w:hyperlink r:id="rId45">
+      <w:hyperlink r:id="rId46">
         <w:r>
           <w:rPr>
             <w:rStyle w:val="Hyperlink"/>
@@ -3926,35 +4074,38 @@
         </w:r>
       </w:hyperlink>
     </w:p>
-    <w:bookmarkEnd w:id="46"/>
-    <w:bookmarkStart w:id="47" w:name="ref-schaefer2014opensky"/>
+    <w:bookmarkEnd w:id="47"/>
+    <w:bookmarkStart w:id="49" w:name="ref-pepper2026probabilisticTwin"/>
     <w:p>
       <w:pPr>
         <w:pStyle w:val="Bibliography"/>
       </w:pPr>
       <w:r>
-        <w:t xml:space="preserve">Schäfer, M., Strohmeier, M., Lenders, V., Martinovic, I., &amp; Wilhelm, M. (2014). Bringing up</w:t>
-      </w:r>
-      <w:r>
-        <w:t xml:space="preserve"> </w:t>
-      </w:r>
-      <w:r>
-        <w:t xml:space="preserve">OpenSky</w:t>
-      </w:r>
-      <w:r>
-        <w:t xml:space="preserve">: A large-scale</w:t>
-      </w:r>
-      <w:r>
-        <w:t xml:space="preserve"> </w:t>
-      </w:r>
-      <w:r>
-        <w:t xml:space="preserve">ADS-B</w:t>
-      </w:r>
-      <w:r>
-        <w:t xml:space="preserve"> </w:t>
-      </w:r>
-      <w:r>
-        <w:t xml:space="preserve">sensor network for research.</w:t>
+        <w:t xml:space="preserve">Pepper, N., Keane, A., Hodgkin, A., Gould, D., Henderson, E., Lauritsen, L., Vlahos, C., De Ath, G., Everson, R., Cannon, R., Sierra Castro, A., Korna, J., Carvell, B., &amp; Thomas, M. (2026). A probabilistic digital twin of</w:t>
+      </w:r>
+      <w:r>
+        <w:t xml:space="preserve"> </w:t>
+      </w:r>
+      <w:r>
+        <w:t xml:space="preserve">UK</w:t>
+      </w:r>
+      <w:r>
+        <w:t xml:space="preserve"> </w:t>
+      </w:r>
+      <w:r>
+        <w:t xml:space="preserve">en route airspace for training and evaluating</w:t>
+      </w:r>
+      <w:r>
+        <w:t xml:space="preserve"> </w:t>
+      </w:r>
+      <w:r>
+        <w:t xml:space="preserve">AI</w:t>
+      </w:r>
+      <w:r>
+        <w:t xml:space="preserve"> </w:t>
+      </w:r>
+      <w:r>
+        <w:t xml:space="preserve">agents for air traffic control.</w:t>
       </w:r>
       <w:r>
         <w:t xml:space="preserve"> </w:t>
@@ -3964,20 +4115,31 @@
           <w:i/>
           <w:iCs/>
         </w:rPr>
-        <w:t xml:space="preserve">Proceedings of the 13th International Symposium on Information Processing in Sensor Networks</w:t>
-      </w:r>
-      <w:r>
-        <w:t xml:space="preserve">, 83–94.</w:t>
-      </w:r>
-    </w:p>
-    <w:bookmarkEnd w:id="47"/>
-    <w:bookmarkStart w:id="49" w:name="ref-sternberg2017review"/>
+        <w:t xml:space="preserve">AIAA SciTech Forum</w:t>
+      </w:r>
+      <w:r>
+        <w:t xml:space="preserve">.</w:t>
+      </w:r>
+      <w:r>
+        <w:t xml:space="preserve"> </w:t>
+      </w:r>
+      <w:hyperlink r:id="rId48">
+        <w:r>
+          <w:rPr>
+            <w:rStyle w:val="Hyperlink"/>
+          </w:rPr>
+          <w:t xml:space="preserve">https://doi.org/10.2514/6.2026-1794</w:t>
+        </w:r>
+      </w:hyperlink>
+    </w:p>
+    <w:bookmarkEnd w:id="49"/>
+    <w:bookmarkStart w:id="51" w:name="ref-sabre_disruption_management"/>
     <w:p>
       <w:pPr>
         <w:pStyle w:val="Bibliography"/>
       </w:pPr>
       <w:r>
-        <w:t xml:space="preserve">Sternberg, A., Soares, J., Carvalho, D., &amp; Ogasawara, E. (2017).</w:t>
+        <w:t xml:space="preserve">Sabre Corporation. (n.d.).</w:t>
       </w:r>
       <w:r>
         <w:t xml:space="preserve"> </w:t>
@@ -3987,6 +4149,167 @@
           <w:i/>
           <w:iCs/>
         </w:rPr>
+        <w:t xml:space="preserve">Airline disruption management software</w:t>
+      </w:r>
+      <w:r>
+        <w:t xml:space="preserve">.</w:t>
+      </w:r>
+      <w:r>
+        <w:t xml:space="preserve"> </w:t>
+      </w:r>
+      <w:hyperlink r:id="rId50">
+        <w:r>
+          <w:rPr>
+            <w:rStyle w:val="Hyperlink"/>
+          </w:rPr>
+          <w:t xml:space="preserve">https://www.sabre.com/airline-mosaic/service-suite/disruption-management/</w:t>
+        </w:r>
+      </w:hyperlink>
+    </w:p>
+    <w:bookmarkEnd w:id="51"/>
+    <w:bookmarkStart w:id="52" w:name="ref-schaefer2014opensky"/>
+    <w:p>
+      <w:pPr>
+        <w:pStyle w:val="Bibliography"/>
+      </w:pPr>
+      <w:r>
+        <w:t xml:space="preserve">Schäfer, M., Strohmeier, M., Lenders, V., Martinovic, I., &amp; Wilhelm, M. (2014). Bringing up</w:t>
+      </w:r>
+      <w:r>
+        <w:t xml:space="preserve"> </w:t>
+      </w:r>
+      <w:r>
+        <w:t xml:space="preserve">OpenSky</w:t>
+      </w:r>
+      <w:r>
+        <w:t xml:space="preserve">: A large-scale</w:t>
+      </w:r>
+      <w:r>
+        <w:t xml:space="preserve"> </w:t>
+      </w:r>
+      <w:r>
+        <w:t xml:space="preserve">ADS-B</w:t>
+      </w:r>
+      <w:r>
+        <w:t xml:space="preserve"> </w:t>
+      </w:r>
+      <w:r>
+        <w:t xml:space="preserve">sensor network for research.</w:t>
+      </w:r>
+      <w:r>
+        <w:t xml:space="preserve"> </w:t>
+      </w:r>
+      <w:r>
+        <w:rPr>
+          <w:i/>
+          <w:iCs/>
+        </w:rPr>
+        <w:t xml:space="preserve">Proceedings of the 13th International Symposium on Information Processing in Sensor Networks</w:t>
+      </w:r>
+      <w:r>
+        <w:t xml:space="preserve">, 83–94.</w:t>
+      </w:r>
+    </w:p>
+    <w:bookmarkEnd w:id="52"/>
+    <w:bookmarkStart w:id="54" w:name="ref-shelke2026flightsense"/>
+    <w:p>
+      <w:pPr>
+        <w:pStyle w:val="Bibliography"/>
+      </w:pPr>
+      <w:r>
+        <w:t xml:space="preserve">Shelke, A. J., Shelke, R. J., Kamerkar, Y. M., &amp; Hazarani, N. P. (2026).</w:t>
+      </w:r>
+      <w:r>
+        <w:t xml:space="preserve"> </w:t>
+      </w:r>
+      <w:r>
+        <w:rPr>
+          <w:i/>
+          <w:iCs/>
+        </w:rPr>
+        <w:t xml:space="preserve">FlightSense</w:t>
+      </w:r>
+      <w:r>
+        <w:rPr>
+          <w:i/>
+          <w:iCs/>
+        </w:rPr>
+        <w:t xml:space="preserve">: An end-to-end</w:t>
+      </w:r>
+      <w:r>
+        <w:rPr>
+          <w:i/>
+          <w:iCs/>
+        </w:rPr>
+        <w:t xml:space="preserve"> </w:t>
+      </w:r>
+      <w:r>
+        <w:rPr>
+          <w:i/>
+          <w:iCs/>
+        </w:rPr>
+        <w:t xml:space="preserve">MLOps</w:t>
+      </w:r>
+      <w:r>
+        <w:rPr>
+          <w:i/>
+          <w:iCs/>
+        </w:rPr>
+        <w:t xml:space="preserve"> </w:t>
+      </w:r>
+      <w:r>
+        <w:rPr>
+          <w:i/>
+          <w:iCs/>
+        </w:rPr>
+        <w:t xml:space="preserve">platform for real-time flight delay prediction via rotation-chain propagation features and agentic conversational</w:t>
+      </w:r>
+      <w:r>
+        <w:rPr>
+          <w:i/>
+          <w:iCs/>
+        </w:rPr>
+        <w:t xml:space="preserve"> </w:t>
+      </w:r>
+      <w:r>
+        <w:rPr>
+          <w:i/>
+          <w:iCs/>
+        </w:rPr>
+        <w:t xml:space="preserve">AI</w:t>
+      </w:r>
+      <w:r>
+        <w:t xml:space="preserve">.</w:t>
+      </w:r>
+      <w:r>
+        <w:t xml:space="preserve"> </w:t>
+      </w:r>
+      <w:hyperlink r:id="rId53">
+        <w:r>
+          <w:rPr>
+            <w:rStyle w:val="Hyperlink"/>
+          </w:rPr>
+          <w:t xml:space="preserve">https://doi.org/10.48550/arXiv.2605.07364</w:t>
+        </w:r>
+      </w:hyperlink>
+    </w:p>
+    <w:bookmarkEnd w:id="54"/>
+    <w:bookmarkStart w:id="56" w:name="ref-sternberg2017review"/>
+    <w:p>
+      <w:pPr>
+        <w:pStyle w:val="Bibliography"/>
+      </w:pPr>
+      <w:r>
+        <w:t xml:space="preserve">Sternberg, A., Soares, J., Carvalho, D., &amp; Ogasawara, E. (2017).</w:t>
+      </w:r>
+      <w:r>
+        <w:t xml:space="preserve"> </w:t>
+      </w:r>
+      <w:r>
+        <w:rPr>
+          <w:i/>
+          <w:iCs/>
+        </w:rPr>
         <w:t xml:space="preserve">A review on flight delay prediction</w:t>
       </w:r>
       <w:r>
@@ -3995,7 +4318,7 @@
       <w:r>
         <w:t xml:space="preserve"> </w:t>
       </w:r>
-      <w:hyperlink r:id="rId48">
+      <w:hyperlink r:id="rId55">
         <w:r>
           <w:rPr>
             <w:rStyle w:val="Hyperlink"/>
@@ -4004,8 +4327,8 @@
         </w:r>
       </w:hyperlink>
     </w:p>
-    <w:bookmarkEnd w:id="49"/>
-    <w:bookmarkStart w:id="50" w:name="ref-wilson2026flightdelay"/>
+    <w:bookmarkEnd w:id="56"/>
+    <w:bookmarkStart w:id="58" w:name="ref-wilson2026flightdelay"/>
     <w:p>
       <w:pPr>
         <w:pStyle w:val="Bibliography"/>
@@ -4029,7 +4352,7 @@
       <w:r>
         <w:t xml:space="preserve"> </w:t>
       </w:r>
-      <w:hyperlink r:id="rId20">
+      <w:hyperlink r:id="rId57">
         <w:r>
           <w:rPr>
             <w:rStyle w:val="Hyperlink"/>
@@ -4038,8 +4361,8 @@
         </w:r>
       </w:hyperlink>
     </w:p>
-    <w:bookmarkEnd w:id="50"/>
-    <w:bookmarkStart w:id="51" w:name="ref-wong2012survival"/>
+    <w:bookmarkEnd w:id="58"/>
+    <w:bookmarkStart w:id="59" w:name="ref-wong2012survival"/>
     <w:p>
       <w:pPr>
         <w:pStyle w:val="Bibliography"/>
@@ -4074,9 +4397,9 @@
         <w:t xml:space="preserve">, 5–11.</w:t>
       </w:r>
     </w:p>
-    <w:bookmarkEnd w:id="51"/>
-    <w:bookmarkEnd w:id="52"/>
-    <w:bookmarkEnd w:id="53"/>
+    <w:bookmarkEnd w:id="59"/>
+    <w:bookmarkEnd w:id="60"/>
+    <w:bookmarkEnd w:id="61"/>
     <w:sectPr>
       <w:footnotePr>
         <w:numRestart w:val="eachSect"/>
@@ -4428,10 +4751,10 @@
   <w:docDefaults>
     <w:rPrDefault>
       <w:rPr>
-        <w:rFonts w:asciiTheme="minorHAnsi" w:cstheme="minorBidi" w:eastAsiaTheme="minorHAnsi" w:hAnsiTheme="minorHAnsi"/>
+        <w:rFonts w:asciiTheme="minorHAnsi" w:cstheme="minorBidi" w:eastAsiaTheme="minorEastAsia" w:hAnsiTheme="minorHAnsi"/>
         <w:sz w:val="24"/>
         <w:szCs w:val="24"/>
-        <w:lang w:bidi="ar-SA" w:eastAsia="en-US" w:val="en-US"/>
+        <w:lang w:bidi="ar-SA" w:eastAsia="zh-CN" w:val="en-US"/>
       </w:rPr>
     </w:rPrDefault>
     <w:pPrDefault>
@@ -4972,13 +5295,6 @@
       </w:tblCellMar>
     </w:tblPr>
     <w:tblStylePr w:type="firstRow">
-      <w:tblPr>
-        <w:jc w:val="left"/>
-        <w:tblInd w:type="dxa" w:w="0"/>
-      </w:tblPr>
-      <w:trPr>
-        <w:jc w:val="left"/>
-      </w:trPr>
       <w:tcPr>
         <w:tcBorders>
           <w:bottom w:val="single"/>

</xml_diff>

<commit_message>
Update data sources in proposal
</commit_message>
<xml_diff>
--- a/docs/aeroflux_stage2_proposal.docx
+++ b/docs/aeroflux_stage2_proposal.docx
@@ -210,7 +210,7 @@
         <w:t xml:space="preserve"> </w:t>
       </w:r>
       <w:r>
-        <w:t xml:space="preserve">(Federal Aviation Administration, 2020, 2024b)</w:t>
+        <w:t xml:space="preserve">(Federal Aviation Administration, 2020, 2024c)</w:t>
       </w:r>
       <w:r>
         <w:t xml:space="preserve">. Commercial platforms such as Sabre Mosaic support airline disruption recovery, and Assaia ApronAI uses computer vision and machine learning to monitor aircraft turnarounds and predict departure readiness</w:t>
@@ -907,13 +907,7 @@
         <w:pStyle w:val="FirstParagraph"/>
       </w:pPr>
       <w:r>
-        <w:t xml:space="preserve">The platform fuses four aviation and weather sources plus a documentation corpus,</w:t>
-      </w:r>
-      <w:r>
-        <w:t xml:space="preserve"> </w:t>
-      </w:r>
-      <w:r>
-        <w:t xml:space="preserve">summarized in</w:t>
+        <w:t xml:space="preserve">The platform fuses live and historical aviation and weather sources, plus reference dimensions and a documentation corpus, summarized in</w:t>
       </w:r>
       <w:r>
         <w:t xml:space="preserve"> </w:t>
@@ -927,43 +921,40 @@
         </w:r>
       </w:hyperlink>
       <w:r>
-        <w:t xml:space="preserve">. FAA SWIM provides the authoritative live NAS flight</w:t>
-      </w:r>
-      <w:r>
-        <w:t xml:space="preserve"> </w:t>
-      </w:r>
-      <w:r>
-        <w:t xml:space="preserve">state; ADS-B supplies the physical airframe identity (ICAO 24-bit address and</w:t>
-      </w:r>
-      <w:r>
-        <w:t xml:space="preserve"> </w:t>
-      </w:r>
-      <w:r>
-        <w:t xml:space="preserve">registration) needed to link an aircraft’s successive legs; NOAA METAR/TAF</w:t>
-      </w:r>
-      <w:r>
-        <w:t xml:space="preserve"> </w:t>
-      </w:r>
-      <w:r>
-        <w:t xml:space="preserve">supplies weather, a leading delay driver; and the BTS On-Time Performance</w:t>
-      </w:r>
-      <w:r>
-        <w:t xml:space="preserve"> </w:t>
-      </w:r>
-      <w:r>
-        <w:t xml:space="preserve">dataset—which includes actual gate times and tail numbers—provides historical</w:t>
-      </w:r>
-      <w:r>
-        <w:t xml:space="preserve"> </w:t>
-      </w:r>
-      <w:r>
-        <w:t xml:space="preserve">training labels. Large-scale ADS-B research networks such as OpenSky demonstrate</w:t>
-      </w:r>
-      <w:r>
-        <w:t xml:space="preserve"> </w:t>
-      </w:r>
-      <w:r>
-        <w:t xml:space="preserve">the usefulness of distributed aircraft surveillance data for aviation research</w:t>
+        <w:t xml:space="preserve">. FAA SWIM provides the authoritative live NAS flight state</w:t>
+      </w:r>
+      <w:r>
+        <w:t xml:space="preserve"> </w:t>
+      </w:r>
+      <w:r>
+        <w:t xml:space="preserve">(Federal Aviation Administration, 2024b)</w:t>
+      </w:r>
+      <w:r>
+        <w:t xml:space="preserve">; ADS-B supplies the physical airframe identity (ICAO 24-bit address and registration) needed to link an aircraft’s successive legs, drawn from community feeds</w:t>
+      </w:r>
+      <w:r>
+        <w:t xml:space="preserve"> </w:t>
+      </w:r>
+      <w:r>
+        <w:t xml:space="preserve">(</w:t>
+      </w:r>
+      <w:r>
+        <w:t xml:space="preserve">adsb.lol</w:t>
+      </w:r>
+      <w:r>
+        <w:t xml:space="preserve">, 2026;</w:t>
+      </w:r>
+      <w:r>
+        <w:t xml:space="preserve"> </w:t>
+      </w:r>
+      <w:r>
+        <w:t xml:space="preserve">airplanes.live</w:t>
+      </w:r>
+      <w:r>
+        <w:t xml:space="preserve">, 2026)</w:t>
+      </w:r>
+      <w:r>
+        <w:t xml:space="preserve">, whose research value is demonstrated by large-scale networks such as OpenSky</w:t>
       </w:r>
       <w:r>
         <w:t xml:space="preserve"> </w:t>
@@ -972,7 +963,49 @@
         <w:t xml:space="preserve">(Schäfer et al., 2014)</w:t>
       </w:r>
       <w:r>
-        <w:t xml:space="preserve">.</w:t>
+        <w:t xml:space="preserve">; NOAA weather—a leading delay driver—is drawn from live METAR via the Aviation Weather Center</w:t>
+      </w:r>
+      <w:r>
+        <w:t xml:space="preserve"> </w:t>
+      </w:r>
+      <w:r>
+        <w:t xml:space="preserve">(National Oceanic and Atmospheric Administration, 2026)</w:t>
+      </w:r>
+      <w:r>
+        <w:t xml:space="preserve"> </w:t>
+      </w:r>
+      <w:r>
+        <w:t xml:space="preserve">for serving and the NCEI Integrated Surface Database for historical training</w:t>
+      </w:r>
+      <w:r>
+        <w:t xml:space="preserve"> </w:t>
+      </w:r>
+      <w:r>
+        <w:t xml:space="preserve">(National Centers for Environmental Information, 2026)</w:t>
+      </w:r>
+      <w:r>
+        <w:t xml:space="preserve">; and the BTS On-Time Performance dataset, which includes actual gate times and tail numbers, provides historical training labels</w:t>
+      </w:r>
+      <w:r>
+        <w:t xml:space="preserve"> </w:t>
+      </w:r>
+      <w:r>
+        <w:t xml:space="preserve">(Bureau of Transportation Statistics, 2026)</w:t>
+      </w:r>
+      <w:r>
+        <w:t xml:space="preserve">. Reference dimensions for airports and airlines</w:t>
+      </w:r>
+      <w:r>
+        <w:t xml:space="preserve"> </w:t>
+      </w:r>
+      <w:r>
+        <w:t xml:space="preserve">(OpenFlights, 2026; OurAirports, 2026)</w:t>
+      </w:r>
+      <w:r>
+        <w:t xml:space="preserve"> </w:t>
+      </w:r>
+      <w:r>
+        <w:t xml:space="preserve">support entity resolution, code normalization, and timezone alignment.</w:t>
       </w:r>
     </w:p>
     <w:tbl>
@@ -1214,7 +1247,7 @@
                     <w:jc w:val="center"/>
                   </w:pPr>
                   <w:r>
-                    <w:t xml:space="preserve">NOAA METAR / TAF</w:t>
+                    <w:t xml:space="preserve">NOAA weather — METAR (AWC) + NCEI ISD hourly</w:t>
                   </w:r>
                 </w:p>
               </w:tc>
@@ -1238,7 +1271,7 @@
                     <w:jc w:val="center"/>
                   </w:pPr>
                   <w:r>
-                    <w:t xml:space="preserve">Weather observations and forecasts</w:t>
+                    <w:t xml:space="preserve">Weather: METAR for serving, NCEI for training</w:t>
                   </w:r>
                 </w:p>
               </w:tc>
@@ -1262,7 +1295,7 @@
                     <w:jc w:val="center"/>
                   </w:pPr>
                   <w:r>
-                    <w:t xml:space="preserve">Approximately 50–250 MB</w:t>
+                    <w:t xml:space="preserve">Approximately 50–250 MB live</w:t>
                   </w:r>
                 </w:p>
               </w:tc>
@@ -1387,6 +1420,68 @@
                   </w:pPr>
                   <w:r>
                     <w:t xml:space="preserve">Approximately 0.5–2 GB, including extracted text and embeddings</w:t>
+                  </w:r>
+                </w:p>
+              </w:tc>
+            </w:tr>
+            <w:tr>
+              <w:tc>
+                <w:tcPr/>
+                <w:p>
+                  <w:pPr>
+                    <w:pStyle w:val="Compact"/>
+                    <w:jc w:val="center"/>
+                  </w:pPr>
+                  <w:r>
+                    <w:t xml:space="preserve">Reference dimensions (airports, airlines)</w:t>
+                  </w:r>
+                </w:p>
+              </w:tc>
+              <w:tc>
+                <w:tcPr/>
+                <w:p>
+                  <w:pPr>
+                    <w:pStyle w:val="Compact"/>
+                    <w:jc w:val="center"/>
+                  </w:pPr>
+                  <w:r>
+                    <w:t xml:space="preserve">Static CSV</w:t>
+                  </w:r>
+                </w:p>
+              </w:tc>
+              <w:tc>
+                <w:tcPr/>
+                <w:p>
+                  <w:pPr>
+                    <w:pStyle w:val="Compact"/>
+                    <w:jc w:val="center"/>
+                  </w:pPr>
+                  <w:r>
+                    <w:t xml:space="preserve">Entity resolution, ICAO/IATA + timezone normalization</w:t>
+                  </w:r>
+                </w:p>
+              </w:tc>
+              <w:tc>
+                <w:tcPr/>
+                <w:p>
+                  <w:pPr>
+                    <w:pStyle w:val="Compact"/>
+                    <w:jc w:val="center"/>
+                  </w:pPr>
+                  <w:r>
+                    <w:t xml:space="preserve">Persistent</w:t>
+                  </w:r>
+                </w:p>
+              </w:tc>
+              <w:tc>
+                <w:tcPr/>
+                <w:p>
+                  <w:pPr>
+                    <w:pStyle w:val="Compact"/>
+                    <w:jc w:val="center"/>
+                  </w:pPr>
+                  <w:r>
+                    <w:t xml:space="preserve">&lt; 50 MB</w:t>
                   </w:r>
                 </w:p>
               </w:tc>
@@ -3430,7 +3525,7 @@
       </w:tr>
     </w:tbl>
     <w:bookmarkEnd w:id="20"/>
-    <w:bookmarkStart w:id="61" w:name="references"/>
+    <w:bookmarkStart w:id="77" w:name="references"/>
     <w:p>
       <w:pPr>
         <w:pStyle w:val="Heading1"/>
@@ -3439,13 +3534,149 @@
         <w:t xml:space="preserve">References</w:t>
       </w:r>
     </w:p>
-    <w:bookmarkStart w:id="60" w:name="refs"/>
-    <w:bookmarkStart w:id="22" w:name="ref-airspaceIntelligencePrescience"/>
+    <w:bookmarkStart w:id="76" w:name="refs"/>
+    <w:bookmarkStart w:id="22" w:name="ref-adsblol"/>
     <w:p>
       <w:pPr>
         <w:pStyle w:val="Bibliography"/>
       </w:pPr>
       <w:r>
+        <w:t xml:space="preserve">adsb.lol</w:t>
+      </w:r>
+      <w:r>
+        <w:t xml:space="preserve">. (2026).</w:t>
+      </w:r>
+      <w:r>
+        <w:t xml:space="preserve"> </w:t>
+      </w:r>
+      <w:r>
+        <w:rPr>
+          <w:i/>
+          <w:iCs/>
+        </w:rPr>
+        <w:t xml:space="preserve">adsb.lol</w:t>
+      </w:r>
+      <w:r>
+        <w:rPr>
+          <w:i/>
+          <w:iCs/>
+        </w:rPr>
+        <w:t xml:space="preserve"> </w:t>
+      </w:r>
+      <w:r>
+        <w:rPr>
+          <w:i/>
+          <w:iCs/>
+        </w:rPr>
+        <w:t xml:space="preserve">ADS-B</w:t>
+      </w:r>
+      <w:r>
+        <w:rPr>
+          <w:i/>
+          <w:iCs/>
+        </w:rPr>
+        <w:t xml:space="preserve"> </w:t>
+      </w:r>
+      <w:r>
+        <w:rPr>
+          <w:i/>
+          <w:iCs/>
+        </w:rPr>
+        <w:t xml:space="preserve">API</w:t>
+      </w:r>
+      <w:r>
+        <w:t xml:space="preserve">.</w:t>
+      </w:r>
+      <w:r>
+        <w:t xml:space="preserve"> </w:t>
+      </w:r>
+      <w:hyperlink r:id="rId21">
+        <w:r>
+          <w:rPr>
+            <w:rStyle w:val="Hyperlink"/>
+          </w:rPr>
+          <w:t xml:space="preserve">https://api.adsb.lol/docs</w:t>
+        </w:r>
+      </w:hyperlink>
+      <w:r>
+        <w:t xml:space="preserve">.</w:t>
+      </w:r>
+    </w:p>
+    <w:bookmarkEnd w:id="22"/>
+    <w:bookmarkStart w:id="24" w:name="ref-airplaneslive"/>
+    <w:p>
+      <w:pPr>
+        <w:pStyle w:val="Bibliography"/>
+      </w:pPr>
+      <w:r>
+        <w:t xml:space="preserve">airplanes.live</w:t>
+      </w:r>
+      <w:r>
+        <w:t xml:space="preserve">. (2026).</w:t>
+      </w:r>
+      <w:r>
+        <w:t xml:space="preserve"> </w:t>
+      </w:r>
+      <w:r>
+        <w:rPr>
+          <w:i/>
+          <w:iCs/>
+        </w:rPr>
+        <w:t xml:space="preserve">airplanes.live</w:t>
+      </w:r>
+      <w:r>
+        <w:rPr>
+          <w:i/>
+          <w:iCs/>
+        </w:rPr>
+        <w:t xml:space="preserve"> </w:t>
+      </w:r>
+      <w:r>
+        <w:rPr>
+          <w:i/>
+          <w:iCs/>
+        </w:rPr>
+        <w:t xml:space="preserve">ADS-B</w:t>
+      </w:r>
+      <w:r>
+        <w:rPr>
+          <w:i/>
+          <w:iCs/>
+        </w:rPr>
+        <w:t xml:space="preserve"> </w:t>
+      </w:r>
+      <w:r>
+        <w:rPr>
+          <w:i/>
+          <w:iCs/>
+        </w:rPr>
+        <w:t xml:space="preserve">API</w:t>
+      </w:r>
+      <w:r>
+        <w:t xml:space="preserve">.</w:t>
+      </w:r>
+      <w:r>
+        <w:t xml:space="preserve"> </w:t>
+      </w:r>
+      <w:hyperlink r:id="rId23">
+        <w:r>
+          <w:rPr>
+            <w:rStyle w:val="Hyperlink"/>
+          </w:rPr>
+          <w:t xml:space="preserve">https://airplanes.live/api-guide/</w:t>
+        </w:r>
+      </w:hyperlink>
+      <w:r>
+        <w:t xml:space="preserve">.</w:t>
+      </w:r>
+    </w:p>
+    <w:bookmarkEnd w:id="24"/>
+    <w:bookmarkStart w:id="26" w:name="ref-airspaceIntelligencePrescience"/>
+    <w:p>
+      <w:pPr>
+        <w:pStyle w:val="Bibliography"/>
+      </w:pPr>
+      <w:r>
         <w:t xml:space="preserve">Airspace Intelligence. ({n.d.}).</w:t>
       </w:r>
       <w:r>
@@ -3478,7 +3709,7 @@
       <w:r>
         <w:t xml:space="preserve"> </w:t>
       </w:r>
-      <w:hyperlink r:id="rId21">
+      <w:hyperlink r:id="rId25">
         <w:r>
           <w:rPr>
             <w:rStyle w:val="Hyperlink"/>
@@ -3487,8 +3718,8 @@
         </w:r>
       </w:hyperlink>
     </w:p>
-    <w:bookmarkEnd w:id="22"/>
-    <w:bookmarkStart w:id="23" w:name="ref-albassam2025flight"/>
+    <w:bookmarkEnd w:id="26"/>
+    <w:bookmarkStart w:id="27" w:name="ref-albassam2025flight"/>
     <w:p>
       <w:pPr>
         <w:pStyle w:val="Bibliography"/>
@@ -3523,8 +3754,8 @@
         <w:t xml:space="preserve">(12), e0335141.</w:t>
       </w:r>
     </w:p>
-    <w:bookmarkEnd w:id="23"/>
-    <w:bookmarkStart w:id="25" w:name="ref-amadeusFlightOps"/>
+    <w:bookmarkEnd w:id="27"/>
+    <w:bookmarkStart w:id="29" w:name="ref-amadeusFlightOps"/>
     <w:p>
       <w:pPr>
         <w:pStyle w:val="Bibliography"/>
@@ -3548,7 +3779,7 @@
       <w:r>
         <w:t xml:space="preserve"> </w:t>
       </w:r>
-      <w:hyperlink r:id="rId24">
+      <w:hyperlink r:id="rId28">
         <w:r>
           <w:rPr>
             <w:rStyle w:val="Hyperlink"/>
@@ -3557,8 +3788,8 @@
         </w:r>
       </w:hyperlink>
     </w:p>
-    <w:bookmarkEnd w:id="25"/>
-    <w:bookmarkStart w:id="27" w:name="ref-assaia_apronai"/>
+    <w:bookmarkEnd w:id="29"/>
+    <w:bookmarkStart w:id="31" w:name="ref-assaia_apronai"/>
     <w:p>
       <w:pPr>
         <w:pStyle w:val="Bibliography"/>
@@ -3589,7 +3820,7 @@
       <w:r>
         <w:t xml:space="preserve"> </w:t>
       </w:r>
-      <w:hyperlink r:id="rId26">
+      <w:hyperlink r:id="rId30">
         <w:r>
           <w:rPr>
             <w:rStyle w:val="Hyperlink"/>
@@ -3598,8 +3829,8 @@
         </w:r>
       </w:hyperlink>
     </w:p>
-    <w:bookmarkEnd w:id="27"/>
-    <w:bookmarkStart w:id="28" w:name="ref-beatty1999preliminary"/>
+    <w:bookmarkEnd w:id="31"/>
+    <w:bookmarkStart w:id="32" w:name="ref-beatty1999preliminary"/>
     <w:p>
       <w:pPr>
         <w:pStyle w:val="Bibliography"/>
@@ -3634,8 +3865,8 @@
         <w:t xml:space="preserve">(4), 259–270.</w:t>
       </w:r>
     </w:p>
-    <w:bookmarkEnd w:id="28"/>
-    <w:bookmarkStart w:id="29" w:name="ref-belcastro2016flight"/>
+    <w:bookmarkEnd w:id="32"/>
+    <w:bookmarkStart w:id="33" w:name="ref-belcastro2016flight"/>
     <w:p>
       <w:pPr>
         <w:pStyle w:val="Bibliography"/>
@@ -3670,13 +3901,50 @@
         <w:t xml:space="preserve">(1), 1–20.</w:t>
       </w:r>
     </w:p>
-    <w:bookmarkEnd w:id="29"/>
-    <w:bookmarkStart w:id="30" w:name="ref-chen2016xgboost"/>
+    <w:bookmarkEnd w:id="33"/>
+    <w:bookmarkStart w:id="35" w:name="ref-bts_ontime"/>
     <w:p>
       <w:pPr>
         <w:pStyle w:val="Bibliography"/>
       </w:pPr>
       <w:r>
+        <w:t xml:space="preserve">Bureau of Transportation Statistics. (2026).</w:t>
+      </w:r>
+      <w:r>
+        <w:t xml:space="preserve"> </w:t>
+      </w:r>
+      <w:r>
+        <w:rPr>
+          <w:i/>
+          <w:iCs/>
+        </w:rPr>
+        <w:t xml:space="preserve">Reporting carrier on-time performance</w:t>
+      </w:r>
+      <w:r>
+        <w:t xml:space="preserve">.</w:t>
+      </w:r>
+      <w:r>
+        <w:t xml:space="preserve"> </w:t>
+      </w:r>
+      <w:hyperlink r:id="rId34">
+        <w:r>
+          <w:rPr>
+            <w:rStyle w:val="Hyperlink"/>
+          </w:rPr>
+          <w:t xml:space="preserve">https://www.transtats.bts.gov/Tables.asp?DB_ID=120</w:t>
+        </w:r>
+      </w:hyperlink>
+      <w:r>
+        <w:t xml:space="preserve">.</w:t>
+      </w:r>
+    </w:p>
+    <w:bookmarkEnd w:id="35"/>
+    <w:bookmarkStart w:id="36" w:name="ref-chen2016xgboost"/>
+    <w:p>
+      <w:pPr>
+        <w:pStyle w:val="Bibliography"/>
+      </w:pPr>
+      <w:r>
         <w:t xml:space="preserve">Chen, T., &amp; Guestrin, C. (2016).</w:t>
       </w:r>
       <w:r>
@@ -3702,8 +3970,8 @@
         <w:t xml:space="preserve">, 785–794.</w:t>
       </w:r>
     </w:p>
-    <w:bookmarkEnd w:id="30"/>
-    <w:bookmarkStart w:id="32" w:name="ref-faa_tfdm_2020"/>
+    <w:bookmarkEnd w:id="36"/>
+    <w:bookmarkStart w:id="38" w:name="ref-faa_tfdm_2020"/>
     <w:p>
       <w:pPr>
         <w:pStyle w:val="Bibliography"/>
@@ -3741,7 +4009,7 @@
       <w:r>
         <w:t xml:space="preserve"> </w:t>
       </w:r>
-      <w:hyperlink r:id="rId31">
+      <w:hyperlink r:id="rId37">
         <w:r>
           <w:rPr>
             <w:rStyle w:val="Hyperlink"/>
@@ -3750,8 +4018,8 @@
         </w:r>
       </w:hyperlink>
     </w:p>
-    <w:bookmarkEnd w:id="32"/>
-    <w:bookmarkStart w:id="34" w:name="ref-faa2024airoadmap"/>
+    <w:bookmarkEnd w:id="38"/>
+    <w:bookmarkStart w:id="40" w:name="ref-faa2024airoadmap"/>
     <w:p>
       <w:pPr>
         <w:pStyle w:val="Bibliography"/>
@@ -3775,7 +4043,7 @@
       <w:r>
         <w:t xml:space="preserve"> </w:t>
       </w:r>
-      <w:hyperlink r:id="rId33">
+      <w:hyperlink r:id="rId39">
         <w:r>
           <w:rPr>
             <w:rStyle w:val="Hyperlink"/>
@@ -3784,8 +4052,8 @@
         </w:r>
       </w:hyperlink>
     </w:p>
-    <w:bookmarkEnd w:id="34"/>
-    <w:bookmarkStart w:id="36" w:name="ref-faa_nextgen_2024"/>
+    <w:bookmarkEnd w:id="40"/>
+    <w:bookmarkStart w:id="42" w:name="ref-faa_swim"/>
     <w:p>
       <w:pPr>
         <w:pStyle w:val="Bibliography"/>
@@ -3801,6 +4069,57 @@
           <w:i/>
           <w:iCs/>
         </w:rPr>
+        <w:t xml:space="preserve">System wide information management (</w:t>
+      </w:r>
+      <w:r>
+        <w:rPr>
+          <w:i/>
+          <w:iCs/>
+        </w:rPr>
+        <w:t xml:space="preserve">SWIM</w:t>
+      </w:r>
+      <w:r>
+        <w:rPr>
+          <w:i/>
+          <w:iCs/>
+        </w:rPr>
+        <w:t xml:space="preserve">)</w:t>
+      </w:r>
+      <w:r>
+        <w:t xml:space="preserve">.</w:t>
+      </w:r>
+      <w:r>
+        <w:t xml:space="preserve"> </w:t>
+      </w:r>
+      <w:hyperlink r:id="rId41">
+        <w:r>
+          <w:rPr>
+            <w:rStyle w:val="Hyperlink"/>
+          </w:rPr>
+          <w:t xml:space="preserve">https://www.faa.gov/air_traffic/technology/swim</w:t>
+        </w:r>
+      </w:hyperlink>
+      <w:r>
+        <w:t xml:space="preserve">.</w:t>
+      </w:r>
+    </w:p>
+    <w:bookmarkEnd w:id="42"/>
+    <w:bookmarkStart w:id="44" w:name="ref-faa_nextgen_2024"/>
+    <w:p>
+      <w:pPr>
+        <w:pStyle w:val="Bibliography"/>
+      </w:pPr>
+      <w:r>
+        <w:t xml:space="preserve">Federal Aviation Administration. (2024c).</w:t>
+      </w:r>
+      <w:r>
+        <w:t xml:space="preserve"> </w:t>
+      </w:r>
+      <w:r>
+        <w:rPr>
+          <w:i/>
+          <w:iCs/>
+        </w:rPr>
         <w:t xml:space="preserve">NextGen</w:t>
       </w:r>
       <w:r>
@@ -3809,7 +4128,7 @@
       <w:r>
         <w:t xml:space="preserve"> </w:t>
       </w:r>
-      <w:hyperlink r:id="rId35">
+      <w:hyperlink r:id="rId43">
         <w:r>
           <w:rPr>
             <w:rStyle w:val="Hyperlink"/>
@@ -3818,8 +4137,8 @@
         </w:r>
       </w:hyperlink>
     </w:p>
-    <w:bookmarkEnd w:id="36"/>
-    <w:bookmarkStart w:id="38" w:name="ref-flightawareForesight"/>
+    <w:bookmarkEnd w:id="44"/>
+    <w:bookmarkStart w:id="46" w:name="ref-flightawareForesight"/>
     <w:p>
       <w:pPr>
         <w:pStyle w:val="Bibliography"/>
@@ -3843,7 +4162,7 @@
       <w:r>
         <w:t xml:space="preserve"> </w:t>
       </w:r>
-      <w:hyperlink r:id="rId37">
+      <w:hyperlink r:id="rId45">
         <w:r>
           <w:rPr>
             <w:rStyle w:val="Hyperlink"/>
@@ -3852,8 +4171,8 @@
         </w:r>
       </w:hyperlink>
     </w:p>
-    <w:bookmarkEnd w:id="38"/>
-    <w:bookmarkStart w:id="39" w:name="ref-kafle2016propagation"/>
+    <w:bookmarkEnd w:id="46"/>
+    <w:bookmarkStart w:id="47" w:name="ref-kafle2016propagation"/>
     <w:p>
       <w:pPr>
         <w:pStyle w:val="Bibliography"/>
@@ -3888,8 +4207,8 @@
         <w:t xml:space="preserve">, 520–542.</w:t>
       </w:r>
     </w:p>
-    <w:bookmarkEnd w:id="39"/>
-    <w:bookmarkStart w:id="41" w:name="ref-lauderdale2024nasDigitalTwin"/>
+    <w:bookmarkEnd w:id="47"/>
+    <w:bookmarkStart w:id="49" w:name="ref-lauderdale2024nasDigitalTwin"/>
     <w:p>
       <w:pPr>
         <w:pStyle w:val="Bibliography"/>
@@ -3925,7 +4244,7 @@
       <w:r>
         <w:t xml:space="preserve"> </w:t>
       </w:r>
-      <w:hyperlink r:id="rId40">
+      <w:hyperlink r:id="rId48">
         <w:r>
           <w:rPr>
             <w:rStyle w:val="Hyperlink"/>
@@ -3934,8 +4253,8 @@
         </w:r>
       </w:hyperlink>
     </w:p>
-    <w:bookmarkEnd w:id="41"/>
-    <w:bookmarkStart w:id="42" w:name="ref-lewis2020rag"/>
+    <w:bookmarkEnd w:id="49"/>
+    <w:bookmarkStart w:id="50" w:name="ref-lewis2020rag"/>
     <w:p>
       <w:pPr>
         <w:pStyle w:val="Bibliography"/>
@@ -3969,8 +4288,8 @@
         <w:t xml:space="preserve">, 9459–9474.</w:t>
       </w:r>
     </w:p>
-    <w:bookmarkEnd w:id="42"/>
-    <w:bookmarkStart w:id="44" w:name="ref-lufthansa2025aiocc"/>
+    <w:bookmarkEnd w:id="50"/>
+    <w:bookmarkStart w:id="52" w:name="ref-lufthansa2025aiocc"/>
     <w:p>
       <w:pPr>
         <w:pStyle w:val="Bibliography"/>
@@ -3994,7 +4313,7 @@
       <w:r>
         <w:t xml:space="preserve"> </w:t>
       </w:r>
-      <w:hyperlink r:id="rId43">
+      <w:hyperlink r:id="rId51">
         <w:r>
           <w:rPr>
             <w:rStyle w:val="Hyperlink"/>
@@ -4003,8 +4322,8 @@
         </w:r>
       </w:hyperlink>
     </w:p>
-    <w:bookmarkEnd w:id="44"/>
-    <w:bookmarkStart w:id="45" w:name="ref-lundberg2017shap"/>
+    <w:bookmarkEnd w:id="52"/>
+    <w:bookmarkStart w:id="53" w:name="ref-lundberg2017shap"/>
     <w:p>
       <w:pPr>
         <w:pStyle w:val="Bibliography"/>
@@ -4026,8 +4345,8 @@
         <w:t xml:space="preserve">, 4765–4774.</w:t>
       </w:r>
     </w:p>
-    <w:bookmarkEnd w:id="45"/>
-    <w:bookmarkStart w:id="47" w:name="ref-nasa2021atd2fuser"/>
+    <w:bookmarkEnd w:id="53"/>
+    <w:bookmarkStart w:id="55" w:name="ref-nasa2021atd2fuser"/>
     <w:p>
       <w:pPr>
         <w:pStyle w:val="Bibliography"/>
@@ -4065,7 +4384,7 @@
       <w:r>
         <w:t xml:space="preserve"> </w:t>
       </w:r>
-      <w:hyperlink r:id="rId46">
+      <w:hyperlink r:id="rId54">
         <w:r>
           <w:rPr>
             <w:rStyle w:val="Hyperlink"/>
@@ -4074,13 +4393,245 @@
         </w:r>
       </w:hyperlink>
     </w:p>
-    <w:bookmarkEnd w:id="47"/>
-    <w:bookmarkStart w:id="49" w:name="ref-pepper2026probabilisticTwin"/>
+    <w:bookmarkEnd w:id="55"/>
+    <w:bookmarkStart w:id="57" w:name="ref-ncei_isd"/>
     <w:p>
       <w:pPr>
         <w:pStyle w:val="Bibliography"/>
       </w:pPr>
       <w:r>
+        <w:t xml:space="preserve">National Centers for Environmental Information. (2026).</w:t>
+      </w:r>
+      <w:r>
+        <w:t xml:space="preserve"> </w:t>
+      </w:r>
+      <w:r>
+        <w:rPr>
+          <w:i/>
+          <w:iCs/>
+        </w:rPr>
+        <w:t xml:space="preserve">Integrated surface database (</w:t>
+      </w:r>
+      <w:r>
+        <w:rPr>
+          <w:i/>
+          <w:iCs/>
+        </w:rPr>
+        <w:t xml:space="preserve">ISD</w:t>
+      </w:r>
+      <w:r>
+        <w:rPr>
+          <w:i/>
+          <w:iCs/>
+        </w:rPr>
+        <w:t xml:space="preserve">) / global hourly</w:t>
+      </w:r>
+      <w:r>
+        <w:t xml:space="preserve">.</w:t>
+      </w:r>
+      <w:r>
+        <w:t xml:space="preserve"> </w:t>
+      </w:r>
+      <w:hyperlink r:id="rId56">
+        <w:r>
+          <w:rPr>
+            <w:rStyle w:val="Hyperlink"/>
+          </w:rPr>
+          <w:t xml:space="preserve">https://www.ncei.noaa.gov/products/land-based-station/integrated-surface-database</w:t>
+        </w:r>
+      </w:hyperlink>
+      <w:r>
+        <w:t xml:space="preserve">.</w:t>
+      </w:r>
+    </w:p>
+    <w:bookmarkEnd w:id="57"/>
+    <w:bookmarkStart w:id="59" w:name="ref-awc_metar"/>
+    <w:p>
+      <w:pPr>
+        <w:pStyle w:val="Bibliography"/>
+      </w:pPr>
+      <w:r>
+        <w:t xml:space="preserve">National Oceanic and Atmospheric Administration. (2026).</w:t>
+      </w:r>
+      <w:r>
+        <w:t xml:space="preserve"> </w:t>
+      </w:r>
+      <w:r>
+        <w:rPr>
+          <w:i/>
+          <w:iCs/>
+        </w:rPr>
+        <w:t xml:space="preserve">Aviation weather center</w:t>
+      </w:r>
+      <w:r>
+        <w:rPr>
+          <w:i/>
+          <w:iCs/>
+        </w:rPr>
+        <w:t xml:space="preserve"> </w:t>
+      </w:r>
+      <w:r>
+        <w:rPr>
+          <w:i/>
+          <w:iCs/>
+        </w:rPr>
+        <w:t xml:space="preserve">METAR</w:t>
+      </w:r>
+      <w:r>
+        <w:rPr>
+          <w:i/>
+          <w:iCs/>
+        </w:rPr>
+        <w:t xml:space="preserve"> </w:t>
+      </w:r>
+      <w:r>
+        <w:rPr>
+          <w:i/>
+          <w:iCs/>
+        </w:rPr>
+        <w:t xml:space="preserve">data</w:t>
+      </w:r>
+      <w:r>
+        <w:rPr>
+          <w:i/>
+          <w:iCs/>
+        </w:rPr>
+        <w:t xml:space="preserve"> </w:t>
+      </w:r>
+      <w:r>
+        <w:rPr>
+          <w:i/>
+          <w:iCs/>
+        </w:rPr>
+        <w:t xml:space="preserve">API</w:t>
+      </w:r>
+      <w:r>
+        <w:t xml:space="preserve">.</w:t>
+      </w:r>
+      <w:r>
+        <w:t xml:space="preserve"> </w:t>
+      </w:r>
+      <w:hyperlink r:id="rId58">
+        <w:r>
+          <w:rPr>
+            <w:rStyle w:val="Hyperlink"/>
+          </w:rPr>
+          <w:t xml:space="preserve">https://aviationweather.gov/data/api/</w:t>
+        </w:r>
+      </w:hyperlink>
+      <w:r>
+        <w:t xml:space="preserve">.</w:t>
+      </w:r>
+    </w:p>
+    <w:bookmarkEnd w:id="59"/>
+    <w:bookmarkStart w:id="61" w:name="ref-openflights"/>
+    <w:p>
+      <w:pPr>
+        <w:pStyle w:val="Bibliography"/>
+      </w:pPr>
+      <w:r>
+        <w:t xml:space="preserve">OpenFlights. (2026).</w:t>
+      </w:r>
+      <w:r>
+        <w:t xml:space="preserve"> </w:t>
+      </w:r>
+      <w:r>
+        <w:rPr>
+          <w:i/>
+          <w:iCs/>
+        </w:rPr>
+        <w:t xml:space="preserve">OpenFlights</w:t>
+      </w:r>
+      <w:r>
+        <w:rPr>
+          <w:i/>
+          <w:iCs/>
+        </w:rPr>
+        <w:t xml:space="preserve"> </w:t>
+      </w:r>
+      <w:r>
+        <w:rPr>
+          <w:i/>
+          <w:iCs/>
+        </w:rPr>
+        <w:t xml:space="preserve">airline database</w:t>
+      </w:r>
+      <w:r>
+        <w:t xml:space="preserve">.</w:t>
+      </w:r>
+      <w:r>
+        <w:t xml:space="preserve"> </w:t>
+      </w:r>
+      <w:hyperlink r:id="rId60">
+        <w:r>
+          <w:rPr>
+            <w:rStyle w:val="Hyperlink"/>
+          </w:rPr>
+          <w:t xml:space="preserve">https://openflights.org/data.html</w:t>
+        </w:r>
+      </w:hyperlink>
+      <w:r>
+        <w:t xml:space="preserve">.</w:t>
+      </w:r>
+    </w:p>
+    <w:bookmarkEnd w:id="61"/>
+    <w:bookmarkStart w:id="63" w:name="ref-ourairports"/>
+    <w:p>
+      <w:pPr>
+        <w:pStyle w:val="Bibliography"/>
+      </w:pPr>
+      <w:r>
+        <w:t xml:space="preserve">OurAirports. (2026).</w:t>
+      </w:r>
+      <w:r>
+        <w:t xml:space="preserve"> </w:t>
+      </w:r>
+      <w:r>
+        <w:rPr>
+          <w:i/>
+          <w:iCs/>
+        </w:rPr>
+        <w:t xml:space="preserve">OurAirports</w:t>
+      </w:r>
+      <w:r>
+        <w:rPr>
+          <w:i/>
+          <w:iCs/>
+        </w:rPr>
+        <w:t xml:space="preserve"> </w:t>
+      </w:r>
+      <w:r>
+        <w:rPr>
+          <w:i/>
+          <w:iCs/>
+        </w:rPr>
+        <w:t xml:space="preserve">open data</w:t>
+      </w:r>
+      <w:r>
+        <w:t xml:space="preserve">.</w:t>
+      </w:r>
+      <w:r>
+        <w:t xml:space="preserve"> </w:t>
+      </w:r>
+      <w:hyperlink r:id="rId62">
+        <w:r>
+          <w:rPr>
+            <w:rStyle w:val="Hyperlink"/>
+          </w:rPr>
+          <w:t xml:space="preserve">https://ourairports.com/data/</w:t>
+        </w:r>
+      </w:hyperlink>
+      <w:r>
+        <w:t xml:space="preserve">.</w:t>
+      </w:r>
+    </w:p>
+    <w:bookmarkEnd w:id="63"/>
+    <w:bookmarkStart w:id="65" w:name="ref-pepper2026probabilisticTwin"/>
+    <w:p>
+      <w:pPr>
+        <w:pStyle w:val="Bibliography"/>
+      </w:pPr>
+      <w:r>
         <w:t xml:space="preserve">Pepper, N., Keane, A., Hodgkin, A., Gould, D., Henderson, E., Lauritsen, L., Vlahos, C., De Ath, G., Everson, R., Cannon, R., Sierra Castro, A., Korna, J., Carvell, B., &amp; Thomas, M. (2026). A probabilistic digital twin of</w:t>
       </w:r>
       <w:r>
@@ -4123,7 +4674,7 @@
       <w:r>
         <w:t xml:space="preserve"> </w:t>
       </w:r>
-      <w:hyperlink r:id="rId48">
+      <w:hyperlink r:id="rId64">
         <w:r>
           <w:rPr>
             <w:rStyle w:val="Hyperlink"/>
@@ -4132,8 +4683,8 @@
         </w:r>
       </w:hyperlink>
     </w:p>
-    <w:bookmarkEnd w:id="49"/>
-    <w:bookmarkStart w:id="51" w:name="ref-sabre_disruption_management"/>
+    <w:bookmarkEnd w:id="65"/>
+    <w:bookmarkStart w:id="67" w:name="ref-sabre_disruption_management"/>
     <w:p>
       <w:pPr>
         <w:pStyle w:val="Bibliography"/>
@@ -4157,7 +4708,7 @@
       <w:r>
         <w:t xml:space="preserve"> </w:t>
       </w:r>
-      <w:hyperlink r:id="rId50">
+      <w:hyperlink r:id="rId66">
         <w:r>
           <w:rPr>
             <w:rStyle w:val="Hyperlink"/>
@@ -4166,8 +4717,8 @@
         </w:r>
       </w:hyperlink>
     </w:p>
-    <w:bookmarkEnd w:id="51"/>
-    <w:bookmarkStart w:id="52" w:name="ref-schaefer2014opensky"/>
+    <w:bookmarkEnd w:id="67"/>
+    <w:bookmarkStart w:id="68" w:name="ref-schaefer2014opensky"/>
     <w:p>
       <w:pPr>
         <w:pStyle w:val="Bibliography"/>
@@ -4210,8 +4761,8 @@
         <w:t xml:space="preserve">, 83–94.</w:t>
       </w:r>
     </w:p>
-    <w:bookmarkEnd w:id="52"/>
-    <w:bookmarkStart w:id="54" w:name="ref-shelke2026flightsense"/>
+    <w:bookmarkEnd w:id="68"/>
+    <w:bookmarkStart w:id="70" w:name="ref-shelke2026flightsense"/>
     <w:p>
       <w:pPr>
         <w:pStyle w:val="Bibliography"/>
@@ -4284,7 +4835,7 @@
       <w:r>
         <w:t xml:space="preserve"> </w:t>
       </w:r>
-      <w:hyperlink r:id="rId53">
+      <w:hyperlink r:id="rId69">
         <w:r>
           <w:rPr>
             <w:rStyle w:val="Hyperlink"/>
@@ -4293,8 +4844,8 @@
         </w:r>
       </w:hyperlink>
     </w:p>
-    <w:bookmarkEnd w:id="54"/>
-    <w:bookmarkStart w:id="56" w:name="ref-sternberg2017review"/>
+    <w:bookmarkEnd w:id="70"/>
+    <w:bookmarkStart w:id="72" w:name="ref-sternberg2017review"/>
     <w:p>
       <w:pPr>
         <w:pStyle w:val="Bibliography"/>
@@ -4318,7 +4869,7 @@
       <w:r>
         <w:t xml:space="preserve"> </w:t>
       </w:r>
-      <w:hyperlink r:id="rId55">
+      <w:hyperlink r:id="rId71">
         <w:r>
           <w:rPr>
             <w:rStyle w:val="Hyperlink"/>
@@ -4327,8 +4878,8 @@
         </w:r>
       </w:hyperlink>
     </w:p>
-    <w:bookmarkEnd w:id="56"/>
-    <w:bookmarkStart w:id="58" w:name="ref-wilson2026flightdelay"/>
+    <w:bookmarkEnd w:id="72"/>
+    <w:bookmarkStart w:id="74" w:name="ref-wilson2026flightdelay"/>
     <w:p>
       <w:pPr>
         <w:pStyle w:val="Bibliography"/>
@@ -4352,7 +4903,7 @@
       <w:r>
         <w:t xml:space="preserve"> </w:t>
       </w:r>
-      <w:hyperlink r:id="rId57">
+      <w:hyperlink r:id="rId73">
         <w:r>
           <w:rPr>
             <w:rStyle w:val="Hyperlink"/>
@@ -4361,8 +4912,8 @@
         </w:r>
       </w:hyperlink>
     </w:p>
-    <w:bookmarkEnd w:id="58"/>
-    <w:bookmarkStart w:id="59" w:name="ref-wong2012survival"/>
+    <w:bookmarkEnd w:id="74"/>
+    <w:bookmarkStart w:id="75" w:name="ref-wong2012survival"/>
     <w:p>
       <w:pPr>
         <w:pStyle w:val="Bibliography"/>
@@ -4397,9 +4948,9 @@
         <w:t xml:space="preserve">, 5–11.</w:t>
       </w:r>
     </w:p>
-    <w:bookmarkEnd w:id="59"/>
-    <w:bookmarkEnd w:id="60"/>
-    <w:bookmarkEnd w:id="61"/>
+    <w:bookmarkEnd w:id="75"/>
+    <w:bookmarkEnd w:id="76"/>
+    <w:bookmarkEnd w:id="77"/>
     <w:sectPr>
       <w:footnotePr>
         <w:numRestart w:val="eachSect"/>

</xml_diff>

<commit_message>
Add formating for proposal
</commit_message>
<xml_diff>
--- a/docs/aeroflux_stage2_proposal.docx
+++ b/docs/aeroflux_stage2_proposal.docx
@@ -39,7 +39,7 @@
         <w:pStyle w:val="Date"/>
       </w:pPr>
       <w:r>
-        <w:t xml:space="preserve">2026-07-18</w:t>
+        <w:t xml:space="preserve">July 18, 2026</w:t>
       </w:r>
     </w:p>
     <w:sdt>
@@ -158,6 +158,11 @@
         </w:tc>
       </w:tr>
     </w:tbl>
+    <w:p>
+      <w:r>
+        <w:br w:type="page"/>
+      </w:r>
+    </w:p>
     <w:bookmarkStart w:id="9" w:name="introduction"/>
     <w:p>
       <w:pPr>
@@ -2370,7 +2375,7 @@
       </w:tr>
     </w:tbl>
     <w:bookmarkEnd w:id="15"/>
-    <w:bookmarkStart w:id="16" w:name="methodology-and-proposed-solution"/>
+    <w:bookmarkStart w:id="20" w:name="methodology-and-proposed-solution"/>
     <w:p>
       <w:pPr>
         <w:pStyle w:val="Heading1"/>
@@ -2435,580 +2440,16 @@
       <w:r>
         <w:t xml:space="preserve"> </w:t>
       </w:r>
-      <w:r>
-        <w:rPr>
-          <w:b/>
-          <w:bCs/>
-        </w:rPr>
-        <w:t xml:space="preserve">?@fig-aeroflux2-arch</w:t>
-      </w:r>
-      <w:r>
-        <w:t xml:space="preserve">.</w:t>
-      </w:r>
-    </w:p>
-    <w:p>
-      <w:pPr>
-        <w:pStyle w:val="BodyText"/>
-      </w:pPr>
-      <w:r>
-        <w:rPr>
-          <w:b/>
-          <w:bCs/>
-        </w:rPr>
-        <w:t xml:space="preserve">Ingestion and streaming.</w:t>
-      </w:r>
-      <w:r>
-        <w:t xml:space="preserve"> </w:t>
-      </w:r>
-      <w:r>
-        <w:t xml:space="preserve">Dedicated services publish each source—SWIM flight</w:t>
-      </w:r>
-      <w:r>
-        <w:t xml:space="preserve"> </w:t>
-      </w:r>
-      <w:r>
-        <w:t xml:space="preserve">messages, ADS-B, and weather—to a dedicated Apache Kafka topic with 48-hour</w:t>
-      </w:r>
-      <w:r>
-        <w:t xml:space="preserve"> </w:t>
-      </w:r>
-      <w:r>
-        <w:t xml:space="preserve">retention, decoupling producers from consumers and providing a replayable event</w:t>
-      </w:r>
-      <w:r>
-        <w:t xml:space="preserve"> </w:t>
-      </w:r>
-      <w:r>
-        <w:t xml:space="preserve">history. A Kafka-consuming stream processor applies the</w:t>
-      </w:r>
-      <w:r>
-        <w:t xml:space="preserve"> </w:t>
-      </w:r>
-      <w:r>
-        <w:rPr>
-          <w:rStyle w:val="VerbatimChar"/>
-        </w:rPr>
-        <w:t xml:space="preserve">aeroflux_parser</w:t>
-      </w:r>
-      <w:r>
-        <w:t xml:space="preserve"> </w:t>
-      </w:r>
-      <w:r>
-        <w:t xml:space="preserve">library to validate each message against a strict schema contract and fuse</w:t>
-      </w:r>
-      <w:r>
-        <w:t xml:space="preserve"> </w:t>
-      </w:r>
-      <w:r>
-        <w:t xml:space="preserve">messages into per-flight canonical records—keyed on the stable GUFI, with ADS-B</w:t>
-      </w:r>
-      <w:r>
-        <w:t xml:space="preserve"> </w:t>
-      </w:r>
-      <w:r>
-        <w:t xml:space="preserve">used to resolve the aircraft tail that SWIM omits. The same feature and inference</w:t>
-      </w:r>
-      <w:r>
-        <w:t xml:space="preserve"> </w:t>
-      </w:r>
-      <w:r>
-        <w:t xml:space="preserve">core runs on Polars for single-node deployment and executes within Apache Spark</w:t>
-      </w:r>
-      <w:r>
-        <w:t xml:space="preserve"> </w:t>
-      </w:r>
-      <w:r>
-        <w:t xml:space="preserve">Structured Streaming’s</w:t>
-      </w:r>
-      <w:r>
-        <w:t xml:space="preserve"> </w:t>
-      </w:r>
-      <w:r>
-        <w:rPr>
-          <w:rStyle w:val="VerbatimChar"/>
-        </w:rPr>
-        <w:t xml:space="preserve">foreachBatch</w:t>
-      </w:r>
-      <w:r>
-        <w:t xml:space="preserve"> </w:t>
-      </w:r>
-      <w:r>
-        <w:t xml:space="preserve">for distributed scale-out, so the platform</w:t>
-      </w:r>
-      <w:r>
-        <w:t xml:space="preserve"> </w:t>
-      </w:r>
-      <w:r>
-        <w:t xml:space="preserve">spans laptop to cluster without a rewrite.</w:t>
-      </w:r>
-    </w:p>
-    <w:p>
-      <w:pPr>
-        <w:pStyle w:val="BodyText"/>
-      </w:pPr>
-      <w:r>
-        <w:rPr>
-          <w:b/>
-          <w:bCs/>
-        </w:rPr>
-        <w:t xml:space="preserve">Storage tiers and retention.</w:t>
-      </w:r>
-      <w:r>
-        <w:t xml:space="preserve"> </w:t>
-      </w:r>
-      <w:r>
-        <w:t xml:space="preserve">Processing follows a bronze → silver → gold</w:t>
-      </w:r>
-      <w:r>
-        <w:t xml:space="preserve"> </w:t>
-      </w:r>
-      <w:r>
-        <w:t xml:space="preserve">progression. Raw and fused per-flight state are held hot in PostgreSQL on a</w:t>
-      </w:r>
-      <w:r>
-        <w:t xml:space="preserve"> </w:t>
-      </w:r>
-      <w:r>
-        <w:t xml:space="preserve">rolling 48-hour window; current per-flight predictions are served from a NoSQL</w:t>
-      </w:r>
-      <w:r>
-        <w:t xml:space="preserve"> </w:t>
-      </w:r>
-      <w:r>
-        <w:t xml:space="preserve">store (Amazon DynamoDB in the cloud); and canonical and gold feature/label tables</w:t>
-      </w:r>
-      <w:r>
-        <w:t xml:space="preserve"> </w:t>
-      </w:r>
-      <w:r>
-        <w:t xml:space="preserve">are written as partitioned Parquet to a MinIO / Amazon S3 data lake, queryable in</w:t>
-      </w:r>
-      <w:r>
-        <w:t xml:space="preserve"> </w:t>
-      </w:r>
-      <w:r>
-        <w:t xml:space="preserve">place through Amazon Athena over an AWS Glue catalog. Short retention keeps the</w:t>
-      </w:r>
-      <w:r>
-        <w:t xml:space="preserve"> </w:t>
-      </w:r>
-      <w:r>
-        <w:t xml:space="preserve">streaming footprint small and low-cost, while the lake retains durable history</w:t>
-      </w:r>
-      <w:r>
-        <w:t xml:space="preserve"> </w:t>
-      </w:r>
-      <w:r>
-        <w:t xml:space="preserve">for training and replay. Because storage backends sit behind configuration, the</w:t>
-      </w:r>
-      <w:r>
-        <w:t xml:space="preserve"> </w:t>
-      </w:r>
-      <w:r>
-        <w:t xml:space="preserve">local stack (PostgreSQL, MinIO) swaps to managed cloud services (RDS, S3) with no</w:t>
-      </w:r>
-      <w:r>
-        <w:t xml:space="preserve"> </w:t>
-      </w:r>
-      <w:r>
-        <w:t xml:space="preserve">code change.</w:t>
-      </w:r>
-    </w:p>
-    <w:p>
-      <w:pPr>
-        <w:pStyle w:val="BodyText"/>
-      </w:pPr>
-      <w:r>
-        <w:rPr>
-          <w:b/>
-          <w:bCs/>
-        </w:rPr>
-        <w:t xml:space="preserve">Machine learning.</w:t>
-      </w:r>
-      <w:r>
-        <w:t xml:space="preserve"> </w:t>
-      </w:r>
-      <w:r>
-        <w:t xml:space="preserve">The pipeline establishes a logistic-regression</w:t>
-      </w:r>
-      <w:r>
-        <w:t xml:space="preserve"> </w:t>
-      </w:r>
-      <w:r>
-        <w:rPr>
-          <w:i/>
-          <w:iCs/>
-        </w:rPr>
-        <w:t xml:space="preserve">baseline</w:t>
-      </w:r>
-      <w:r>
-        <w:t xml:space="preserve"> </w:t>
-      </w:r>
-      <w:r>
-        <w:t xml:space="preserve">on flight-level features and an advanced gradient-boosted model (XGBoost) that</w:t>
-      </w:r>
-      <w:r>
-        <w:t xml:space="preserve"> </w:t>
-      </w:r>
-      <w:r>
-        <w:t xml:space="preserve">improves on it by adding propagation, weather, and rolling airport-demand</w:t>
-      </w:r>
-      <w:r>
-        <w:t xml:space="preserve"> </w:t>
-      </w:r>
-      <w:r>
-        <w:t xml:space="preserve">features</w:t>
-      </w:r>
-      <w:r>
-        <w:t xml:space="preserve"> </w:t>
-      </w:r>
-      <w:r>
-        <w:t xml:space="preserve">(Beatty et al., 1999; Chen &amp; Guestrin, 2016; Kafle &amp; Zou, 2016)</w:t>
-      </w:r>
-      <w:r>
-        <w:t xml:space="preserve">.</w:t>
-      </w:r>
-      <w:r>
-        <w:t xml:space="preserve"> </w:t>
-      </w:r>
-      <w:r>
-        <w:t xml:space="preserve">Feature engineering is expressed once in a source-agnostic core, so historical</w:t>
-      </w:r>
-      <w:r>
-        <w:t xml:space="preserve"> </w:t>
-      </w:r>
-      <w:r>
-        <w:t xml:space="preserve">(BTS) training and live serving compute identical features by construction; that</w:t>
-      </w:r>
-      <w:r>
-        <w:t xml:space="preserve"> </w:t>
-      </w:r>
-      <w:r>
-        <w:t xml:space="preserve">core runs on Polars locally for development and within Spark at scale. For</w:t>
-      </w:r>
-      <w:r>
-        <w:t xml:space="preserve"> </w:t>
-      </w:r>
-      <w:r>
-        <w:t xml:space="preserve">historical training, weather is drawn from a cached NOAA NCEI archive; live</w:t>
-      </w:r>
-      <w:r>
-        <w:t xml:space="preserve"> </w:t>
-      </w:r>
-      <w:r>
-        <w:t xml:space="preserve">serving uses METAR observations mapped into the same feature schema, preserving</w:t>
-      </w:r>
-      <w:r>
-        <w:t xml:space="preserve"> </w:t>
-      </w:r>
-      <w:r>
-        <w:t xml:space="preserve">train/serve parity at the feature level. Both models target a 15-minute</w:t>
-      </w:r>
-      <w:r>
-        <w:t xml:space="preserve"> </w:t>
-      </w:r>
-      <w:r>
-        <w:t xml:space="preserve">arrival-delay classification, are tracked in a run registry (with optional MLflow</w:t>
-      </w:r>
-      <w:r>
-        <w:t xml:space="preserve"> </w:t>
-      </w:r>
-      <w:r>
-        <w:t xml:space="preserve">integration), and are explained with SHAP</w:t>
-      </w:r>
-      <w:r>
-        <w:t xml:space="preserve"> </w:t>
-      </w:r>
-      <w:r>
-        <w:t xml:space="preserve">(Lundberg &amp; Lee, 2017)</w:t>
-      </w:r>
-      <w:r>
-        <w:t xml:space="preserve">.</w:t>
-      </w:r>
-    </w:p>
-    <w:p>
-      <w:pPr>
-        <w:pStyle w:val="BodyText"/>
-      </w:pPr>
-      <w:r>
-        <w:rPr>
-          <w:b/>
-          <w:bCs/>
-        </w:rPr>
-        <w:t xml:space="preserve">AI orchestration prototype.</w:t>
-      </w:r>
-      <w:r>
-        <w:t xml:space="preserve"> </w:t>
-      </w:r>
-      <w:r>
-        <w:t xml:space="preserve">A lightweight</w:t>
-      </w:r>
-      <w:r>
-        <w:t xml:space="preserve"> </w:t>
-      </w:r>
-      <w:r>
-        <w:rPr>
-          <w:i/>
-          <w:iCs/>
-        </w:rPr>
-        <w:t xml:space="preserve">Aviation Operations Analyst</w:t>
-      </w:r>
-      <w:r>
-        <w:t xml:space="preserve"> </w:t>
-      </w:r>
-      <w:r>
-        <w:t xml:space="preserve">uses</w:t>
-      </w:r>
-      <w:r>
-        <w:t xml:space="preserve"> </w:t>
-      </w:r>
-      <w:r>
-        <w:t xml:space="preserve">retrieval-augmented generation</w:t>
-      </w:r>
-      <w:r>
-        <w:t xml:space="preserve"> </w:t>
-      </w:r>
-      <w:r>
-        <w:t xml:space="preserve">(Lewis et al., 2020)</w:t>
-      </w:r>
-      <w:r>
-        <w:t xml:space="preserve"> </w:t>
-      </w:r>
-      <w:r>
-        <w:t xml:space="preserve">and a constrained LangGraph</w:t>
-      </w:r>
-      <w:r>
-        <w:t xml:space="preserve"> </w:t>
-      </w:r>
-      <w:r>
-        <w:t xml:space="preserve">workflow over a curated aviation-document corpus to produce cited, evidence-</w:t>
-      </w:r>
-      <w:r>
-        <w:t xml:space="preserve"> </w:t>
-      </w:r>
-      <w:r>
-        <w:t xml:space="preserve">grounded briefs; it does not touch live streaming data or make operational</w:t>
-      </w:r>
-      <w:r>
-        <w:t xml:space="preserve"> </w:t>
-      </w:r>
-      <w:r>
-        <w:t xml:space="preserve">decisions, and is evaluated on a small set of reviewed questions for</w:t>
-      </w:r>
-      <w:r>
-        <w:t xml:space="preserve"> </w:t>
-      </w:r>
-      <w:r>
-        <w:t xml:space="preserve">groundedness, citation accuracy, and appropriate tool use. As an optional stretch</w:t>
-      </w:r>
-      <w:r>
-        <w:t xml:space="preserve"> </w:t>
-      </w:r>
-      <w:r>
-        <w:t xml:space="preserve">goal, a read-only Model Context Protocol (MCP) server may expose these tools</w:t>
-      </w:r>
-      <w:r>
-        <w:t xml:space="preserve"> </w:t>
-      </w:r>
-      <w:r>
-        <w:t xml:space="preserve">through a standardized interface.</w:t>
-      </w:r>
-    </w:p>
-    <w:p>
-      <w:pPr>
-        <w:pStyle w:val="BodyText"/>
-      </w:pPr>
-      <w:r>
-        <w:rPr>
-          <w:b/>
-          <w:bCs/>
-        </w:rPr>
-        <w:t xml:space="preserve">Evaluation.</w:t>
-      </w:r>
-      <w:r>
-        <w:t xml:space="preserve"> </w:t>
-      </w:r>
-      <w:r>
-        <w:t xml:space="preserve">We evaluate at two levels, each against an explicit baseline.</w:t>
-      </w:r>
-    </w:p>
-    <w:p>
-      <w:pPr>
-        <w:pStyle w:val="BodyText"/>
-      </w:pPr>
-      <w:r>
-        <w:rPr>
-          <w:i/>
-          <w:iCs/>
-        </w:rPr>
-        <w:t xml:space="preserve">Predictive (model) baseline.</w:t>
-      </w:r>
-      <w:r>
-        <w:t xml:space="preserve"> </w:t>
-      </w:r>
-      <w:r>
-        <w:t xml:space="preserve">The logistic-regression classifier is the</w:t>
-      </w:r>
-      <w:r>
-        <w:t xml:space="preserve"> </w:t>
-      </w:r>
-      <w:r>
-        <w:t xml:space="preserve">baseline; the advanced XGBoost model is the improvement. Both target a 15-minute</w:t>
-      </w:r>
-      <w:r>
-        <w:t xml:space="preserve"> </w:t>
-      </w:r>
-      <w:r>
-        <w:t xml:space="preserve">arrival-delay classification and are compared on ROC-AUC, PR-AUC, F1, and Brier</w:t>
-      </w:r>
-      <w:r>
-        <w:t xml:space="preserve"> </w:t>
-      </w:r>
-      <w:r>
-        <w:t xml:space="preserve">score with calibration, using point-in-time features to prevent leakage. We also</w:t>
-      </w:r>
-      <w:r>
-        <w:t xml:space="preserve"> </w:t>
-      </w:r>
-      <w:r>
-        <w:t xml:space="preserve">report train/serve behavior honestly: because rotation and recent-delay features</w:t>
-      </w:r>
-      <w:r>
-        <w:t xml:space="preserve"> </w:t>
-      </w:r>
-      <w:r>
-        <w:t xml:space="preserve">are dense in historical training but sparse in live serving—airframe resolution</w:t>
-      </w:r>
-      <w:r>
-        <w:t xml:space="preserve"> </w:t>
-      </w:r>
-      <w:r>
-        <w:t xml:space="preserve">depends on ADS-B coverage—live predictions exhibit a distribution shift we</w:t>
-      </w:r>
-      <w:r>
-        <w:t xml:space="preserve"> </w:t>
-      </w:r>
-      <w:r>
-        <w:t xml:space="preserve">quantify and discuss, with probability calibration identified as future work.</w:t>
-      </w:r>
-    </w:p>
-    <w:p>
-      <w:pPr>
-        <w:pStyle w:val="BodyText"/>
-      </w:pPr>
-      <w:r>
-        <w:rPr>
-          <w:i/>
-          <w:iCs/>
-        </w:rPr>
-        <w:t xml:space="preserve">System baseline.</w:t>
-      </w:r>
-      <w:r>
-        <w:t xml:space="preserve"> </w:t>
-      </w:r>
-      <w:r>
-        <w:t xml:space="preserve">The system is evaluated on sustained throughput (messages per</w:t>
-      </w:r>
-      <w:r>
-        <w:t xml:space="preserve"> </w:t>
-      </w:r>
-      <w:r>
-        <w:t xml:space="preserve">second), ingestion-to-gold latency, airframe-resolution coverage (the share of</w:t>
-      </w:r>
-      <w:r>
-        <w:t xml:space="preserve"> </w:t>
-      </w:r>
-      <w:r>
-        <w:t xml:space="preserve">live flights linked to an ADS-B airframe), fusion completeness (per-flight field</w:t>
-      </w:r>
-      <w:r>
-        <w:t xml:space="preserve"> </w:t>
-      </w:r>
-      <w:r>
-        <w:t xml:space="preserve">fill rates), and resource footprint. Baseline measurements are taken at initial</w:t>
-      </w:r>
-      <w:r>
-        <w:t xml:space="preserve"> </w:t>
-      </w:r>
-      <w:r>
-        <w:t xml:space="preserve">deployment and compared against achieved performance after optimization,</w:t>
-      </w:r>
-      <w:r>
-        <w:t xml:space="preserve"> </w:t>
-      </w:r>
-      <w:r>
-        <w:t xml:space="preserve">demonstrating that the pipeline moves data correctly and at scale through every</w:t>
-      </w:r>
-      <w:r>
-        <w:t xml:space="preserve"> </w:t>
-      </w:r>
-      <w:r>
-        <w:t xml:space="preserve">tier.</w:t>
-      </w:r>
-    </w:p>
-    <w:bookmarkEnd w:id="16"/>
-    <w:bookmarkStart w:id="18" w:name="development-environment"/>
-    <w:p>
-      <w:pPr>
-        <w:pStyle w:val="Heading1"/>
-      </w:pPr>
-      <w:r>
-        <w:t xml:space="preserve">6. Development Environment</w:t>
-      </w:r>
-    </w:p>
-    <w:p>
-      <w:pPr>
-        <w:pStyle w:val="FirstParagraph"/>
-      </w:pPr>
-      <w:r>
-        <w:t xml:space="preserve">The stack (</w:t>
-      </w:r>
-      <w:hyperlink w:anchor="tbl-stack">
+      <w:hyperlink w:anchor="fig-aeroflux2-arch">
         <w:r>
           <w:rPr>
             <w:rStyle w:val="Hyperlink"/>
           </w:rPr>
-          <w:t xml:space="preserve">Table 2</w:t>
+          <w:t xml:space="preserve">Figure 1</w:t>
         </w:r>
       </w:hyperlink>
       <w:r>
-        <w:t xml:space="preserve">) is entirely open-source and container-first. Every</w:t>
-      </w:r>
-      <w:r>
-        <w:t xml:space="preserve"> </w:t>
-      </w:r>
-      <w:r>
-        <w:t xml:space="preserve">component runs as a Docker Compose service, so the platform deploys unchanged on</w:t>
-      </w:r>
-      <w:r>
-        <w:t xml:space="preserve"> </w:t>
-      </w:r>
-      <w:r>
-        <w:t xml:space="preserve">a laptop, university hardware, or a single cloud VM; managed AWS services (MSK,</w:t>
-      </w:r>
-      <w:r>
-        <w:t xml:space="preserve"> </w:t>
-      </w:r>
-      <w:r>
-        <w:t xml:space="preserve">EMR, SageMaker) are an optional scale path rather than a requirement. MinIO</w:t>
-      </w:r>
-      <w:r>
-        <w:t xml:space="preserve"> </w:t>
-      </w:r>
-      <w:r>
-        <w:t xml:space="preserve">provides an S3-compatible object store that swaps to real S3 with no code change.</w:t>
-      </w:r>
-      <w:r>
-        <w:t xml:space="preserve"> </w:t>
-      </w:r>
-      <w:r>
-        <w:t xml:space="preserve">Short retention keeps storage and cost minimal (target budget: a modest VM plus a</w:t>
-      </w:r>
-      <w:r>
-        <w:t xml:space="preserve"> </w:t>
-      </w:r>
-      <w:r>
-        <w:t xml:space="preserve">few dollars of LLM API usage).</w:t>
+        <w:t xml:space="preserve">.</w:t>
       </w:r>
     </w:p>
     <w:tbl>
@@ -3024,7 +2465,651 @@
       <w:tr>
         <w:tc>
           <w:tcPr/>
-          <w:bookmarkStart w:id="17" w:name="tbl-stack"/>
+          <w:bookmarkStart w:id="19" w:name="fig-aeroflux2-arch"/>
+          <w:p>
+            <w:pPr>
+              <w:pStyle w:val="Compact"/>
+              <w:jc w:val="center"/>
+            </w:pPr>
+            <w:r>
+              <w:drawing>
+                <wp:inline>
+                  <wp:extent cx="5334000" cy="3801364"/>
+                  <wp:effectExtent b="0" l="0" r="0" t="0"/>
+                  <wp:docPr descr="" title="" id="17" name="Picture"/>
+                  <a:graphic>
+                    <a:graphicData uri="http://schemas.openxmlformats.org/drawingml/2006/picture">
+                      <pic:pic>
+                        <pic:nvPicPr>
+                          <pic:cNvPr descr="images/design/aeroflux2-arch-v2.png" id="18" name="Picture"/>
+                          <pic:cNvPicPr>
+                            <a:picLocks noChangeArrowheads="1" noChangeAspect="1"/>
+                          </pic:cNvPicPr>
+                        </pic:nvPicPr>
+                        <pic:blipFill>
+                          <a:blip r:embed="rId16"/>
+                          <a:stretch>
+                            <a:fillRect/>
+                          </a:stretch>
+                        </pic:blipFill>
+                        <pic:spPr bwMode="auto">
+                          <a:xfrm>
+                            <a:off x="0" y="0"/>
+                            <a:ext cx="5334000" cy="3801364"/>
+                          </a:xfrm>
+                          <a:prstGeom prst="rect">
+                            <a:avLst/>
+                          </a:prstGeom>
+                          <a:noFill/>
+                          <a:ln w="9525">
+                            <a:noFill/>
+                            <a:headEnd/>
+                            <a:tailEnd/>
+                          </a:ln>
+                        </pic:spPr>
+                      </pic:pic>
+                    </a:graphicData>
+                  </a:graphic>
+                </wp:inline>
+              </w:drawing>
+            </w:r>
+          </w:p>
+          <w:p>
+            <w:pPr>
+              <w:jc w:val="center"/>
+            </w:pPr>
+            <w:pPr>
+              <w:jc w:val="left"/>
+              <w:spacing w:before="200"/>
+              <w:pStyle w:val="ImageCaption"/>
+            </w:pPr>
+            <w:r>
+              <w:t xml:space="preserve">Figure 1: AeroFlux Stage 2 system architecture: Real-Time Fusion, ML, and Analyst Architecture. Hybrid Solution: On-Prem and Cloud.</w:t>
+            </w:r>
+          </w:p>
+          <w:bookmarkEnd w:id="19"/>
+        </w:tc>
+      </w:tr>
+    </w:tbl>
+    <w:p>
+      <w:pPr>
+        <w:pStyle w:val="BodyText"/>
+      </w:pPr>
+      <w:r>
+        <w:rPr>
+          <w:b/>
+          <w:bCs/>
+        </w:rPr>
+        <w:t xml:space="preserve">Ingestion and streaming.</w:t>
+      </w:r>
+      <w:r>
+        <w:t xml:space="preserve"> </w:t>
+      </w:r>
+      <w:r>
+        <w:t xml:space="preserve">Dedicated services publish each source—SWIM flight</w:t>
+      </w:r>
+      <w:r>
+        <w:t xml:space="preserve"> </w:t>
+      </w:r>
+      <w:r>
+        <w:t xml:space="preserve">messages, ADS-B, and weather—to a dedicated Apache Kafka topic with 48-hour</w:t>
+      </w:r>
+      <w:r>
+        <w:t xml:space="preserve"> </w:t>
+      </w:r>
+      <w:r>
+        <w:t xml:space="preserve">retention, decoupling producers from consumers and providing a replayable event</w:t>
+      </w:r>
+      <w:r>
+        <w:t xml:space="preserve"> </w:t>
+      </w:r>
+      <w:r>
+        <w:t xml:space="preserve">history. A Kafka-consuming stream processor applies the</w:t>
+      </w:r>
+      <w:r>
+        <w:t xml:space="preserve"> </w:t>
+      </w:r>
+      <w:r>
+        <w:rPr>
+          <w:rStyle w:val="VerbatimChar"/>
+        </w:rPr>
+        <w:t xml:space="preserve">aeroflux_parser</w:t>
+      </w:r>
+      <w:r>
+        <w:t xml:space="preserve"> </w:t>
+      </w:r>
+      <w:r>
+        <w:t xml:space="preserve">library to validate each message against a strict schema contract and fuse</w:t>
+      </w:r>
+      <w:r>
+        <w:t xml:space="preserve"> </w:t>
+      </w:r>
+      <w:r>
+        <w:t xml:space="preserve">messages into per-flight canonical records—keyed on the stable GUFI, with ADS-B</w:t>
+      </w:r>
+      <w:r>
+        <w:t xml:space="preserve"> </w:t>
+      </w:r>
+      <w:r>
+        <w:t xml:space="preserve">used to resolve the aircraft tail that SWIM omits. The same feature and inference</w:t>
+      </w:r>
+      <w:r>
+        <w:t xml:space="preserve"> </w:t>
+      </w:r>
+      <w:r>
+        <w:t xml:space="preserve">core runs on Polars for single-node deployment and executes within Apache Spark</w:t>
+      </w:r>
+      <w:r>
+        <w:t xml:space="preserve"> </w:t>
+      </w:r>
+      <w:r>
+        <w:t xml:space="preserve">Structured Streaming’s</w:t>
+      </w:r>
+      <w:r>
+        <w:t xml:space="preserve"> </w:t>
+      </w:r>
+      <w:r>
+        <w:rPr>
+          <w:rStyle w:val="VerbatimChar"/>
+        </w:rPr>
+        <w:t xml:space="preserve">foreachBatch</w:t>
+      </w:r>
+      <w:r>
+        <w:t xml:space="preserve"> </w:t>
+      </w:r>
+      <w:r>
+        <w:t xml:space="preserve">for distributed scale-out, so the platform</w:t>
+      </w:r>
+      <w:r>
+        <w:t xml:space="preserve"> </w:t>
+      </w:r>
+      <w:r>
+        <w:t xml:space="preserve">spans laptop to cluster without a rewrite.</w:t>
+      </w:r>
+    </w:p>
+    <w:p>
+      <w:pPr>
+        <w:pStyle w:val="BodyText"/>
+      </w:pPr>
+      <w:r>
+        <w:rPr>
+          <w:b/>
+          <w:bCs/>
+        </w:rPr>
+        <w:t xml:space="preserve">Storage tiers and retention.</w:t>
+      </w:r>
+      <w:r>
+        <w:t xml:space="preserve"> </w:t>
+      </w:r>
+      <w:r>
+        <w:t xml:space="preserve">Processing follows a bronze → silver → gold</w:t>
+      </w:r>
+      <w:r>
+        <w:t xml:space="preserve"> </w:t>
+      </w:r>
+      <w:r>
+        <w:t xml:space="preserve">progression. Raw and fused per-flight state are held hot in PostgreSQL on a</w:t>
+      </w:r>
+      <w:r>
+        <w:t xml:space="preserve"> </w:t>
+      </w:r>
+      <w:r>
+        <w:t xml:space="preserve">rolling 48-hour window; current per-flight predictions are served from a NoSQL</w:t>
+      </w:r>
+      <w:r>
+        <w:t xml:space="preserve"> </w:t>
+      </w:r>
+      <w:r>
+        <w:t xml:space="preserve">store (Amazon DynamoDB in the cloud); and canonical and gold feature/label tables</w:t>
+      </w:r>
+      <w:r>
+        <w:t xml:space="preserve"> </w:t>
+      </w:r>
+      <w:r>
+        <w:t xml:space="preserve">are written as partitioned Parquet to a MinIO / Amazon S3 data lake, queryable in</w:t>
+      </w:r>
+      <w:r>
+        <w:t xml:space="preserve"> </w:t>
+      </w:r>
+      <w:r>
+        <w:t xml:space="preserve">place through Amazon Athena over an AWS Glue catalog. Short retention keeps the</w:t>
+      </w:r>
+      <w:r>
+        <w:t xml:space="preserve"> </w:t>
+      </w:r>
+      <w:r>
+        <w:t xml:space="preserve">streaming footprint small and low-cost, while the lake retains durable history</w:t>
+      </w:r>
+      <w:r>
+        <w:t xml:space="preserve"> </w:t>
+      </w:r>
+      <w:r>
+        <w:t xml:space="preserve">for training and replay. Because storage backends sit behind configuration, the</w:t>
+      </w:r>
+      <w:r>
+        <w:t xml:space="preserve"> </w:t>
+      </w:r>
+      <w:r>
+        <w:t xml:space="preserve">local stack (PostgreSQL, MinIO) swaps to managed cloud services (RDS, S3) with no</w:t>
+      </w:r>
+      <w:r>
+        <w:t xml:space="preserve"> </w:t>
+      </w:r>
+      <w:r>
+        <w:t xml:space="preserve">code change.</w:t>
+      </w:r>
+    </w:p>
+    <w:p>
+      <w:pPr>
+        <w:pStyle w:val="BodyText"/>
+      </w:pPr>
+      <w:r>
+        <w:rPr>
+          <w:b/>
+          <w:bCs/>
+        </w:rPr>
+        <w:t xml:space="preserve">Machine learning.</w:t>
+      </w:r>
+      <w:r>
+        <w:t xml:space="preserve"> </w:t>
+      </w:r>
+      <w:r>
+        <w:t xml:space="preserve">The pipeline establishes a logistic-regression</w:t>
+      </w:r>
+      <w:r>
+        <w:t xml:space="preserve"> </w:t>
+      </w:r>
+      <w:r>
+        <w:rPr>
+          <w:i/>
+          <w:iCs/>
+        </w:rPr>
+        <w:t xml:space="preserve">baseline</w:t>
+      </w:r>
+      <w:r>
+        <w:t xml:space="preserve"> </w:t>
+      </w:r>
+      <w:r>
+        <w:t xml:space="preserve">on flight-level features and an advanced gradient-boosted model (XGBoost) that</w:t>
+      </w:r>
+      <w:r>
+        <w:t xml:space="preserve"> </w:t>
+      </w:r>
+      <w:r>
+        <w:t xml:space="preserve">improves on it by adding propagation, weather, and rolling airport-demand</w:t>
+      </w:r>
+      <w:r>
+        <w:t xml:space="preserve"> </w:t>
+      </w:r>
+      <w:r>
+        <w:t xml:space="preserve">features</w:t>
+      </w:r>
+      <w:r>
+        <w:t xml:space="preserve"> </w:t>
+      </w:r>
+      <w:r>
+        <w:t xml:space="preserve">(Beatty et al., 1999; Chen &amp; Guestrin, 2016; Kafle &amp; Zou, 2016)</w:t>
+      </w:r>
+      <w:r>
+        <w:t xml:space="preserve">.</w:t>
+      </w:r>
+      <w:r>
+        <w:t xml:space="preserve"> </w:t>
+      </w:r>
+      <w:r>
+        <w:t xml:space="preserve">Feature engineering is expressed once in a source-agnostic core, so historical</w:t>
+      </w:r>
+      <w:r>
+        <w:t xml:space="preserve"> </w:t>
+      </w:r>
+      <w:r>
+        <w:t xml:space="preserve">(BTS) training and live serving compute identical features by construction; that</w:t>
+      </w:r>
+      <w:r>
+        <w:t xml:space="preserve"> </w:t>
+      </w:r>
+      <w:r>
+        <w:t xml:space="preserve">core runs on Polars locally for development and within Spark at scale. For</w:t>
+      </w:r>
+      <w:r>
+        <w:t xml:space="preserve"> </w:t>
+      </w:r>
+      <w:r>
+        <w:t xml:space="preserve">historical training, weather is drawn from a cached NOAA NCEI archive; live</w:t>
+      </w:r>
+      <w:r>
+        <w:t xml:space="preserve"> </w:t>
+      </w:r>
+      <w:r>
+        <w:t xml:space="preserve">serving uses METAR observations mapped into the same feature schema, preserving</w:t>
+      </w:r>
+      <w:r>
+        <w:t xml:space="preserve"> </w:t>
+      </w:r>
+      <w:r>
+        <w:t xml:space="preserve">train/serve parity at the feature level. Both models target a 15-minute</w:t>
+      </w:r>
+      <w:r>
+        <w:t xml:space="preserve"> </w:t>
+      </w:r>
+      <w:r>
+        <w:t xml:space="preserve">arrival-delay classification, are tracked in a run registry (with optional MLflow</w:t>
+      </w:r>
+      <w:r>
+        <w:t xml:space="preserve"> </w:t>
+      </w:r>
+      <w:r>
+        <w:t xml:space="preserve">integration), and are explained with SHAP</w:t>
+      </w:r>
+      <w:r>
+        <w:t xml:space="preserve"> </w:t>
+      </w:r>
+      <w:r>
+        <w:t xml:space="preserve">(Lundberg &amp; Lee, 2017)</w:t>
+      </w:r>
+      <w:r>
+        <w:t xml:space="preserve">.</w:t>
+      </w:r>
+    </w:p>
+    <w:p>
+      <w:pPr>
+        <w:pStyle w:val="BodyText"/>
+      </w:pPr>
+      <w:r>
+        <w:rPr>
+          <w:b/>
+          <w:bCs/>
+        </w:rPr>
+        <w:t xml:space="preserve">AI orchestration prototype.</w:t>
+      </w:r>
+      <w:r>
+        <w:t xml:space="preserve"> </w:t>
+      </w:r>
+      <w:r>
+        <w:t xml:space="preserve">A lightweight</w:t>
+      </w:r>
+      <w:r>
+        <w:t xml:space="preserve"> </w:t>
+      </w:r>
+      <w:r>
+        <w:rPr>
+          <w:i/>
+          <w:iCs/>
+        </w:rPr>
+        <w:t xml:space="preserve">Aviation Operations Analyst</w:t>
+      </w:r>
+      <w:r>
+        <w:t xml:space="preserve"> </w:t>
+      </w:r>
+      <w:r>
+        <w:t xml:space="preserve">uses</w:t>
+      </w:r>
+      <w:r>
+        <w:t xml:space="preserve"> </w:t>
+      </w:r>
+      <w:r>
+        <w:t xml:space="preserve">retrieval-augmented generation</w:t>
+      </w:r>
+      <w:r>
+        <w:t xml:space="preserve"> </w:t>
+      </w:r>
+      <w:r>
+        <w:t xml:space="preserve">(Lewis et al., 2020)</w:t>
+      </w:r>
+      <w:r>
+        <w:t xml:space="preserve"> </w:t>
+      </w:r>
+      <w:r>
+        <w:t xml:space="preserve">and a constrained LangGraph</w:t>
+      </w:r>
+      <w:r>
+        <w:t xml:space="preserve"> </w:t>
+      </w:r>
+      <w:r>
+        <w:t xml:space="preserve">workflow over a curated aviation-document corpus to produce cited, evidence-</w:t>
+      </w:r>
+      <w:r>
+        <w:t xml:space="preserve"> </w:t>
+      </w:r>
+      <w:r>
+        <w:t xml:space="preserve">grounded briefs; it does not touch live streaming data or make operational</w:t>
+      </w:r>
+      <w:r>
+        <w:t xml:space="preserve"> </w:t>
+      </w:r>
+      <w:r>
+        <w:t xml:space="preserve">decisions, and is evaluated on a small set of reviewed questions for</w:t>
+      </w:r>
+      <w:r>
+        <w:t xml:space="preserve"> </w:t>
+      </w:r>
+      <w:r>
+        <w:t xml:space="preserve">groundedness, citation accuracy, and appropriate tool use. As an optional stretch</w:t>
+      </w:r>
+      <w:r>
+        <w:t xml:space="preserve"> </w:t>
+      </w:r>
+      <w:r>
+        <w:t xml:space="preserve">goal, a read-only Model Context Protocol (MCP) server may expose these tools</w:t>
+      </w:r>
+      <w:r>
+        <w:t xml:space="preserve"> </w:t>
+      </w:r>
+      <w:r>
+        <w:t xml:space="preserve">through a standardized interface.</w:t>
+      </w:r>
+    </w:p>
+    <w:p>
+      <w:pPr>
+        <w:pStyle w:val="BodyText"/>
+      </w:pPr>
+      <w:r>
+        <w:rPr>
+          <w:b/>
+          <w:bCs/>
+        </w:rPr>
+        <w:t xml:space="preserve">Evaluation.</w:t>
+      </w:r>
+      <w:r>
+        <w:t xml:space="preserve"> </w:t>
+      </w:r>
+      <w:r>
+        <w:t xml:space="preserve">We evaluate at two levels, each against an explicit baseline.</w:t>
+      </w:r>
+    </w:p>
+    <w:p>
+      <w:pPr>
+        <w:pStyle w:val="BodyText"/>
+      </w:pPr>
+      <w:r>
+        <w:rPr>
+          <w:i/>
+          <w:iCs/>
+        </w:rPr>
+        <w:t xml:space="preserve">Predictive (model) baseline.</w:t>
+      </w:r>
+      <w:r>
+        <w:t xml:space="preserve"> </w:t>
+      </w:r>
+      <w:r>
+        <w:t xml:space="preserve">The logistic-regression classifier is the</w:t>
+      </w:r>
+      <w:r>
+        <w:t xml:space="preserve"> </w:t>
+      </w:r>
+      <w:r>
+        <w:t xml:space="preserve">baseline; the advanced XGBoost model is the improvement. Both target a 15-minute</w:t>
+      </w:r>
+      <w:r>
+        <w:t xml:space="preserve"> </w:t>
+      </w:r>
+      <w:r>
+        <w:t xml:space="preserve">arrival-delay classification and are compared on ROC-AUC, PR-AUC, F1, and Brier</w:t>
+      </w:r>
+      <w:r>
+        <w:t xml:space="preserve"> </w:t>
+      </w:r>
+      <w:r>
+        <w:t xml:space="preserve">score with calibration, using point-in-time features to prevent leakage. We also</w:t>
+      </w:r>
+      <w:r>
+        <w:t xml:space="preserve"> </w:t>
+      </w:r>
+      <w:r>
+        <w:t xml:space="preserve">report train/serve behavior honestly: because rotation and recent-delay features</w:t>
+      </w:r>
+      <w:r>
+        <w:t xml:space="preserve"> </w:t>
+      </w:r>
+      <w:r>
+        <w:t xml:space="preserve">are dense in historical training but sparse in live serving—airframe resolution</w:t>
+      </w:r>
+      <w:r>
+        <w:t xml:space="preserve"> </w:t>
+      </w:r>
+      <w:r>
+        <w:t xml:space="preserve">depends on ADS-B coverage—live predictions exhibit a distribution shift we</w:t>
+      </w:r>
+      <w:r>
+        <w:t xml:space="preserve"> </w:t>
+      </w:r>
+      <w:r>
+        <w:t xml:space="preserve">quantify and discuss, with probability calibration identified as future work.</w:t>
+      </w:r>
+    </w:p>
+    <w:p>
+      <w:pPr>
+        <w:pStyle w:val="BodyText"/>
+      </w:pPr>
+      <w:r>
+        <w:rPr>
+          <w:i/>
+          <w:iCs/>
+        </w:rPr>
+        <w:t xml:space="preserve">System baseline.</w:t>
+      </w:r>
+      <w:r>
+        <w:t xml:space="preserve"> </w:t>
+      </w:r>
+      <w:r>
+        <w:t xml:space="preserve">The system is evaluated on sustained throughput (messages per</w:t>
+      </w:r>
+      <w:r>
+        <w:t xml:space="preserve"> </w:t>
+      </w:r>
+      <w:r>
+        <w:t xml:space="preserve">second), ingestion-to-gold latency, airframe-resolution coverage (the share of</w:t>
+      </w:r>
+      <w:r>
+        <w:t xml:space="preserve"> </w:t>
+      </w:r>
+      <w:r>
+        <w:t xml:space="preserve">live flights linked to an ADS-B airframe), fusion completeness (per-flight field</w:t>
+      </w:r>
+      <w:r>
+        <w:t xml:space="preserve"> </w:t>
+      </w:r>
+      <w:r>
+        <w:t xml:space="preserve">fill rates), and resource footprint. Baseline measurements are taken at initial</w:t>
+      </w:r>
+      <w:r>
+        <w:t xml:space="preserve"> </w:t>
+      </w:r>
+      <w:r>
+        <w:t xml:space="preserve">deployment and compared against achieved performance after optimization,</w:t>
+      </w:r>
+      <w:r>
+        <w:t xml:space="preserve"> </w:t>
+      </w:r>
+      <w:r>
+        <w:t xml:space="preserve">demonstrating that the pipeline moves data correctly and at scale through every</w:t>
+      </w:r>
+      <w:r>
+        <w:t xml:space="preserve"> </w:t>
+      </w:r>
+      <w:r>
+        <w:t xml:space="preserve">tier.</w:t>
+      </w:r>
+    </w:p>
+    <w:bookmarkEnd w:id="20"/>
+    <w:bookmarkStart w:id="22" w:name="development-environment"/>
+    <w:p>
+      <w:pPr>
+        <w:pStyle w:val="Heading1"/>
+      </w:pPr>
+      <w:r>
+        <w:t xml:space="preserve">6. Development Environment</w:t>
+      </w:r>
+    </w:p>
+    <w:p>
+      <w:pPr>
+        <w:pStyle w:val="FirstParagraph"/>
+      </w:pPr>
+      <w:r>
+        <w:t xml:space="preserve">The stack (</w:t>
+      </w:r>
+      <w:hyperlink w:anchor="tbl-stack">
+        <w:r>
+          <w:rPr>
+            <w:rStyle w:val="Hyperlink"/>
+          </w:rPr>
+          <w:t xml:space="preserve">Table 2</w:t>
+        </w:r>
+      </w:hyperlink>
+      <w:r>
+        <w:t xml:space="preserve">) is entirely open-source and container-first. Every</w:t>
+      </w:r>
+      <w:r>
+        <w:t xml:space="preserve"> </w:t>
+      </w:r>
+      <w:r>
+        <w:t xml:space="preserve">component runs as a Docker Compose service, so the platform deploys unchanged on</w:t>
+      </w:r>
+      <w:r>
+        <w:t xml:space="preserve"> </w:t>
+      </w:r>
+      <w:r>
+        <w:t xml:space="preserve">a laptop, university hardware, or a single cloud VM; managed AWS services (MSK,</w:t>
+      </w:r>
+      <w:r>
+        <w:t xml:space="preserve"> </w:t>
+      </w:r>
+      <w:r>
+        <w:t xml:space="preserve">EMR, SageMaker) are an optional scale path rather than a requirement. MinIO</w:t>
+      </w:r>
+      <w:r>
+        <w:t xml:space="preserve"> </w:t>
+      </w:r>
+      <w:r>
+        <w:t xml:space="preserve">provides an S3-compatible object store that swaps to real S3 with no code change.</w:t>
+      </w:r>
+      <w:r>
+        <w:t xml:space="preserve"> </w:t>
+      </w:r>
+      <w:r>
+        <w:t xml:space="preserve">Short retention keeps storage and cost minimal (target budget: a modest VM plus a</w:t>
+      </w:r>
+      <w:r>
+        <w:t xml:space="preserve"> </w:t>
+      </w:r>
+      <w:r>
+        <w:t xml:space="preserve">few dollars of LLM API usage).</w:t>
+      </w:r>
+    </w:p>
+    <w:tbl>
+      <w:tblPr>
+        <w:tblStyle w:val="Table"/>
+        <w:tblW w:type="pct" w:w="5000"/>
+        <w:tblLayout w:type="fixed"/>
+        <w:tblLook w:firstRow="0" w:lastRow="0" w:firstColumn="0" w:lastColumn="0" w:noHBand="0" w:noVBand="0" w:val="0000"/>
+      </w:tblPr>
+      <w:tblGrid>
+        <w:gridCol w:w="7920"/>
+      </w:tblGrid>
+      <w:tr>
+        <w:tc>
+          <w:tcPr/>
+          <w:bookmarkStart w:id="21" w:name="tbl-stack"/>
           <w:p>
             <w:pPr>
               <w:jc w:val="center"/>
@@ -3391,13 +3476,13 @@
               </w:tc>
             </w:tr>
           </w:tbl>
-          <w:bookmarkEnd w:id="17"/>
+          <w:bookmarkEnd w:id="21"/>
           <w:p/>
         </w:tc>
       </w:tr>
     </w:tbl>
-    <w:bookmarkEnd w:id="18"/>
-    <w:bookmarkStart w:id="20" w:name="project-tasks-and-timeline"/>
+    <w:bookmarkEnd w:id="22"/>
+    <w:bookmarkStart w:id="24" w:name="project-tasks-and-timeline"/>
     <w:p>
       <w:pPr>
         <w:pStyle w:val="Heading1"/>
@@ -3462,7 +3547,7 @@
       <w:tr>
         <w:tc>
           <w:tcPr/>
-          <w:bookmarkStart w:id="19" w:name="tbl-timeline"/>
+          <w:bookmarkStart w:id="23" w:name="tbl-timeline"/>
           <w:p>
             <w:pPr>
               <w:jc w:val="center"/>
@@ -3682,13 +3767,13 @@
               </w:tc>
             </w:tr>
           </w:tbl>
-          <w:bookmarkEnd w:id="19"/>
+          <w:bookmarkEnd w:id="23"/>
           <w:p/>
         </w:tc>
       </w:tr>
     </w:tbl>
-    <w:bookmarkEnd w:id="20"/>
-    <w:bookmarkStart w:id="77" w:name="references"/>
+    <w:bookmarkEnd w:id="24"/>
+    <w:bookmarkStart w:id="81" w:name="references"/>
     <w:p>
       <w:pPr>
         <w:pStyle w:val="Heading1"/>
@@ -3697,8 +3782,8 @@
         <w:t xml:space="preserve">References</w:t>
       </w:r>
     </w:p>
-    <w:bookmarkStart w:id="76" w:name="refs"/>
-    <w:bookmarkStart w:id="22" w:name="ref-adsblol"/>
+    <w:bookmarkStart w:id="80" w:name="refs"/>
+    <w:bookmarkStart w:id="26" w:name="ref-adsblol"/>
     <w:p>
       <w:pPr>
         <w:pStyle w:val="Bibliography"/>
@@ -3753,7 +3838,7 @@
       <w:r>
         <w:t xml:space="preserve"> </w:t>
       </w:r>
-      <w:hyperlink r:id="rId21">
+      <w:hyperlink r:id="rId25">
         <w:r>
           <w:rPr>
             <w:rStyle w:val="Hyperlink"/>
@@ -3765,8 +3850,8 @@
         <w:t xml:space="preserve">.</w:t>
       </w:r>
     </w:p>
-    <w:bookmarkEnd w:id="22"/>
-    <w:bookmarkStart w:id="24" w:name="ref-airplaneslive"/>
+    <w:bookmarkEnd w:id="26"/>
+    <w:bookmarkStart w:id="28" w:name="ref-airplaneslive"/>
     <w:p>
       <w:pPr>
         <w:pStyle w:val="Bibliography"/>
@@ -3821,7 +3906,7 @@
       <w:r>
         <w:t xml:space="preserve"> </w:t>
       </w:r>
-      <w:hyperlink r:id="rId23">
+      <w:hyperlink r:id="rId27">
         <w:r>
           <w:rPr>
             <w:rStyle w:val="Hyperlink"/>
@@ -3833,8 +3918,8 @@
         <w:t xml:space="preserve">.</w:t>
       </w:r>
     </w:p>
-    <w:bookmarkEnd w:id="24"/>
-    <w:bookmarkStart w:id="26" w:name="ref-airspaceIntelligencePrescience"/>
+    <w:bookmarkEnd w:id="28"/>
+    <w:bookmarkStart w:id="30" w:name="ref-airspaceIntelligencePrescience"/>
     <w:p>
       <w:pPr>
         <w:pStyle w:val="Bibliography"/>
@@ -3872,7 +3957,7 @@
       <w:r>
         <w:t xml:space="preserve"> </w:t>
       </w:r>
-      <w:hyperlink r:id="rId25">
+      <w:hyperlink r:id="rId29">
         <w:r>
           <w:rPr>
             <w:rStyle w:val="Hyperlink"/>
@@ -3881,8 +3966,8 @@
         </w:r>
       </w:hyperlink>
     </w:p>
-    <w:bookmarkEnd w:id="26"/>
-    <w:bookmarkStart w:id="27" w:name="ref-albassam2025flight"/>
+    <w:bookmarkEnd w:id="30"/>
+    <w:bookmarkStart w:id="31" w:name="ref-albassam2025flight"/>
     <w:p>
       <w:pPr>
         <w:pStyle w:val="Bibliography"/>
@@ -3917,8 +4002,8 @@
         <w:t xml:space="preserve">(12), e0335141.</w:t>
       </w:r>
     </w:p>
-    <w:bookmarkEnd w:id="27"/>
-    <w:bookmarkStart w:id="29" w:name="ref-amadeusFlightOps"/>
+    <w:bookmarkEnd w:id="31"/>
+    <w:bookmarkStart w:id="33" w:name="ref-amadeusFlightOps"/>
     <w:p>
       <w:pPr>
         <w:pStyle w:val="Bibliography"/>
@@ -3942,7 +4027,7 @@
       <w:r>
         <w:t xml:space="preserve"> </w:t>
       </w:r>
-      <w:hyperlink r:id="rId28">
+      <w:hyperlink r:id="rId32">
         <w:r>
           <w:rPr>
             <w:rStyle w:val="Hyperlink"/>
@@ -3951,8 +4036,8 @@
         </w:r>
       </w:hyperlink>
     </w:p>
-    <w:bookmarkEnd w:id="29"/>
-    <w:bookmarkStart w:id="31" w:name="ref-assaia_apronai"/>
+    <w:bookmarkEnd w:id="33"/>
+    <w:bookmarkStart w:id="35" w:name="ref-assaia_apronai"/>
     <w:p>
       <w:pPr>
         <w:pStyle w:val="Bibliography"/>
@@ -3983,7 +4068,7 @@
       <w:r>
         <w:t xml:space="preserve"> </w:t>
       </w:r>
-      <w:hyperlink r:id="rId30">
+      <w:hyperlink r:id="rId34">
         <w:r>
           <w:rPr>
             <w:rStyle w:val="Hyperlink"/>
@@ -3992,8 +4077,8 @@
         </w:r>
       </w:hyperlink>
     </w:p>
-    <w:bookmarkEnd w:id="31"/>
-    <w:bookmarkStart w:id="32" w:name="ref-beatty1999preliminary"/>
+    <w:bookmarkEnd w:id="35"/>
+    <w:bookmarkStart w:id="36" w:name="ref-beatty1999preliminary"/>
     <w:p>
       <w:pPr>
         <w:pStyle w:val="Bibliography"/>
@@ -4028,8 +4113,8 @@
         <w:t xml:space="preserve">(4), 259–270.</w:t>
       </w:r>
     </w:p>
-    <w:bookmarkEnd w:id="32"/>
-    <w:bookmarkStart w:id="33" w:name="ref-belcastro2016flight"/>
+    <w:bookmarkEnd w:id="36"/>
+    <w:bookmarkStart w:id="37" w:name="ref-belcastro2016flight"/>
     <w:p>
       <w:pPr>
         <w:pStyle w:val="Bibliography"/>
@@ -4064,8 +4149,8 @@
         <w:t xml:space="preserve">(1), 1–20.</w:t>
       </w:r>
     </w:p>
-    <w:bookmarkEnd w:id="33"/>
-    <w:bookmarkStart w:id="35" w:name="ref-bts_ontime"/>
+    <w:bookmarkEnd w:id="37"/>
+    <w:bookmarkStart w:id="39" w:name="ref-bts_ontime"/>
     <w:p>
       <w:pPr>
         <w:pStyle w:val="Bibliography"/>
@@ -4089,7 +4174,7 @@
       <w:r>
         <w:t xml:space="preserve"> </w:t>
       </w:r>
-      <w:hyperlink r:id="rId34">
+      <w:hyperlink r:id="rId38">
         <w:r>
           <w:rPr>
             <w:rStyle w:val="Hyperlink"/>
@@ -4101,8 +4186,8 @@
         <w:t xml:space="preserve">.</w:t>
       </w:r>
     </w:p>
-    <w:bookmarkEnd w:id="35"/>
-    <w:bookmarkStart w:id="36" w:name="ref-chen2016xgboost"/>
+    <w:bookmarkEnd w:id="39"/>
+    <w:bookmarkStart w:id="40" w:name="ref-chen2016xgboost"/>
     <w:p>
       <w:pPr>
         <w:pStyle w:val="Bibliography"/>
@@ -4133,8 +4218,8 @@
         <w:t xml:space="preserve">, 785–794.</w:t>
       </w:r>
     </w:p>
-    <w:bookmarkEnd w:id="36"/>
-    <w:bookmarkStart w:id="38" w:name="ref-faa_tfdm_2020"/>
+    <w:bookmarkEnd w:id="40"/>
+    <w:bookmarkStart w:id="42" w:name="ref-faa_tfdm_2020"/>
     <w:p>
       <w:pPr>
         <w:pStyle w:val="Bibliography"/>
@@ -4172,7 +4257,7 @@
       <w:r>
         <w:t xml:space="preserve"> </w:t>
       </w:r>
-      <w:hyperlink r:id="rId37">
+      <w:hyperlink r:id="rId41">
         <w:r>
           <w:rPr>
             <w:rStyle w:val="Hyperlink"/>
@@ -4181,8 +4266,8 @@
         </w:r>
       </w:hyperlink>
     </w:p>
-    <w:bookmarkEnd w:id="38"/>
-    <w:bookmarkStart w:id="40" w:name="ref-faa2024airoadmap"/>
+    <w:bookmarkEnd w:id="42"/>
+    <w:bookmarkStart w:id="44" w:name="ref-faa2024airoadmap"/>
     <w:p>
       <w:pPr>
         <w:pStyle w:val="Bibliography"/>
@@ -4206,7 +4291,7 @@
       <w:r>
         <w:t xml:space="preserve"> </w:t>
       </w:r>
-      <w:hyperlink r:id="rId39">
+      <w:hyperlink r:id="rId43">
         <w:r>
           <w:rPr>
             <w:rStyle w:val="Hyperlink"/>
@@ -4215,8 +4300,8 @@
         </w:r>
       </w:hyperlink>
     </w:p>
-    <w:bookmarkEnd w:id="40"/>
-    <w:bookmarkStart w:id="42" w:name="ref-faa_swim"/>
+    <w:bookmarkEnd w:id="44"/>
+    <w:bookmarkStart w:id="46" w:name="ref-faa_swim"/>
     <w:p>
       <w:pPr>
         <w:pStyle w:val="Bibliography"/>
@@ -4254,7 +4339,7 @@
       <w:r>
         <w:t xml:space="preserve"> </w:t>
       </w:r>
-      <w:hyperlink r:id="rId41">
+      <w:hyperlink r:id="rId45">
         <w:r>
           <w:rPr>
             <w:rStyle w:val="Hyperlink"/>
@@ -4266,8 +4351,8 @@
         <w:t xml:space="preserve">.</w:t>
       </w:r>
     </w:p>
-    <w:bookmarkEnd w:id="42"/>
-    <w:bookmarkStart w:id="44" w:name="ref-faa_nextgen_2024"/>
+    <w:bookmarkEnd w:id="46"/>
+    <w:bookmarkStart w:id="48" w:name="ref-faa_nextgen_2024"/>
     <w:p>
       <w:pPr>
         <w:pStyle w:val="Bibliography"/>
@@ -4291,7 +4376,7 @@
       <w:r>
         <w:t xml:space="preserve"> </w:t>
       </w:r>
-      <w:hyperlink r:id="rId43">
+      <w:hyperlink r:id="rId47">
         <w:r>
           <w:rPr>
             <w:rStyle w:val="Hyperlink"/>
@@ -4300,8 +4385,8 @@
         </w:r>
       </w:hyperlink>
     </w:p>
-    <w:bookmarkEnd w:id="44"/>
-    <w:bookmarkStart w:id="46" w:name="ref-flightawareForesight"/>
+    <w:bookmarkEnd w:id="48"/>
+    <w:bookmarkStart w:id="50" w:name="ref-flightawareForesight"/>
     <w:p>
       <w:pPr>
         <w:pStyle w:val="Bibliography"/>
@@ -4325,7 +4410,7 @@
       <w:r>
         <w:t xml:space="preserve"> </w:t>
       </w:r>
-      <w:hyperlink r:id="rId45">
+      <w:hyperlink r:id="rId49">
         <w:r>
           <w:rPr>
             <w:rStyle w:val="Hyperlink"/>
@@ -4334,8 +4419,8 @@
         </w:r>
       </w:hyperlink>
     </w:p>
-    <w:bookmarkEnd w:id="46"/>
-    <w:bookmarkStart w:id="47" w:name="ref-kafle2016propagation"/>
+    <w:bookmarkEnd w:id="50"/>
+    <w:bookmarkStart w:id="51" w:name="ref-kafle2016propagation"/>
     <w:p>
       <w:pPr>
         <w:pStyle w:val="Bibliography"/>
@@ -4370,8 +4455,8 @@
         <w:t xml:space="preserve">, 520–542.</w:t>
       </w:r>
     </w:p>
-    <w:bookmarkEnd w:id="47"/>
-    <w:bookmarkStart w:id="49" w:name="ref-lauderdale2024nasDigitalTwin"/>
+    <w:bookmarkEnd w:id="51"/>
+    <w:bookmarkStart w:id="53" w:name="ref-lauderdale2024nasDigitalTwin"/>
     <w:p>
       <w:pPr>
         <w:pStyle w:val="Bibliography"/>
@@ -4407,7 +4492,7 @@
       <w:r>
         <w:t xml:space="preserve"> </w:t>
       </w:r>
-      <w:hyperlink r:id="rId48">
+      <w:hyperlink r:id="rId52">
         <w:r>
           <w:rPr>
             <w:rStyle w:val="Hyperlink"/>
@@ -4416,8 +4501,8 @@
         </w:r>
       </w:hyperlink>
     </w:p>
-    <w:bookmarkEnd w:id="49"/>
-    <w:bookmarkStart w:id="50" w:name="ref-lewis2020rag"/>
+    <w:bookmarkEnd w:id="53"/>
+    <w:bookmarkStart w:id="54" w:name="ref-lewis2020rag"/>
     <w:p>
       <w:pPr>
         <w:pStyle w:val="Bibliography"/>
@@ -4451,8 +4536,8 @@
         <w:t xml:space="preserve">, 9459–9474.</w:t>
       </w:r>
     </w:p>
-    <w:bookmarkEnd w:id="50"/>
-    <w:bookmarkStart w:id="52" w:name="ref-lufthansa2025aiocc"/>
+    <w:bookmarkEnd w:id="54"/>
+    <w:bookmarkStart w:id="56" w:name="ref-lufthansa2025aiocc"/>
     <w:p>
       <w:pPr>
         <w:pStyle w:val="Bibliography"/>
@@ -4476,7 +4561,7 @@
       <w:r>
         <w:t xml:space="preserve"> </w:t>
       </w:r>
-      <w:hyperlink r:id="rId51">
+      <w:hyperlink r:id="rId55">
         <w:r>
           <w:rPr>
             <w:rStyle w:val="Hyperlink"/>
@@ -4485,8 +4570,8 @@
         </w:r>
       </w:hyperlink>
     </w:p>
-    <w:bookmarkEnd w:id="52"/>
-    <w:bookmarkStart w:id="53" w:name="ref-lundberg2017shap"/>
+    <w:bookmarkEnd w:id="56"/>
+    <w:bookmarkStart w:id="57" w:name="ref-lundberg2017shap"/>
     <w:p>
       <w:pPr>
         <w:pStyle w:val="Bibliography"/>
@@ -4508,8 +4593,8 @@
         <w:t xml:space="preserve">, 4765–4774.</w:t>
       </w:r>
     </w:p>
-    <w:bookmarkEnd w:id="53"/>
-    <w:bookmarkStart w:id="55" w:name="ref-nasa2021atd2fuser"/>
+    <w:bookmarkEnd w:id="57"/>
+    <w:bookmarkStart w:id="59" w:name="ref-nasa2021atd2fuser"/>
     <w:p>
       <w:pPr>
         <w:pStyle w:val="Bibliography"/>
@@ -4547,7 +4632,7 @@
       <w:r>
         <w:t xml:space="preserve"> </w:t>
       </w:r>
-      <w:hyperlink r:id="rId54">
+      <w:hyperlink r:id="rId58">
         <w:r>
           <w:rPr>
             <w:rStyle w:val="Hyperlink"/>
@@ -4556,8 +4641,8 @@
         </w:r>
       </w:hyperlink>
     </w:p>
-    <w:bookmarkEnd w:id="55"/>
-    <w:bookmarkStart w:id="57" w:name="ref-ncei_isd"/>
+    <w:bookmarkEnd w:id="59"/>
+    <w:bookmarkStart w:id="61" w:name="ref-ncei_isd"/>
     <w:p>
       <w:pPr>
         <w:pStyle w:val="Bibliography"/>
@@ -4595,7 +4680,7 @@
       <w:r>
         <w:t xml:space="preserve"> </w:t>
       </w:r>
-      <w:hyperlink r:id="rId56">
+      <w:hyperlink r:id="rId60">
         <w:r>
           <w:rPr>
             <w:rStyle w:val="Hyperlink"/>
@@ -4607,8 +4692,8 @@
         <w:t xml:space="preserve">.</w:t>
       </w:r>
     </w:p>
-    <w:bookmarkEnd w:id="57"/>
-    <w:bookmarkStart w:id="59" w:name="ref-awc_metar"/>
+    <w:bookmarkEnd w:id="61"/>
+    <w:bookmarkStart w:id="63" w:name="ref-awc_metar"/>
     <w:p>
       <w:pPr>
         <w:pStyle w:val="Bibliography"/>
@@ -4674,7 +4759,7 @@
       <w:r>
         <w:t xml:space="preserve"> </w:t>
       </w:r>
-      <w:hyperlink r:id="rId58">
+      <w:hyperlink r:id="rId62">
         <w:r>
           <w:rPr>
             <w:rStyle w:val="Hyperlink"/>
@@ -4686,8 +4771,8 @@
         <w:t xml:space="preserve">.</w:t>
       </w:r>
     </w:p>
-    <w:bookmarkEnd w:id="59"/>
-    <w:bookmarkStart w:id="61" w:name="ref-openflights"/>
+    <w:bookmarkEnd w:id="63"/>
+    <w:bookmarkStart w:id="65" w:name="ref-openflights"/>
     <w:p>
       <w:pPr>
         <w:pStyle w:val="Bibliography"/>
@@ -4725,7 +4810,7 @@
       <w:r>
         <w:t xml:space="preserve"> </w:t>
       </w:r>
-      <w:hyperlink r:id="rId60">
+      <w:hyperlink r:id="rId64">
         <w:r>
           <w:rPr>
             <w:rStyle w:val="Hyperlink"/>
@@ -4737,8 +4822,8 @@
         <w:t xml:space="preserve">.</w:t>
       </w:r>
     </w:p>
-    <w:bookmarkEnd w:id="61"/>
-    <w:bookmarkStart w:id="63" w:name="ref-ourairports"/>
+    <w:bookmarkEnd w:id="65"/>
+    <w:bookmarkStart w:id="67" w:name="ref-ourairports"/>
     <w:p>
       <w:pPr>
         <w:pStyle w:val="Bibliography"/>
@@ -4776,7 +4861,7 @@
       <w:r>
         <w:t xml:space="preserve"> </w:t>
       </w:r>
-      <w:hyperlink r:id="rId62">
+      <w:hyperlink r:id="rId66">
         <w:r>
           <w:rPr>
             <w:rStyle w:val="Hyperlink"/>
@@ -4788,8 +4873,8 @@
         <w:t xml:space="preserve">.</w:t>
       </w:r>
     </w:p>
-    <w:bookmarkEnd w:id="63"/>
-    <w:bookmarkStart w:id="65" w:name="ref-pepper2026probabilisticTwin"/>
+    <w:bookmarkEnd w:id="67"/>
+    <w:bookmarkStart w:id="69" w:name="ref-pepper2026probabilisticTwin"/>
     <w:p>
       <w:pPr>
         <w:pStyle w:val="Bibliography"/>
@@ -4837,7 +4922,7 @@
       <w:r>
         <w:t xml:space="preserve"> </w:t>
       </w:r>
-      <w:hyperlink r:id="rId64">
+      <w:hyperlink r:id="rId68">
         <w:r>
           <w:rPr>
             <w:rStyle w:val="Hyperlink"/>
@@ -4846,8 +4931,8 @@
         </w:r>
       </w:hyperlink>
     </w:p>
-    <w:bookmarkEnd w:id="65"/>
-    <w:bookmarkStart w:id="67" w:name="ref-sabre_disruption_management"/>
+    <w:bookmarkEnd w:id="69"/>
+    <w:bookmarkStart w:id="71" w:name="ref-sabre_disruption_management"/>
     <w:p>
       <w:pPr>
         <w:pStyle w:val="Bibliography"/>
@@ -4871,7 +4956,7 @@
       <w:r>
         <w:t xml:space="preserve"> </w:t>
       </w:r>
-      <w:hyperlink r:id="rId66">
+      <w:hyperlink r:id="rId70">
         <w:r>
           <w:rPr>
             <w:rStyle w:val="Hyperlink"/>
@@ -4880,8 +4965,8 @@
         </w:r>
       </w:hyperlink>
     </w:p>
-    <w:bookmarkEnd w:id="67"/>
-    <w:bookmarkStart w:id="68" w:name="ref-schaefer2014opensky"/>
+    <w:bookmarkEnd w:id="71"/>
+    <w:bookmarkStart w:id="72" w:name="ref-schaefer2014opensky"/>
     <w:p>
       <w:pPr>
         <w:pStyle w:val="Bibliography"/>
@@ -4924,8 +5009,8 @@
         <w:t xml:space="preserve">, 83–94.</w:t>
       </w:r>
     </w:p>
-    <w:bookmarkEnd w:id="68"/>
-    <w:bookmarkStart w:id="70" w:name="ref-shelke2026flightsense"/>
+    <w:bookmarkEnd w:id="72"/>
+    <w:bookmarkStart w:id="74" w:name="ref-shelke2026flightsense"/>
     <w:p>
       <w:pPr>
         <w:pStyle w:val="Bibliography"/>
@@ -4998,7 +5083,7 @@
       <w:r>
         <w:t xml:space="preserve"> </w:t>
       </w:r>
-      <w:hyperlink r:id="rId69">
+      <w:hyperlink r:id="rId73">
         <w:r>
           <w:rPr>
             <w:rStyle w:val="Hyperlink"/>
@@ -5007,8 +5092,8 @@
         </w:r>
       </w:hyperlink>
     </w:p>
-    <w:bookmarkEnd w:id="70"/>
-    <w:bookmarkStart w:id="72" w:name="ref-sternberg2017review"/>
+    <w:bookmarkEnd w:id="74"/>
+    <w:bookmarkStart w:id="76" w:name="ref-sternberg2017review"/>
     <w:p>
       <w:pPr>
         <w:pStyle w:val="Bibliography"/>
@@ -5032,7 +5117,7 @@
       <w:r>
         <w:t xml:space="preserve"> </w:t>
       </w:r>
-      <w:hyperlink r:id="rId71">
+      <w:hyperlink r:id="rId75">
         <w:r>
           <w:rPr>
             <w:rStyle w:val="Hyperlink"/>
@@ -5041,8 +5126,8 @@
         </w:r>
       </w:hyperlink>
     </w:p>
-    <w:bookmarkEnd w:id="72"/>
-    <w:bookmarkStart w:id="74" w:name="ref-wilson2026flightdelay"/>
+    <w:bookmarkEnd w:id="76"/>
+    <w:bookmarkStart w:id="78" w:name="ref-wilson2026flightdelay"/>
     <w:p>
       <w:pPr>
         <w:pStyle w:val="Bibliography"/>
@@ -5066,7 +5151,7 @@
       <w:r>
         <w:t xml:space="preserve"> </w:t>
       </w:r>
-      <w:hyperlink r:id="rId73">
+      <w:hyperlink r:id="rId77">
         <w:r>
           <w:rPr>
             <w:rStyle w:val="Hyperlink"/>
@@ -5075,8 +5160,8 @@
         </w:r>
       </w:hyperlink>
     </w:p>
-    <w:bookmarkEnd w:id="74"/>
-    <w:bookmarkStart w:id="75" w:name="ref-wong2012survival"/>
+    <w:bookmarkEnd w:id="78"/>
+    <w:bookmarkStart w:id="79" w:name="ref-wong2012survival"/>
     <w:p>
       <w:pPr>
         <w:pStyle w:val="Bibliography"/>
@@ -5111,9 +5196,9 @@
         <w:t xml:space="preserve">, 5–11.</w:t>
       </w:r>
     </w:p>
-    <w:bookmarkEnd w:id="75"/>
-    <w:bookmarkEnd w:id="76"/>
-    <w:bookmarkEnd w:id="77"/>
+    <w:bookmarkEnd w:id="79"/>
+    <w:bookmarkEnd w:id="80"/>
+    <w:bookmarkEnd w:id="81"/>
     <w:sectPr>
       <w:footnotePr>
         <w:numRestart w:val="eachSect"/>

</xml_diff>